<commit_message>
Update version and updatedate in templates
</commit_message>
<xml_diff>
--- a/GenBOE/GenBOE.Web/Templates/Export/IBOE_1.docx
+++ b/GenBOE/GenBOE.Web/Templates/Export/IBOE_1.docx
@@ -1,6 +1,6 @@
 
 <file path=word/document.xml><?xml version="1.0" encoding="utf-8"?>
-<w:document xmlns:wpc="http://schemas.microsoft.com/office/word/2010/wordprocessingCanvas" xmlns:cx="http://schemas.microsoft.com/office/drawing/2014/chartex" xmlns:cx1="http://schemas.microsoft.com/office/drawing/2015/9/8/chartex" xmlns:cx2="http://schemas.microsoft.com/office/drawing/2015/10/21/chartex" xmlns:cx3="http://schemas.microsoft.com/office/drawing/2016/5/9/chartex" xmlns:cx4="http://schemas.microsoft.com/office/drawing/2016/5/10/chartex" xmlns:cx5="http://schemas.microsoft.com/office/drawing/2016/5/11/chartex" xmlns:cx6="http://schemas.microsoft.com/office/drawing/2016/5/12/chartex" xmlns:cx7="http://schemas.microsoft.com/office/drawing/2016/5/13/chartex" xmlns:cx8="http://schemas.microsoft.com/office/drawing/2016/5/14/chartex" xmlns:mc="http://schemas.openxmlformats.org/markup-compatibility/2006" xmlns:aink="http://schemas.microsoft.com/office/drawing/2016/ink" xmlns:am3d="http://schemas.microsoft.com/office/drawing/2017/model3d" xmlns:o="urn:schemas-microsoft-com:office:office" xmlns:r="http://schemas.openxmlformats.org/officeDocument/2006/relationships" xmlns:m="http://schemas.openxmlformats.org/officeDocument/2006/math" xmlns:v="urn:schemas-microsoft-com:vml" xmlns:wp14="http://schemas.microsoft.com/office/word/2010/wordprocessingDrawing" xmlns:wp="http://schemas.openxmlformats.org/drawingml/2006/wordprocessingDrawing" xmlns:w10="urn:schemas-microsoft-com:office:word" xmlns:w="http://schemas.openxmlformats.org/wordprocessingml/2006/main" xmlns:w14="http://schemas.microsoft.com/office/word/2010/wordml" xmlns:w15="http://schemas.microsoft.com/office/word/2012/wordml" xmlns:w16cid="http://schemas.microsoft.com/office/word/2016/wordml/cid" xmlns:w16se="http://schemas.microsoft.com/office/word/2015/wordml/symex" xmlns:wpg="http://schemas.microsoft.com/office/word/2010/wordprocessingGroup" xmlns:wpi="http://schemas.microsoft.com/office/word/2010/wordprocessingInk" xmlns:wne="http://schemas.microsoft.com/office/word/2006/wordml" xmlns:wps="http://schemas.microsoft.com/office/word/2010/wordprocessingShape" mc:Ignorable="w14 w15 w16se w16cid wp14">
+<w:document xmlns:wpc="http://schemas.microsoft.com/office/word/2010/wordprocessingCanvas" xmlns:cx="http://schemas.microsoft.com/office/drawing/2014/chartex" xmlns:cx1="http://schemas.microsoft.com/office/drawing/2015/9/8/chartex" xmlns:cx2="http://schemas.microsoft.com/office/drawing/2015/10/21/chartex" xmlns:cx3="http://schemas.microsoft.com/office/drawing/2016/5/9/chartex" xmlns:cx4="http://schemas.microsoft.com/office/drawing/2016/5/10/chartex" xmlns:cx5="http://schemas.microsoft.com/office/drawing/2016/5/11/chartex" xmlns:cx6="http://schemas.microsoft.com/office/drawing/2016/5/12/chartex" xmlns:cx7="http://schemas.microsoft.com/office/drawing/2016/5/13/chartex" xmlns:cx8="http://schemas.microsoft.com/office/drawing/2016/5/14/chartex" xmlns:mc="http://schemas.openxmlformats.org/markup-compatibility/2006" xmlns:aink="http://schemas.microsoft.com/office/drawing/2016/ink" xmlns:am3d="http://schemas.microsoft.com/office/drawing/2017/model3d" xmlns:o="urn:schemas-microsoft-com:office:office" xmlns:oel="http://schemas.microsoft.com/office/2019/extlst" xmlns:r="http://schemas.openxmlformats.org/officeDocument/2006/relationships" xmlns:m="http://schemas.openxmlformats.org/officeDocument/2006/math" xmlns:v="urn:schemas-microsoft-com:vml" xmlns:wp14="http://schemas.microsoft.com/office/word/2010/wordprocessingDrawing" xmlns:wp="http://schemas.openxmlformats.org/drawingml/2006/wordprocessingDrawing" xmlns:w10="urn:schemas-microsoft-com:office:word" xmlns:w="http://schemas.openxmlformats.org/wordprocessingml/2006/main" xmlns:w14="http://schemas.microsoft.com/office/word/2010/wordml" xmlns:w15="http://schemas.microsoft.com/office/word/2012/wordml" xmlns:w16cex="http://schemas.microsoft.com/office/word/2018/wordml/cex" xmlns:w16cid="http://schemas.microsoft.com/office/word/2016/wordml/cid" xmlns:w16="http://schemas.microsoft.com/office/word/2018/wordml" xmlns:w16sdtdh="http://schemas.microsoft.com/office/word/2020/wordml/sdtdatahash" xmlns:w16se="http://schemas.microsoft.com/office/word/2015/wordml/symex" xmlns:wpg="http://schemas.microsoft.com/office/word/2010/wordprocessingGroup" xmlns:wpi="http://schemas.microsoft.com/office/word/2010/wordprocessingInk" xmlns:wne="http://schemas.microsoft.com/office/word/2006/wordml" xmlns:wps="http://schemas.microsoft.com/office/word/2010/wordprocessingShape" mc:Ignorable="w14 w15 w16se w16cid w16 w16cex w16sdtdh wp14">
   <w:body>
     <w:p>
       <w:pPr>
@@ -189,7 +189,6 @@
           <w:showingPlcHdr/>
           <w:text/>
         </w:sdtPr>
-        <w:sdtEndPr/>
         <w:sdtContent>
           <w:r>
             <w:rPr>
@@ -228,7 +227,6 @@
           <w:showingPlcHdr/>
           <w:text/>
         </w:sdtPr>
-        <w:sdtEndPr/>
         <w:sdtContent>
           <w:r>
             <w:rPr>
@@ -420,7 +418,6 @@
                 <w:showingPlcHdr/>
                 <w:text/>
               </w:sdtPr>
-              <w:sdtEndPr/>
               <w:sdtContent>
                 <w:r>
                   <w:rPr>
@@ -469,7 +466,6 @@
                 <w:showingPlcHdr/>
                 <w:text/>
               </w:sdtPr>
-              <w:sdtEndPr/>
               <w:sdtContent>
                 <w:r>
                   <w:rPr>
@@ -510,7 +506,6 @@
                 <w:showingPlcHdr/>
                 <w:text/>
               </w:sdtPr>
-              <w:sdtEndPr/>
               <w:sdtContent>
                 <w:r>
                   <w:rPr>
@@ -785,7 +780,6 @@
                 <w:showingPlcHdr/>
                 <w:text/>
               </w:sdtPr>
-              <w:sdtEndPr/>
               <w:sdtContent>
                 <w:r>
                   <w:rPr>
@@ -809,7 +803,6 @@
                 <w:showingPlcHdr/>
                 <w:text/>
               </w:sdtPr>
-              <w:sdtEndPr/>
               <w:sdtContent/>
             </w:sdt>
           </w:p>
@@ -845,7 +838,6 @@
                 <w:showingPlcHdr/>
                 <w:text/>
               </w:sdtPr>
-              <w:sdtEndPr/>
               <w:sdtContent>
                 <w:r>
                   <w:rPr>
@@ -889,7 +881,6 @@
                 <w:showingPlcHdr/>
                 <w:text/>
               </w:sdtPr>
-              <w:sdtEndPr/>
               <w:sdtContent>
                 <w:r>
                   <w:rPr>
@@ -933,7 +924,6 @@
                 <w:showingPlcHdr/>
                 <w:text/>
               </w:sdtPr>
-              <w:sdtEndPr/>
               <w:sdtContent>
                 <w:r>
                   <w:rPr>
@@ -976,7 +966,6 @@
                 <w:showingPlcHdr/>
                 <w:text/>
               </w:sdtPr>
-              <w:sdtEndPr/>
               <w:sdtContent>
                 <w:r>
                   <w:rPr>
@@ -1025,7 +1014,6 @@
                 <w:showingPlcHdr/>
                 <w:text/>
               </w:sdtPr>
-              <w:sdtEndPr/>
               <w:sdtContent/>
             </w:sdt>
           </w:p>
@@ -1096,7 +1084,6 @@
                 <w:showingPlcHdr/>
                 <w:text/>
               </w:sdtPr>
-              <w:sdtEndPr/>
               <w:sdtContent>
                 <w:r>
                   <w:rPr>
@@ -1149,7 +1136,6 @@
                 <w:showingPlcHdr/>
                 <w:text/>
               </w:sdtPr>
-              <w:sdtEndPr/>
               <w:sdtContent>
                 <w:r>
                   <w:rPr>
@@ -1220,7 +1206,6 @@
                 <w:showingPlcHdr/>
                 <w:text/>
               </w:sdtPr>
-              <w:sdtEndPr/>
               <w:sdtContent/>
             </w:sdt>
           </w:p>
@@ -1291,7 +1276,6 @@
                 <w:showingPlcHdr/>
                 <w:text/>
               </w:sdtPr>
-              <w:sdtEndPr/>
               <w:sdtContent>
                 <w:r>
                   <w:rPr>
@@ -1335,7 +1319,6 @@
                 <w:showingPlcHdr/>
                 <w:text/>
               </w:sdtPr>
-              <w:sdtEndPr/>
               <w:sdtContent>
                 <w:r>
                   <w:rPr>
@@ -1440,7 +1423,6 @@
                 <w:showingPlcHdr/>
                 <w:text/>
               </w:sdtPr>
-              <w:sdtEndPr/>
               <w:sdtContent>
                 <w:r>
                   <w:rPr>
@@ -1538,7 +1520,6 @@
                 <w:showingPlcHdr/>
                 <w:text/>
               </w:sdtPr>
-              <w:sdtEndPr/>
               <w:sdtContent>
                 <w:r>
                   <w:rPr>
@@ -1706,7 +1687,6 @@
                 <w:showingPlcHdr/>
                 <w:text/>
               </w:sdtPr>
-              <w:sdtEndPr/>
               <w:sdtContent>
                 <w:r>
                   <w:rPr>
@@ -1740,7 +1720,6 @@
                 <w:showingPlcHdr/>
                 <w:text/>
               </w:sdtPr>
-              <w:sdtEndPr/>
               <w:sdtContent>
                 <w:r>
                   <w:rPr>
@@ -1774,7 +1753,6 @@
                 <w:showingPlcHdr/>
                 <w:text/>
               </w:sdtPr>
-              <w:sdtEndPr/>
               <w:sdtContent>
                 <w:r>
                   <w:rPr>
@@ -1807,7 +1785,6 @@
                 <w:showingPlcHdr/>
                 <w:text/>
               </w:sdtPr>
-              <w:sdtEndPr/>
               <w:sdtContent>
                 <w:r>
                   <w:rPr>
@@ -1823,10 +1800,7 @@
         </w:tc>
       </w:tr>
     </w:tbl>
-    <w:p>
-      <w:bookmarkStart w:id="0" w:name="_GoBack"/>
-      <w:bookmarkEnd w:id="0"/>
-    </w:p>
+    <w:p/>
     <w:sectPr>
       <w:footerReference w:type="default" r:id="rId12"/>
       <w:pgSz w:w="12240" w:h="15840" w:code="1"/>
@@ -1840,7 +1814,7 @@
 </file>
 
 <file path=word/endnotes.xml><?xml version="1.0" encoding="utf-8"?>
-<w:endnotes xmlns:wpc="http://schemas.microsoft.com/office/word/2010/wordprocessingCanvas" xmlns:cx="http://schemas.microsoft.com/office/drawing/2014/chartex" xmlns:cx1="http://schemas.microsoft.com/office/drawing/2015/9/8/chartex" xmlns:cx2="http://schemas.microsoft.com/office/drawing/2015/10/21/chartex" xmlns:cx3="http://schemas.microsoft.com/office/drawing/2016/5/9/chartex" xmlns:cx4="http://schemas.microsoft.com/office/drawing/2016/5/10/chartex" xmlns:cx5="http://schemas.microsoft.com/office/drawing/2016/5/11/chartex" xmlns:cx6="http://schemas.microsoft.com/office/drawing/2016/5/12/chartex" xmlns:cx7="http://schemas.microsoft.com/office/drawing/2016/5/13/chartex" xmlns:cx8="http://schemas.microsoft.com/office/drawing/2016/5/14/chartex" xmlns:mc="http://schemas.openxmlformats.org/markup-compatibility/2006" xmlns:aink="http://schemas.microsoft.com/office/drawing/2016/ink" xmlns:am3d="http://schemas.microsoft.com/office/drawing/2017/model3d" xmlns:o="urn:schemas-microsoft-com:office:office" xmlns:r="http://schemas.openxmlformats.org/officeDocument/2006/relationships" xmlns:m="http://schemas.openxmlformats.org/officeDocument/2006/math" xmlns:v="urn:schemas-microsoft-com:vml" xmlns:wp14="http://schemas.microsoft.com/office/word/2010/wordprocessingDrawing" xmlns:wp="http://schemas.openxmlformats.org/drawingml/2006/wordprocessingDrawing" xmlns:w10="urn:schemas-microsoft-com:office:word" xmlns:w="http://schemas.openxmlformats.org/wordprocessingml/2006/main" xmlns:w14="http://schemas.microsoft.com/office/word/2010/wordml" xmlns:w15="http://schemas.microsoft.com/office/word/2012/wordml" xmlns:w16cid="http://schemas.microsoft.com/office/word/2016/wordml/cid" xmlns:w16se="http://schemas.microsoft.com/office/word/2015/wordml/symex" xmlns:wpg="http://schemas.microsoft.com/office/word/2010/wordprocessingGroup" xmlns:wpi="http://schemas.microsoft.com/office/word/2010/wordprocessingInk" xmlns:wne="http://schemas.microsoft.com/office/word/2006/wordml" xmlns:wps="http://schemas.microsoft.com/office/word/2010/wordprocessingShape" mc:Ignorable="w14 w15 w16se w16cid wp14">
+<w:endnotes xmlns:wpc="http://schemas.microsoft.com/office/word/2010/wordprocessingCanvas" xmlns:cx="http://schemas.microsoft.com/office/drawing/2014/chartex" xmlns:cx1="http://schemas.microsoft.com/office/drawing/2015/9/8/chartex" xmlns:cx2="http://schemas.microsoft.com/office/drawing/2015/10/21/chartex" xmlns:cx3="http://schemas.microsoft.com/office/drawing/2016/5/9/chartex" xmlns:cx4="http://schemas.microsoft.com/office/drawing/2016/5/10/chartex" xmlns:cx5="http://schemas.microsoft.com/office/drawing/2016/5/11/chartex" xmlns:cx6="http://schemas.microsoft.com/office/drawing/2016/5/12/chartex" xmlns:cx7="http://schemas.microsoft.com/office/drawing/2016/5/13/chartex" xmlns:cx8="http://schemas.microsoft.com/office/drawing/2016/5/14/chartex" xmlns:mc="http://schemas.openxmlformats.org/markup-compatibility/2006" xmlns:aink="http://schemas.microsoft.com/office/drawing/2016/ink" xmlns:am3d="http://schemas.microsoft.com/office/drawing/2017/model3d" xmlns:o="urn:schemas-microsoft-com:office:office" xmlns:oel="http://schemas.microsoft.com/office/2019/extlst" xmlns:r="http://schemas.openxmlformats.org/officeDocument/2006/relationships" xmlns:m="http://schemas.openxmlformats.org/officeDocument/2006/math" xmlns:v="urn:schemas-microsoft-com:vml" xmlns:wp14="http://schemas.microsoft.com/office/word/2010/wordprocessingDrawing" xmlns:wp="http://schemas.openxmlformats.org/drawingml/2006/wordprocessingDrawing" xmlns:w10="urn:schemas-microsoft-com:office:word" xmlns:w="http://schemas.openxmlformats.org/wordprocessingml/2006/main" xmlns:w14="http://schemas.microsoft.com/office/word/2010/wordml" xmlns:w15="http://schemas.microsoft.com/office/word/2012/wordml" xmlns:w16cex="http://schemas.microsoft.com/office/word/2018/wordml/cex" xmlns:w16cid="http://schemas.microsoft.com/office/word/2016/wordml/cid" xmlns:w16="http://schemas.microsoft.com/office/word/2018/wordml" xmlns:w16sdtdh="http://schemas.microsoft.com/office/word/2020/wordml/sdtdatahash" xmlns:w16se="http://schemas.microsoft.com/office/word/2015/wordml/symex" xmlns:wpg="http://schemas.microsoft.com/office/word/2010/wordprocessingGroup" xmlns:wpi="http://schemas.microsoft.com/office/word/2010/wordprocessingInk" xmlns:wne="http://schemas.microsoft.com/office/word/2006/wordml" xmlns:wps="http://schemas.microsoft.com/office/word/2010/wordprocessingShape" mc:Ignorable="w14 w15 w16se w16cid w16 w16cex w16sdtdh wp14">
   <w:endnote w:type="separator" w:id="-1">
     <w:p>
       <w:r>
@@ -1859,7 +1833,7 @@
 </file>
 
 <file path=word/footer1.xml><?xml version="1.0" encoding="utf-8"?>
-<w:ftr xmlns:wpc="http://schemas.microsoft.com/office/word/2010/wordprocessingCanvas" xmlns:cx="http://schemas.microsoft.com/office/drawing/2014/chartex" xmlns:cx1="http://schemas.microsoft.com/office/drawing/2015/9/8/chartex" xmlns:cx2="http://schemas.microsoft.com/office/drawing/2015/10/21/chartex" xmlns:cx3="http://schemas.microsoft.com/office/drawing/2016/5/9/chartex" xmlns:cx4="http://schemas.microsoft.com/office/drawing/2016/5/10/chartex" xmlns:cx5="http://schemas.microsoft.com/office/drawing/2016/5/11/chartex" xmlns:cx6="http://schemas.microsoft.com/office/drawing/2016/5/12/chartex" xmlns:cx7="http://schemas.microsoft.com/office/drawing/2016/5/13/chartex" xmlns:cx8="http://schemas.microsoft.com/office/drawing/2016/5/14/chartex" xmlns:mc="http://schemas.openxmlformats.org/markup-compatibility/2006" xmlns:aink="http://schemas.microsoft.com/office/drawing/2016/ink" xmlns:am3d="http://schemas.microsoft.com/office/drawing/2017/model3d" xmlns:o="urn:schemas-microsoft-com:office:office" xmlns:r="http://schemas.openxmlformats.org/officeDocument/2006/relationships" xmlns:m="http://schemas.openxmlformats.org/officeDocument/2006/math" xmlns:v="urn:schemas-microsoft-com:vml" xmlns:wp14="http://schemas.microsoft.com/office/word/2010/wordprocessingDrawing" xmlns:wp="http://schemas.openxmlformats.org/drawingml/2006/wordprocessingDrawing" xmlns:w10="urn:schemas-microsoft-com:office:word" xmlns:w="http://schemas.openxmlformats.org/wordprocessingml/2006/main" xmlns:w14="http://schemas.microsoft.com/office/word/2010/wordml" xmlns:w15="http://schemas.microsoft.com/office/word/2012/wordml" xmlns:w16cid="http://schemas.microsoft.com/office/word/2016/wordml/cid" xmlns:w16se="http://schemas.microsoft.com/office/word/2015/wordml/symex" xmlns:wpg="http://schemas.microsoft.com/office/word/2010/wordprocessingGroup" xmlns:wpi="http://schemas.microsoft.com/office/word/2010/wordprocessingInk" xmlns:wne="http://schemas.microsoft.com/office/word/2006/wordml" xmlns:wps="http://schemas.microsoft.com/office/word/2010/wordprocessingShape" mc:Ignorable="w14 w15 w16se w16cid wp14">
+<w:ftr xmlns:wpc="http://schemas.microsoft.com/office/word/2010/wordprocessingCanvas" xmlns:cx="http://schemas.microsoft.com/office/drawing/2014/chartex" xmlns:cx1="http://schemas.microsoft.com/office/drawing/2015/9/8/chartex" xmlns:cx2="http://schemas.microsoft.com/office/drawing/2015/10/21/chartex" xmlns:cx3="http://schemas.microsoft.com/office/drawing/2016/5/9/chartex" xmlns:cx4="http://schemas.microsoft.com/office/drawing/2016/5/10/chartex" xmlns:cx5="http://schemas.microsoft.com/office/drawing/2016/5/11/chartex" xmlns:cx6="http://schemas.microsoft.com/office/drawing/2016/5/12/chartex" xmlns:cx7="http://schemas.microsoft.com/office/drawing/2016/5/13/chartex" xmlns:cx8="http://schemas.microsoft.com/office/drawing/2016/5/14/chartex" xmlns:mc="http://schemas.openxmlformats.org/markup-compatibility/2006" xmlns:aink="http://schemas.microsoft.com/office/drawing/2016/ink" xmlns:am3d="http://schemas.microsoft.com/office/drawing/2017/model3d" xmlns:o="urn:schemas-microsoft-com:office:office" xmlns:oel="http://schemas.microsoft.com/office/2019/extlst" xmlns:r="http://schemas.openxmlformats.org/officeDocument/2006/relationships" xmlns:m="http://schemas.openxmlformats.org/officeDocument/2006/math" xmlns:v="urn:schemas-microsoft-com:vml" xmlns:wp14="http://schemas.microsoft.com/office/word/2010/wordprocessingDrawing" xmlns:wp="http://schemas.openxmlformats.org/drawingml/2006/wordprocessingDrawing" xmlns:w10="urn:schemas-microsoft-com:office:word" xmlns:w="http://schemas.openxmlformats.org/wordprocessingml/2006/main" xmlns:w14="http://schemas.microsoft.com/office/word/2010/wordml" xmlns:w15="http://schemas.microsoft.com/office/word/2012/wordml" xmlns:w16cex="http://schemas.microsoft.com/office/word/2018/wordml/cex" xmlns:w16cid="http://schemas.microsoft.com/office/word/2016/wordml/cid" xmlns:w16="http://schemas.microsoft.com/office/word/2018/wordml" xmlns:w16sdtdh="http://schemas.microsoft.com/office/word/2020/wordml/sdtdatahash" xmlns:w16se="http://schemas.microsoft.com/office/word/2015/wordml/symex" xmlns:wpg="http://schemas.microsoft.com/office/word/2010/wordprocessingGroup" xmlns:wpi="http://schemas.microsoft.com/office/word/2010/wordprocessingInk" xmlns:wne="http://schemas.microsoft.com/office/word/2006/wordml" xmlns:wps="http://schemas.microsoft.com/office/word/2010/wordprocessingShape" mc:Ignorable="w14 w15 w16se w16cid w16 w16cex w16sdtdh wp14">
   <w:p>
     <w:pPr>
       <w:pStyle w:val="FooterTop"/>
@@ -1872,23 +1846,26 @@
       <w:t xml:space="preserve">Revision </w:t>
     </w:r>
     <w:r>
-      <w:t>6</w:t>
+      <w:t>7</w:t>
     </w:r>
     <w:r>
       <w:tab/>
       <w:t xml:space="preserve">Effective:  </w:t>
     </w:r>
     <w:r>
-      <w:t>09</w:t>
+      <w:t>0</w:t>
+    </w:r>
+    <w:r>
+      <w:t>6</w:t>
     </w:r>
     <w:r>
       <w:t>-</w:t>
     </w:r>
     <w:r>
-      <w:t>1</w:t>
+      <w:t>0</w:t>
     </w:r>
     <w:r>
-      <w:t>0</w:t>
+      <w:t>1</w:t>
     </w:r>
     <w:r>
       <w:t>-</w:t>
@@ -1897,10 +1874,7 @@
       <w:t>20</w:t>
     </w:r>
     <w:r>
-      <w:t>1</w:t>
-    </w:r>
-    <w:r>
-      <w:t>9</w:t>
+      <w:t>23</w:t>
     </w:r>
   </w:p>
   <w:p>
@@ -2012,7 +1986,6 @@
         <w:showingPlcHdr/>
         <w:text/>
       </w:sdtPr>
-      <w:sdtEndPr/>
       <w:sdtContent>
         <w:r>
           <w:rPr>
@@ -2045,7 +2018,7 @@
 </file>
 
 <file path=word/footnotes.xml><?xml version="1.0" encoding="utf-8"?>
-<w:footnotes xmlns:wpc="http://schemas.microsoft.com/office/word/2010/wordprocessingCanvas" xmlns:cx="http://schemas.microsoft.com/office/drawing/2014/chartex" xmlns:cx1="http://schemas.microsoft.com/office/drawing/2015/9/8/chartex" xmlns:cx2="http://schemas.microsoft.com/office/drawing/2015/10/21/chartex" xmlns:cx3="http://schemas.microsoft.com/office/drawing/2016/5/9/chartex" xmlns:cx4="http://schemas.microsoft.com/office/drawing/2016/5/10/chartex" xmlns:cx5="http://schemas.microsoft.com/office/drawing/2016/5/11/chartex" xmlns:cx6="http://schemas.microsoft.com/office/drawing/2016/5/12/chartex" xmlns:cx7="http://schemas.microsoft.com/office/drawing/2016/5/13/chartex" xmlns:cx8="http://schemas.microsoft.com/office/drawing/2016/5/14/chartex" xmlns:mc="http://schemas.openxmlformats.org/markup-compatibility/2006" xmlns:aink="http://schemas.microsoft.com/office/drawing/2016/ink" xmlns:am3d="http://schemas.microsoft.com/office/drawing/2017/model3d" xmlns:o="urn:schemas-microsoft-com:office:office" xmlns:r="http://schemas.openxmlformats.org/officeDocument/2006/relationships" xmlns:m="http://schemas.openxmlformats.org/officeDocument/2006/math" xmlns:v="urn:schemas-microsoft-com:vml" xmlns:wp14="http://schemas.microsoft.com/office/word/2010/wordprocessingDrawing" xmlns:wp="http://schemas.openxmlformats.org/drawingml/2006/wordprocessingDrawing" xmlns:w10="urn:schemas-microsoft-com:office:word" xmlns:w="http://schemas.openxmlformats.org/wordprocessingml/2006/main" xmlns:w14="http://schemas.microsoft.com/office/word/2010/wordml" xmlns:w15="http://schemas.microsoft.com/office/word/2012/wordml" xmlns:w16cid="http://schemas.microsoft.com/office/word/2016/wordml/cid" xmlns:w16se="http://schemas.microsoft.com/office/word/2015/wordml/symex" xmlns:wpg="http://schemas.microsoft.com/office/word/2010/wordprocessingGroup" xmlns:wpi="http://schemas.microsoft.com/office/word/2010/wordprocessingInk" xmlns:wne="http://schemas.microsoft.com/office/word/2006/wordml" xmlns:wps="http://schemas.microsoft.com/office/word/2010/wordprocessingShape" mc:Ignorable="w14 w15 w16se w16cid wp14">
+<w:footnotes xmlns:wpc="http://schemas.microsoft.com/office/word/2010/wordprocessingCanvas" xmlns:cx="http://schemas.microsoft.com/office/drawing/2014/chartex" xmlns:cx1="http://schemas.microsoft.com/office/drawing/2015/9/8/chartex" xmlns:cx2="http://schemas.microsoft.com/office/drawing/2015/10/21/chartex" xmlns:cx3="http://schemas.microsoft.com/office/drawing/2016/5/9/chartex" xmlns:cx4="http://schemas.microsoft.com/office/drawing/2016/5/10/chartex" xmlns:cx5="http://schemas.microsoft.com/office/drawing/2016/5/11/chartex" xmlns:cx6="http://schemas.microsoft.com/office/drawing/2016/5/12/chartex" xmlns:cx7="http://schemas.microsoft.com/office/drawing/2016/5/13/chartex" xmlns:cx8="http://schemas.microsoft.com/office/drawing/2016/5/14/chartex" xmlns:mc="http://schemas.openxmlformats.org/markup-compatibility/2006" xmlns:aink="http://schemas.microsoft.com/office/drawing/2016/ink" xmlns:am3d="http://schemas.microsoft.com/office/drawing/2017/model3d" xmlns:o="urn:schemas-microsoft-com:office:office" xmlns:oel="http://schemas.microsoft.com/office/2019/extlst" xmlns:r="http://schemas.openxmlformats.org/officeDocument/2006/relationships" xmlns:m="http://schemas.openxmlformats.org/officeDocument/2006/math" xmlns:v="urn:schemas-microsoft-com:vml" xmlns:wp14="http://schemas.microsoft.com/office/word/2010/wordprocessingDrawing" xmlns:wp="http://schemas.openxmlformats.org/drawingml/2006/wordprocessingDrawing" xmlns:w10="urn:schemas-microsoft-com:office:word" xmlns:w="http://schemas.openxmlformats.org/wordprocessingml/2006/main" xmlns:w14="http://schemas.microsoft.com/office/word/2010/wordml" xmlns:w15="http://schemas.microsoft.com/office/word/2012/wordml" xmlns:w16cex="http://schemas.microsoft.com/office/word/2018/wordml/cex" xmlns:w16cid="http://schemas.microsoft.com/office/word/2016/wordml/cid" xmlns:w16="http://schemas.microsoft.com/office/word/2018/wordml" xmlns:w16sdtdh="http://schemas.microsoft.com/office/word/2020/wordml/sdtdatahash" xmlns:w16se="http://schemas.microsoft.com/office/word/2015/wordml/symex" xmlns:wpg="http://schemas.microsoft.com/office/word/2010/wordprocessingGroup" xmlns:wpi="http://schemas.microsoft.com/office/word/2010/wordprocessingInk" xmlns:wne="http://schemas.microsoft.com/office/word/2006/wordml" xmlns:wps="http://schemas.microsoft.com/office/word/2010/wordprocessingShape" mc:Ignorable="w14 w15 w16se w16cid w16 w16cex w16sdtdh wp14">
   <w:footnote w:type="separator" w:id="-1">
     <w:p>
       <w:r>
@@ -2064,7 +2037,7 @@
 </file>
 
 <file path=word/numbering.xml><?xml version="1.0" encoding="utf-8"?>
-<w:numbering xmlns:wpc="http://schemas.microsoft.com/office/word/2010/wordprocessingCanvas" xmlns:cx="http://schemas.microsoft.com/office/drawing/2014/chartex" xmlns:cx1="http://schemas.microsoft.com/office/drawing/2015/9/8/chartex" xmlns:cx2="http://schemas.microsoft.com/office/drawing/2015/10/21/chartex" xmlns:cx3="http://schemas.microsoft.com/office/drawing/2016/5/9/chartex" xmlns:cx4="http://schemas.microsoft.com/office/drawing/2016/5/10/chartex" xmlns:cx5="http://schemas.microsoft.com/office/drawing/2016/5/11/chartex" xmlns:cx6="http://schemas.microsoft.com/office/drawing/2016/5/12/chartex" xmlns:cx7="http://schemas.microsoft.com/office/drawing/2016/5/13/chartex" xmlns:cx8="http://schemas.microsoft.com/office/drawing/2016/5/14/chartex" xmlns:mc="http://schemas.openxmlformats.org/markup-compatibility/2006" xmlns:aink="http://schemas.microsoft.com/office/drawing/2016/ink" xmlns:am3d="http://schemas.microsoft.com/office/drawing/2017/model3d" xmlns:o="urn:schemas-microsoft-com:office:office" xmlns:r="http://schemas.openxmlformats.org/officeDocument/2006/relationships" xmlns:m="http://schemas.openxmlformats.org/officeDocument/2006/math" xmlns:v="urn:schemas-microsoft-com:vml" xmlns:wp14="http://schemas.microsoft.com/office/word/2010/wordprocessingDrawing" xmlns:wp="http://schemas.openxmlformats.org/drawingml/2006/wordprocessingDrawing" xmlns:w10="urn:schemas-microsoft-com:office:word" xmlns:w="http://schemas.openxmlformats.org/wordprocessingml/2006/main" xmlns:w14="http://schemas.microsoft.com/office/word/2010/wordml" xmlns:w15="http://schemas.microsoft.com/office/word/2012/wordml" xmlns:w16cid="http://schemas.microsoft.com/office/word/2016/wordml/cid" xmlns:w16se="http://schemas.microsoft.com/office/word/2015/wordml/symex" xmlns:wpg="http://schemas.microsoft.com/office/word/2010/wordprocessingGroup" xmlns:wpi="http://schemas.microsoft.com/office/word/2010/wordprocessingInk" xmlns:wne="http://schemas.microsoft.com/office/word/2006/wordml" xmlns:wps="http://schemas.microsoft.com/office/word/2010/wordprocessingShape" mc:Ignorable="w14 w15 w16se w16cid wp14">
+<w:numbering xmlns:wpc="http://schemas.microsoft.com/office/word/2010/wordprocessingCanvas" xmlns:cx="http://schemas.microsoft.com/office/drawing/2014/chartex" xmlns:cx1="http://schemas.microsoft.com/office/drawing/2015/9/8/chartex" xmlns:cx2="http://schemas.microsoft.com/office/drawing/2015/10/21/chartex" xmlns:cx3="http://schemas.microsoft.com/office/drawing/2016/5/9/chartex" xmlns:cx4="http://schemas.microsoft.com/office/drawing/2016/5/10/chartex" xmlns:cx5="http://schemas.microsoft.com/office/drawing/2016/5/11/chartex" xmlns:cx6="http://schemas.microsoft.com/office/drawing/2016/5/12/chartex" xmlns:cx7="http://schemas.microsoft.com/office/drawing/2016/5/13/chartex" xmlns:cx8="http://schemas.microsoft.com/office/drawing/2016/5/14/chartex" xmlns:mc="http://schemas.openxmlformats.org/markup-compatibility/2006" xmlns:aink="http://schemas.microsoft.com/office/drawing/2016/ink" xmlns:am3d="http://schemas.microsoft.com/office/drawing/2017/model3d" xmlns:o="urn:schemas-microsoft-com:office:office" xmlns:oel="http://schemas.microsoft.com/office/2019/extlst" xmlns:r="http://schemas.openxmlformats.org/officeDocument/2006/relationships" xmlns:m="http://schemas.openxmlformats.org/officeDocument/2006/math" xmlns:v="urn:schemas-microsoft-com:vml" xmlns:wp14="http://schemas.microsoft.com/office/word/2010/wordprocessingDrawing" xmlns:wp="http://schemas.openxmlformats.org/drawingml/2006/wordprocessingDrawing" xmlns:w10="urn:schemas-microsoft-com:office:word" xmlns:w="http://schemas.openxmlformats.org/wordprocessingml/2006/main" xmlns:w14="http://schemas.microsoft.com/office/word/2010/wordml" xmlns:w15="http://schemas.microsoft.com/office/word/2012/wordml" xmlns:w16cex="http://schemas.microsoft.com/office/word/2018/wordml/cex" xmlns:w16cid="http://schemas.microsoft.com/office/word/2016/wordml/cid" xmlns:w16="http://schemas.microsoft.com/office/word/2018/wordml" xmlns:w16sdtdh="http://schemas.microsoft.com/office/word/2020/wordml/sdtdatahash" xmlns:w16se="http://schemas.microsoft.com/office/word/2015/wordml/symex" xmlns:wpg="http://schemas.microsoft.com/office/word/2010/wordprocessingGroup" xmlns:wpi="http://schemas.microsoft.com/office/word/2010/wordprocessingInk" xmlns:wne="http://schemas.microsoft.com/office/word/2006/wordml" xmlns:wps="http://schemas.microsoft.com/office/word/2010/wordprocessingShape" mc:Ignorable="w14 w15 w16se w16cid w16 w16cex w16sdtdh wp14">
   <w:abstractNum w:abstractNumId="0" w15:restartNumberingAfterBreak="0">
     <w:nsid w:val="FFFFFF7C"/>
     <w:multiLevelType w:val="singleLevel"/>
@@ -2550,113 +2523,113 @@
       </w:rPr>
     </w:lvl>
   </w:abstractNum>
-  <w:num w:numId="1">
+  <w:num w:numId="1" w16cid:durableId="440536949">
     <w:abstractNumId w:val="9"/>
   </w:num>
-  <w:num w:numId="2">
+  <w:num w:numId="2" w16cid:durableId="468326791">
     <w:abstractNumId w:val="7"/>
   </w:num>
-  <w:num w:numId="3">
+  <w:num w:numId="3" w16cid:durableId="1184704752">
     <w:abstractNumId w:val="6"/>
   </w:num>
-  <w:num w:numId="4">
+  <w:num w:numId="4" w16cid:durableId="1441870958">
     <w:abstractNumId w:val="5"/>
   </w:num>
-  <w:num w:numId="5">
+  <w:num w:numId="5" w16cid:durableId="583227339">
     <w:abstractNumId w:val="4"/>
   </w:num>
-  <w:num w:numId="6">
+  <w:num w:numId="6" w16cid:durableId="1430203002">
     <w:abstractNumId w:val="8"/>
   </w:num>
-  <w:num w:numId="7">
+  <w:num w:numId="7" w16cid:durableId="274604203">
     <w:abstractNumId w:val="3"/>
   </w:num>
-  <w:num w:numId="8">
+  <w:num w:numId="8" w16cid:durableId="1691568176">
     <w:abstractNumId w:val="2"/>
   </w:num>
-  <w:num w:numId="9">
+  <w:num w:numId="9" w16cid:durableId="444690619">
     <w:abstractNumId w:val="1"/>
   </w:num>
-  <w:num w:numId="10">
+  <w:num w:numId="10" w16cid:durableId="603458806">
     <w:abstractNumId w:val="0"/>
   </w:num>
-  <w:num w:numId="11">
+  <w:num w:numId="11" w16cid:durableId="738287927">
     <w:abstractNumId w:val="10"/>
   </w:num>
-  <w:num w:numId="12">
+  <w:num w:numId="12" w16cid:durableId="233782948">
     <w:abstractNumId w:val="10"/>
   </w:num>
-  <w:num w:numId="13">
+  <w:num w:numId="13" w16cid:durableId="554312672">
     <w:abstractNumId w:val="10"/>
   </w:num>
-  <w:num w:numId="14">
+  <w:num w:numId="14" w16cid:durableId="1599170129">
     <w:abstractNumId w:val="10"/>
   </w:num>
-  <w:num w:numId="15">
+  <w:num w:numId="15" w16cid:durableId="1262102455">
     <w:abstractNumId w:val="10"/>
   </w:num>
-  <w:num w:numId="16">
+  <w:num w:numId="16" w16cid:durableId="712732952">
     <w:abstractNumId w:val="10"/>
   </w:num>
-  <w:num w:numId="17">
+  <w:num w:numId="17" w16cid:durableId="1994790575">
     <w:abstractNumId w:val="10"/>
   </w:num>
-  <w:num w:numId="18">
+  <w:num w:numId="18" w16cid:durableId="1093085181">
     <w:abstractNumId w:val="10"/>
   </w:num>
-  <w:num w:numId="19">
+  <w:num w:numId="19" w16cid:durableId="595941129">
     <w:abstractNumId w:val="10"/>
   </w:num>
-  <w:num w:numId="20">
+  <w:num w:numId="20" w16cid:durableId="1232620712">
     <w:abstractNumId w:val="10"/>
   </w:num>
-  <w:num w:numId="21">
+  <w:num w:numId="21" w16cid:durableId="1783188319">
     <w:abstractNumId w:val="10"/>
   </w:num>
-  <w:num w:numId="22">
+  <w:num w:numId="22" w16cid:durableId="182405607">
     <w:abstractNumId w:val="10"/>
   </w:num>
-  <w:num w:numId="23">
+  <w:num w:numId="23" w16cid:durableId="169877186">
     <w:abstractNumId w:val="10"/>
   </w:num>
-  <w:num w:numId="24">
+  <w:num w:numId="24" w16cid:durableId="801387630">
     <w:abstractNumId w:val="9"/>
   </w:num>
-  <w:num w:numId="25">
+  <w:num w:numId="25" w16cid:durableId="1032918049">
     <w:abstractNumId w:val="7"/>
   </w:num>
-  <w:num w:numId="26">
+  <w:num w:numId="26" w16cid:durableId="279797145">
     <w:abstractNumId w:val="6"/>
   </w:num>
-  <w:num w:numId="27">
+  <w:num w:numId="27" w16cid:durableId="1767311044">
     <w:abstractNumId w:val="5"/>
   </w:num>
-  <w:num w:numId="28">
+  <w:num w:numId="28" w16cid:durableId="689137526">
     <w:abstractNumId w:val="4"/>
   </w:num>
-  <w:num w:numId="29">
+  <w:num w:numId="29" w16cid:durableId="577207718">
     <w:abstractNumId w:val="8"/>
   </w:num>
-  <w:num w:numId="30">
+  <w:num w:numId="30" w16cid:durableId="792945800">
     <w:abstractNumId w:val="3"/>
   </w:num>
-  <w:num w:numId="31">
+  <w:num w:numId="31" w16cid:durableId="42877372">
     <w:abstractNumId w:val="2"/>
   </w:num>
-  <w:num w:numId="32">
+  <w:num w:numId="32" w16cid:durableId="1182819114">
     <w:abstractNumId w:val="1"/>
   </w:num>
-  <w:num w:numId="33">
+  <w:num w:numId="33" w16cid:durableId="486017236">
     <w:abstractNumId w:val="0"/>
   </w:num>
-  <w:num w:numId="34">
+  <w:num w:numId="34" w16cid:durableId="707682363">
     <w:abstractNumId w:val="11"/>
   </w:num>
 </w:numbering>
 </file>
 
 <file path=word/styles.xml><?xml version="1.0" encoding="utf-8"?>
-<w:styles xmlns:mc="http://schemas.openxmlformats.org/markup-compatibility/2006" xmlns:r="http://schemas.openxmlformats.org/officeDocument/2006/relationships" xmlns:w="http://schemas.openxmlformats.org/wordprocessingml/2006/main" xmlns:w14="http://schemas.microsoft.com/office/word/2010/wordml" xmlns:w15="http://schemas.microsoft.com/office/word/2012/wordml" xmlns:w16cid="http://schemas.microsoft.com/office/word/2016/wordml/cid" xmlns:w16se="http://schemas.microsoft.com/office/word/2015/wordml/symex" mc:Ignorable="w14 w15 w16se w16cid">
+<w:styles xmlns:mc="http://schemas.openxmlformats.org/markup-compatibility/2006" xmlns:r="http://schemas.openxmlformats.org/officeDocument/2006/relationships" xmlns:w="http://schemas.openxmlformats.org/wordprocessingml/2006/main" xmlns:w14="http://schemas.microsoft.com/office/word/2010/wordml" xmlns:w15="http://schemas.microsoft.com/office/word/2012/wordml" xmlns:w16cex="http://schemas.microsoft.com/office/word/2018/wordml/cex" xmlns:w16cid="http://schemas.microsoft.com/office/word/2016/wordml/cid" xmlns:w16="http://schemas.microsoft.com/office/word/2018/wordml" xmlns:w16sdtdh="http://schemas.microsoft.com/office/word/2020/wordml/sdtdatahash" xmlns:w16se="http://schemas.microsoft.com/office/word/2015/wordml/symex" mc:Ignorable="w14 w15 w16se w16cid w16 w16cex w16sdtdh">
   <w:docDefaults>
     <w:rPrDefault>
       <w:rPr>
@@ -2666,7 +2639,7 @@
     </w:rPrDefault>
     <w:pPrDefault/>
   </w:docDefaults>
-  <w:latentStyles w:defLockedState="0" w:defUIPriority="0" w:defSemiHidden="0" w:defUnhideWhenUsed="0" w:defQFormat="0" w:count="375">
+  <w:latentStyles w:defLockedState="0" w:defUIPriority="0" w:defSemiHidden="0" w:defUnhideWhenUsed="0" w:defQFormat="0" w:count="376">
     <w:lsdException w:name="Normal" w:qFormat="1"/>
     <w:lsdException w:name="heading 1" w:qFormat="1"/>
     <w:lsdException w:name="heading 2" w:qFormat="1"/>
@@ -2683,7 +2656,7 @@
     <w:lsdException w:name="Strong" w:qFormat="1"/>
     <w:lsdException w:name="Emphasis" w:qFormat="1"/>
     <w:lsdException w:name="HTML Preformatted" w:semiHidden="1" w:unhideWhenUsed="1"/>
-    <w:lsdException w:name="Normal Table" w:semiHidden="1" w:unhideWhenUsed="1"/>
+    <w:lsdException w:name="HTML Variable" w:semiHidden="1" w:unhideWhenUsed="1"/>
     <w:lsdException w:name="No List" w:semiHidden="1" w:unhideWhenUsed="1"/>
     <w:lsdException w:name="Outline List 1" w:semiHidden="1" w:unhideWhenUsed="1"/>
     <w:lsdException w:name="Outline List 2" w:semiHidden="1" w:unhideWhenUsed="1"/>
@@ -2729,8 +2702,7 @@
     <w:lsdException w:name="Table Subtle 2" w:semiHidden="1" w:unhideWhenUsed="1"/>
     <w:lsdException w:name="Table Web 1" w:semiHidden="1" w:unhideWhenUsed="1"/>
     <w:lsdException w:name="Table Web 2" w:semiHidden="1" w:unhideWhenUsed="1"/>
-    <w:lsdException w:name="Table Web 3" w:semiHidden="1" w:unhideWhenUsed="1"/>
-    <w:lsdException w:name="Table Theme" w:semiHidden="1" w:unhideWhenUsed="1"/>
+    <w:lsdException w:name="Balloon Text" w:semiHidden="1" w:unhideWhenUsed="1"/>
     <w:lsdException w:name="Placeholder Text" w:semiHidden="1" w:uiPriority="99"/>
     <w:lsdException w:name="No Spacing" w:uiPriority="1" w:qFormat="1"/>
     <w:lsdException w:name="Light Shading" w:uiPriority="60"/>
@@ -2950,6 +2922,7 @@
     <w:lsdException w:name="Smart Hyperlink" w:semiHidden="1" w:uiPriority="99" w:unhideWhenUsed="1"/>
     <w:lsdException w:name="Hashtag" w:semiHidden="1" w:uiPriority="99" w:unhideWhenUsed="1"/>
     <w:lsdException w:name="Unresolved Mention" w:semiHidden="1" w:uiPriority="99" w:unhideWhenUsed="1"/>
+    <w:lsdException w:name="Smart Link" w:semiHidden="1" w:uiPriority="99" w:unhideWhenUsed="1"/>
   </w:latentStyles>
   <w:style w:type="paragraph" w:default="1" w:styleId="Normal">
     <w:name w:val="Normal"/>
@@ -4114,7 +4087,7 @@
 </file>
 
 <file path=word/glossary/document.xml><?xml version="1.0" encoding="utf-8"?>
-<w:glossaryDocument xmlns:wpc="http://schemas.microsoft.com/office/word/2010/wordprocessingCanvas" xmlns:cx="http://schemas.microsoft.com/office/drawing/2014/chartex" xmlns:cx1="http://schemas.microsoft.com/office/drawing/2015/9/8/chartex" xmlns:cx2="http://schemas.microsoft.com/office/drawing/2015/10/21/chartex" xmlns:cx3="http://schemas.microsoft.com/office/drawing/2016/5/9/chartex" xmlns:cx4="http://schemas.microsoft.com/office/drawing/2016/5/10/chartex" xmlns:cx5="http://schemas.microsoft.com/office/drawing/2016/5/11/chartex" xmlns:cx6="http://schemas.microsoft.com/office/drawing/2016/5/12/chartex" xmlns:cx7="http://schemas.microsoft.com/office/drawing/2016/5/13/chartex" xmlns:cx8="http://schemas.microsoft.com/office/drawing/2016/5/14/chartex" xmlns:mc="http://schemas.openxmlformats.org/markup-compatibility/2006" xmlns:aink="http://schemas.microsoft.com/office/drawing/2016/ink" xmlns:am3d="http://schemas.microsoft.com/office/drawing/2017/model3d" xmlns:o="urn:schemas-microsoft-com:office:office" xmlns:r="http://schemas.openxmlformats.org/officeDocument/2006/relationships" xmlns:m="http://schemas.openxmlformats.org/officeDocument/2006/math" xmlns:v="urn:schemas-microsoft-com:vml" xmlns:wp14="http://schemas.microsoft.com/office/word/2010/wordprocessingDrawing" xmlns:wp="http://schemas.openxmlformats.org/drawingml/2006/wordprocessingDrawing" xmlns:w10="urn:schemas-microsoft-com:office:word" xmlns:w="http://schemas.openxmlformats.org/wordprocessingml/2006/main" xmlns:w14="http://schemas.microsoft.com/office/word/2010/wordml" xmlns:w15="http://schemas.microsoft.com/office/word/2012/wordml" xmlns:w16cid="http://schemas.microsoft.com/office/word/2016/wordml/cid" xmlns:w16se="http://schemas.microsoft.com/office/word/2015/wordml/symex" xmlns:wpg="http://schemas.microsoft.com/office/word/2010/wordprocessingGroup" xmlns:wpi="http://schemas.microsoft.com/office/word/2010/wordprocessingInk" xmlns:wne="http://schemas.microsoft.com/office/word/2006/wordml" xmlns:wps="http://schemas.microsoft.com/office/word/2010/wordprocessingShape" mc:Ignorable="w14 w15 w16se w16cid wp14">
+<w:glossaryDocument xmlns:wpc="http://schemas.microsoft.com/office/word/2010/wordprocessingCanvas" xmlns:cx="http://schemas.microsoft.com/office/drawing/2014/chartex" xmlns:cx1="http://schemas.microsoft.com/office/drawing/2015/9/8/chartex" xmlns:cx2="http://schemas.microsoft.com/office/drawing/2015/10/21/chartex" xmlns:cx3="http://schemas.microsoft.com/office/drawing/2016/5/9/chartex" xmlns:cx4="http://schemas.microsoft.com/office/drawing/2016/5/10/chartex" xmlns:cx5="http://schemas.microsoft.com/office/drawing/2016/5/11/chartex" xmlns:cx6="http://schemas.microsoft.com/office/drawing/2016/5/12/chartex" xmlns:cx7="http://schemas.microsoft.com/office/drawing/2016/5/13/chartex" xmlns:cx8="http://schemas.microsoft.com/office/drawing/2016/5/14/chartex" xmlns:mc="http://schemas.openxmlformats.org/markup-compatibility/2006" xmlns:aink="http://schemas.microsoft.com/office/drawing/2016/ink" xmlns:am3d="http://schemas.microsoft.com/office/drawing/2017/model3d" xmlns:o="urn:schemas-microsoft-com:office:office" xmlns:oel="http://schemas.microsoft.com/office/2019/extlst" xmlns:r="http://schemas.openxmlformats.org/officeDocument/2006/relationships" xmlns:m="http://schemas.openxmlformats.org/officeDocument/2006/math" xmlns:v="urn:schemas-microsoft-com:vml" xmlns:wp14="http://schemas.microsoft.com/office/word/2010/wordprocessingDrawing" xmlns:wp="http://schemas.openxmlformats.org/drawingml/2006/wordprocessingDrawing" xmlns:w10="urn:schemas-microsoft-com:office:word" xmlns:w="http://schemas.openxmlformats.org/wordprocessingml/2006/main" xmlns:w14="http://schemas.microsoft.com/office/word/2010/wordml" xmlns:w15="http://schemas.microsoft.com/office/word/2012/wordml" xmlns:w16cex="http://schemas.microsoft.com/office/word/2018/wordml/cex" xmlns:w16cid="http://schemas.microsoft.com/office/word/2016/wordml/cid" xmlns:w16="http://schemas.microsoft.com/office/word/2018/wordml" xmlns:w16sdtdh="http://schemas.microsoft.com/office/word/2020/wordml/sdtdatahash" xmlns:w16se="http://schemas.microsoft.com/office/word/2015/wordml/symex" xmlns:wpg="http://schemas.microsoft.com/office/word/2010/wordprocessingGroup" xmlns:wpi="http://schemas.microsoft.com/office/word/2010/wordprocessingInk" xmlns:wne="http://schemas.microsoft.com/office/word/2006/wordml" xmlns:wps="http://schemas.microsoft.com/office/word/2010/wordprocessingShape" mc:Ignorable="w14 w15 w16se w16cid w16 w16cex w16sdtdh wp14">
   <w:docParts>
     <w:docPart>
       <w:docPartPr>
@@ -4807,7 +4780,7 @@
 </file>
 
 <file path=word/glossary/fontTable.xml><?xml version="1.0" encoding="utf-8"?>
-<w:fonts xmlns:mc="http://schemas.openxmlformats.org/markup-compatibility/2006" xmlns:r="http://schemas.openxmlformats.org/officeDocument/2006/relationships" xmlns:w="http://schemas.openxmlformats.org/wordprocessingml/2006/main" xmlns:w14="http://schemas.microsoft.com/office/word/2010/wordml" xmlns:w15="http://schemas.microsoft.com/office/word/2012/wordml" xmlns:w16cid="http://schemas.microsoft.com/office/word/2016/wordml/cid" xmlns:w16se="http://schemas.microsoft.com/office/word/2015/wordml/symex" mc:Ignorable="w14 w15 w16se w16cid">
+<w:fonts xmlns:mc="http://schemas.openxmlformats.org/markup-compatibility/2006" xmlns:r="http://schemas.openxmlformats.org/officeDocument/2006/relationships" xmlns:w="http://schemas.openxmlformats.org/wordprocessingml/2006/main" xmlns:w14="http://schemas.microsoft.com/office/word/2010/wordml" xmlns:w15="http://schemas.microsoft.com/office/word/2012/wordml" xmlns:w16cex="http://schemas.microsoft.com/office/word/2018/wordml/cex" xmlns:w16cid="http://schemas.microsoft.com/office/word/2016/wordml/cid" xmlns:w16="http://schemas.microsoft.com/office/word/2018/wordml" xmlns:w16sdtdh="http://schemas.microsoft.com/office/word/2020/wordml/sdtdatahash" xmlns:w16se="http://schemas.microsoft.com/office/word/2015/wordml/symex" mc:Ignorable="w14 w15 w16se w16cid w16 w16cex w16sdtdh">
   <w:font w:name="Symbol">
     <w:panose1 w:val="05050102010706020507"/>
     <w:charset w:val="02"/>
@@ -4863,20 +4836,20 @@
     <w:charset w:val="00"/>
     <w:family w:val="swiss"/>
     <w:pitch w:val="variable"/>
-    <w:sig w:usb0="E0002AFF" w:usb1="C000247B" w:usb2="00000009" w:usb3="00000000" w:csb0="000001FF" w:csb1="00000000"/>
+    <w:sig w:usb0="E4002EFF" w:usb1="C000247B" w:usb2="00000009" w:usb3="00000000" w:csb0="000001FF" w:csb1="00000000"/>
   </w:font>
   <w:font w:name="Calibri">
     <w:panose1 w:val="020F0502020204030204"/>
     <w:charset w:val="00"/>
     <w:family w:val="swiss"/>
     <w:pitch w:val="variable"/>
-    <w:sig w:usb0="E0002EFF" w:usb1="C000247B" w:usb2="00000009" w:usb3="00000000" w:csb0="000001FF" w:csb1="00000000"/>
+    <w:sig w:usb0="E4002EFF" w:usb1="C000247B" w:usb2="00000009" w:usb3="00000000" w:csb0="000001FF" w:csb1="00000000"/>
   </w:font>
 </w:fonts>
 </file>
 
 <file path=word/glossary/settings.xml><?xml version="1.0" encoding="utf-8"?>
-<w:settings xmlns:mc="http://schemas.openxmlformats.org/markup-compatibility/2006" xmlns:o="urn:schemas-microsoft-com:office:office" xmlns:r="http://schemas.openxmlformats.org/officeDocument/2006/relationships" xmlns:m="http://schemas.openxmlformats.org/officeDocument/2006/math" xmlns:v="urn:schemas-microsoft-com:vml" xmlns:w10="urn:schemas-microsoft-com:office:word" xmlns:w="http://schemas.openxmlformats.org/wordprocessingml/2006/main" xmlns:w14="http://schemas.microsoft.com/office/word/2010/wordml" xmlns:w15="http://schemas.microsoft.com/office/word/2012/wordml" xmlns:w16cid="http://schemas.microsoft.com/office/word/2016/wordml/cid" xmlns:w16se="http://schemas.microsoft.com/office/word/2015/wordml/symex" xmlns:sl="http://schemas.openxmlformats.org/schemaLibrary/2006/main" mc:Ignorable="w14 w15 w16se w16cid">
+<w:settings xmlns:mc="http://schemas.openxmlformats.org/markup-compatibility/2006" xmlns:o="urn:schemas-microsoft-com:office:office" xmlns:r="http://schemas.openxmlformats.org/officeDocument/2006/relationships" xmlns:m="http://schemas.openxmlformats.org/officeDocument/2006/math" xmlns:v="urn:schemas-microsoft-com:vml" xmlns:w10="urn:schemas-microsoft-com:office:word" xmlns:w="http://schemas.openxmlformats.org/wordprocessingml/2006/main" xmlns:w14="http://schemas.microsoft.com/office/word/2010/wordml" xmlns:w15="http://schemas.microsoft.com/office/word/2012/wordml" xmlns:w16cex="http://schemas.microsoft.com/office/word/2018/wordml/cex" xmlns:w16cid="http://schemas.microsoft.com/office/word/2016/wordml/cid" xmlns:w16="http://schemas.microsoft.com/office/word/2018/wordml" xmlns:w16sdtdh="http://schemas.microsoft.com/office/word/2020/wordml/sdtdatahash" xmlns:w16se="http://schemas.microsoft.com/office/word/2015/wordml/symex" xmlns:sl="http://schemas.openxmlformats.org/schemaLibrary/2006/main" mc:Ignorable="w14 w15 w16se w16cid w16 w16cex w16sdtdh">
   <w:view w:val="normal"/>
   <w:defaultTabStop w:val="720"/>
   <w:characterSpacingControl w:val="doNotCompress"/>
@@ -4915,6 +4888,7 @@
     <w:rsid w:val="0071082B"/>
     <w:rsid w:val="00840A90"/>
     <w:rsid w:val="0088046E"/>
+    <w:rsid w:val="008A39B2"/>
     <w:rsid w:val="00992A50"/>
     <w:rsid w:val="009A0C2A"/>
     <w:rsid w:val="009E4DD6"/>
@@ -4955,7 +4929,7 @@
 </file>
 
 <file path=word/glossary/styles.xml><?xml version="1.0" encoding="utf-8"?>
-<w:styles xmlns:mc="http://schemas.openxmlformats.org/markup-compatibility/2006" xmlns:r="http://schemas.openxmlformats.org/officeDocument/2006/relationships" xmlns:w="http://schemas.openxmlformats.org/wordprocessingml/2006/main" xmlns:w14="http://schemas.microsoft.com/office/word/2010/wordml" xmlns:w15="http://schemas.microsoft.com/office/word/2012/wordml" xmlns:w16cid="http://schemas.microsoft.com/office/word/2016/wordml/cid" xmlns:w16se="http://schemas.microsoft.com/office/word/2015/wordml/symex" mc:Ignorable="w14 w15 w16se w16cid">
+<w:styles xmlns:mc="http://schemas.openxmlformats.org/markup-compatibility/2006" xmlns:r="http://schemas.openxmlformats.org/officeDocument/2006/relationships" xmlns:w="http://schemas.openxmlformats.org/wordprocessingml/2006/main" xmlns:w14="http://schemas.microsoft.com/office/word/2010/wordml" xmlns:w15="http://schemas.microsoft.com/office/word/2012/wordml" xmlns:w16cex="http://schemas.microsoft.com/office/word/2018/wordml/cex" xmlns:w16cid="http://schemas.microsoft.com/office/word/2016/wordml/cid" xmlns:w16="http://schemas.microsoft.com/office/word/2018/wordml" xmlns:w16sdtdh="http://schemas.microsoft.com/office/word/2020/wordml/sdtdatahash" xmlns:w16se="http://schemas.microsoft.com/office/word/2015/wordml/symex" mc:Ignorable="w14 w15 w16se w16cid w16 w16cex w16sdtdh">
   <w:docDefaults>
     <w:rPrDefault>
       <w:rPr>
@@ -4971,7 +4945,7 @@
       </w:pPr>
     </w:pPrDefault>
   </w:docDefaults>
-  <w:latentStyles w:defLockedState="0" w:defUIPriority="99" w:defSemiHidden="0" w:defUnhideWhenUsed="0" w:defQFormat="0" w:count="375">
+  <w:latentStyles w:defLockedState="0" w:defUIPriority="99" w:defSemiHidden="0" w:defUnhideWhenUsed="0" w:defQFormat="0" w:count="376">
     <w:lsdException w:name="Normal" w:uiPriority="0" w:qFormat="1"/>
     <w:lsdException w:name="heading 1" w:uiPriority="9" w:qFormat="1"/>
     <w:lsdException w:name="heading 2" w:semiHidden="1" w:uiPriority="9" w:unhideWhenUsed="1" w:qFormat="1"/>
@@ -5077,7 +5051,6 @@
     <w:lsdException w:name="HTML Sample" w:semiHidden="1" w:unhideWhenUsed="1"/>
     <w:lsdException w:name="HTML Typewriter" w:semiHidden="1" w:unhideWhenUsed="1"/>
     <w:lsdException w:name="HTML Variable" w:semiHidden="1" w:unhideWhenUsed="1"/>
-    <w:lsdException w:name="Normal Table" w:semiHidden="1" w:unhideWhenUsed="1"/>
     <w:lsdException w:name="annotation subject" w:semiHidden="1" w:unhideWhenUsed="1"/>
     <w:lsdException w:name="No List" w:semiHidden="1" w:unhideWhenUsed="1"/>
     <w:lsdException w:name="Outline List 1" w:semiHidden="1" w:unhideWhenUsed="1"/>
@@ -5124,10 +5097,8 @@
     <w:lsdException w:name="Table Subtle 2" w:semiHidden="1" w:unhideWhenUsed="1"/>
     <w:lsdException w:name="Table Web 1" w:semiHidden="1" w:unhideWhenUsed="1"/>
     <w:lsdException w:name="Table Web 2" w:semiHidden="1" w:unhideWhenUsed="1"/>
-    <w:lsdException w:name="Table Web 3" w:semiHidden="1" w:unhideWhenUsed="1"/>
     <w:lsdException w:name="Balloon Text" w:semiHidden="1" w:unhideWhenUsed="1"/>
     <w:lsdException w:name="Table Grid" w:uiPriority="39"/>
-    <w:lsdException w:name="Table Theme" w:semiHidden="1" w:unhideWhenUsed="1"/>
     <w:lsdException w:name="Placeholder Text" w:semiHidden="1"/>
     <w:lsdException w:name="No Spacing" w:uiPriority="1" w:qFormat="1"/>
     <w:lsdException w:name="Light Shading" w:uiPriority="60"/>
@@ -5347,6 +5318,7 @@
     <w:lsdException w:name="Smart Hyperlink" w:semiHidden="1" w:unhideWhenUsed="1"/>
     <w:lsdException w:name="Hashtag" w:semiHidden="1" w:unhideWhenUsed="1"/>
     <w:lsdException w:name="Unresolved Mention" w:semiHidden="1" w:unhideWhenUsed="1"/>
+    <w:lsdException w:name="Smart Link" w:semiHidden="1" w:unhideWhenUsed="1"/>
   </w:latentStyles>
   <w:style w:type="paragraph" w:default="1" w:styleId="Normal">
     <w:name w:val="Normal"/>
@@ -5389,3722 +5361,6 @@
       <w:color w:val="808080"/>
     </w:rPr>
   </w:style>
-  <w:style w:type="paragraph" w:customStyle="1" w:styleId="55865A3FE25D48EE92A4DB1369CF4B59">
-    <w:name w:val="55865A3FE25D48EE92A4DB1369CF4B59"/>
-    <w:rsid w:val="009A0C2A"/>
-  </w:style>
-  <w:style w:type="paragraph" w:customStyle="1" w:styleId="AD8CD548E107448DBAFDB2623BE278DD">
-    <w:name w:val="AD8CD548E107448DBAFDB2623BE278DD"/>
-    <w:rsid w:val="009A0C2A"/>
-  </w:style>
-  <w:style w:type="paragraph" w:customStyle="1" w:styleId="96C25A1F4AB04D79907231EAA746DFBF">
-    <w:name w:val="96C25A1F4AB04D79907231EAA746DFBF"/>
-    <w:rsid w:val="009A0C2A"/>
-  </w:style>
-  <w:style w:type="paragraph" w:customStyle="1" w:styleId="73D7043797F94649B8BC86AA825B584B">
-    <w:name w:val="73D7043797F94649B8BC86AA825B584B"/>
-    <w:rsid w:val="009A0C2A"/>
-  </w:style>
-  <w:style w:type="paragraph" w:customStyle="1" w:styleId="A6B2BE62E05E43D28F2E9B748C1E6A79">
-    <w:name w:val="A6B2BE62E05E43D28F2E9B748C1E6A79"/>
-    <w:rsid w:val="009A0C2A"/>
-  </w:style>
-  <w:style w:type="paragraph" w:customStyle="1" w:styleId="A6B2BE62E05E43D28F2E9B748C1E6A791">
-    <w:name w:val="A6B2BE62E05E43D28F2E9B748C1E6A791"/>
-    <w:rsid w:val="00A65CC4"/>
-    <w:pPr>
-      <w:spacing w:after="120" w:line="240" w:lineRule="auto"/>
-    </w:pPr>
-    <w:rPr>
-      <w:rFonts w:ascii="Times New Roman" w:eastAsia="Times New Roman" w:hAnsi="Times New Roman" w:cs="Times New Roman"/>
-      <w:sz w:val="24"/>
-      <w:szCs w:val="24"/>
-    </w:rPr>
-  </w:style>
-  <w:style w:type="paragraph" w:customStyle="1" w:styleId="A6B2BE62E05E43D28F2E9B748C1E6A792">
-    <w:name w:val="A6B2BE62E05E43D28F2E9B748C1E6A792"/>
-    <w:rsid w:val="004E2E79"/>
-    <w:pPr>
-      <w:spacing w:after="120" w:line="240" w:lineRule="auto"/>
-    </w:pPr>
-    <w:rPr>
-      <w:rFonts w:ascii="Times New Roman" w:eastAsia="Times New Roman" w:hAnsi="Times New Roman" w:cs="Times New Roman"/>
-      <w:sz w:val="24"/>
-      <w:szCs w:val="24"/>
-    </w:rPr>
-  </w:style>
-  <w:style w:type="paragraph" w:customStyle="1" w:styleId="2CAF8B661A444881A001971C462CC343">
-    <w:name w:val="2CAF8B661A444881A001971C462CC343"/>
-    <w:rsid w:val="004E2E79"/>
-  </w:style>
-  <w:style w:type="paragraph" w:customStyle="1" w:styleId="2CAF8B661A444881A001971C462CC3431">
-    <w:name w:val="2CAF8B661A444881A001971C462CC3431"/>
-    <w:rsid w:val="004E2E79"/>
-    <w:pPr>
-      <w:spacing w:after="120" w:line="240" w:lineRule="auto"/>
-    </w:pPr>
-    <w:rPr>
-      <w:rFonts w:ascii="Times New Roman" w:eastAsia="Times New Roman" w:hAnsi="Times New Roman" w:cs="Times New Roman"/>
-      <w:sz w:val="24"/>
-      <w:szCs w:val="24"/>
-    </w:rPr>
-  </w:style>
-  <w:style w:type="paragraph" w:customStyle="1" w:styleId="2CAF8B661A444881A001971C462CC3432">
-    <w:name w:val="2CAF8B661A444881A001971C462CC3432"/>
-    <w:rsid w:val="004E2E79"/>
-    <w:pPr>
-      <w:spacing w:after="120" w:line="240" w:lineRule="auto"/>
-    </w:pPr>
-    <w:rPr>
-      <w:rFonts w:ascii="Times New Roman" w:eastAsia="Times New Roman" w:hAnsi="Times New Roman" w:cs="Times New Roman"/>
-      <w:sz w:val="24"/>
-      <w:szCs w:val="24"/>
-    </w:rPr>
-  </w:style>
-  <w:style w:type="paragraph" w:customStyle="1" w:styleId="2CAF8B661A444881A001971C462CC3433">
-    <w:name w:val="2CAF8B661A444881A001971C462CC3433"/>
-    <w:rsid w:val="004E2E79"/>
-    <w:pPr>
-      <w:spacing w:after="120" w:line="240" w:lineRule="auto"/>
-    </w:pPr>
-    <w:rPr>
-      <w:rFonts w:ascii="Times New Roman" w:eastAsia="Times New Roman" w:hAnsi="Times New Roman" w:cs="Times New Roman"/>
-      <w:sz w:val="24"/>
-      <w:szCs w:val="24"/>
-    </w:rPr>
-  </w:style>
-  <w:style w:type="paragraph" w:customStyle="1" w:styleId="2CAF8B661A444881A001971C462CC3434">
-    <w:name w:val="2CAF8B661A444881A001971C462CC3434"/>
-    <w:rsid w:val="004E2E79"/>
-    <w:pPr>
-      <w:spacing w:after="120" w:line="240" w:lineRule="auto"/>
-    </w:pPr>
-    <w:rPr>
-      <w:rFonts w:ascii="Times New Roman" w:eastAsia="Times New Roman" w:hAnsi="Times New Roman" w:cs="Times New Roman"/>
-      <w:sz w:val="24"/>
-      <w:szCs w:val="24"/>
-    </w:rPr>
-  </w:style>
-  <w:style w:type="paragraph" w:customStyle="1" w:styleId="90C438FFB4F54C97BD2329EF84FB3D2A">
-    <w:name w:val="90C438FFB4F54C97BD2329EF84FB3D2A"/>
-    <w:rsid w:val="004E2E79"/>
-    <w:pPr>
-      <w:spacing w:before="40" w:after="40" w:line="240" w:lineRule="auto"/>
-    </w:pPr>
-    <w:rPr>
-      <w:rFonts w:ascii="Times New Roman" w:eastAsia="Times New Roman" w:hAnsi="Times New Roman" w:cs="Times New Roman"/>
-      <w:sz w:val="24"/>
-      <w:szCs w:val="20"/>
-    </w:rPr>
-  </w:style>
-  <w:style w:type="paragraph" w:customStyle="1" w:styleId="DABD770CAE7545158C1FA0A23934C0D3">
-    <w:name w:val="DABD770CAE7545158C1FA0A23934C0D3"/>
-    <w:rsid w:val="004E2E79"/>
-    <w:pPr>
-      <w:spacing w:before="40" w:after="40" w:line="240" w:lineRule="auto"/>
-    </w:pPr>
-    <w:rPr>
-      <w:rFonts w:ascii="Times New Roman" w:eastAsia="Times New Roman" w:hAnsi="Times New Roman" w:cs="Times New Roman"/>
-      <w:sz w:val="24"/>
-      <w:szCs w:val="20"/>
-    </w:rPr>
-  </w:style>
-  <w:style w:type="paragraph" w:customStyle="1" w:styleId="1A024121D88C46E998D1D996726005C8">
-    <w:name w:val="1A024121D88C46E998D1D996726005C8"/>
-    <w:rsid w:val="004E2E79"/>
-    <w:pPr>
-      <w:spacing w:before="40" w:after="40" w:line="240" w:lineRule="auto"/>
-    </w:pPr>
-    <w:rPr>
-      <w:rFonts w:ascii="Times New Roman" w:eastAsia="Times New Roman" w:hAnsi="Times New Roman" w:cs="Times New Roman"/>
-      <w:sz w:val="24"/>
-      <w:szCs w:val="20"/>
-    </w:rPr>
-  </w:style>
-  <w:style w:type="paragraph" w:customStyle="1" w:styleId="98F324914AB045569FB94407DC585247">
-    <w:name w:val="98F324914AB045569FB94407DC585247"/>
-    <w:rsid w:val="004E2E79"/>
-    <w:pPr>
-      <w:spacing w:before="40" w:after="40" w:line="240" w:lineRule="auto"/>
-    </w:pPr>
-    <w:rPr>
-      <w:rFonts w:ascii="Times New Roman" w:eastAsia="Times New Roman" w:hAnsi="Times New Roman" w:cs="Times New Roman"/>
-      <w:sz w:val="24"/>
-      <w:szCs w:val="20"/>
-    </w:rPr>
-  </w:style>
-  <w:style w:type="paragraph" w:customStyle="1" w:styleId="2758C0A6B69C4C68BC8C8E9968CCC65F">
-    <w:name w:val="2758C0A6B69C4C68BC8C8E9968CCC65F"/>
-    <w:rsid w:val="004E2E79"/>
-    <w:pPr>
-      <w:spacing w:before="40" w:after="40" w:line="240" w:lineRule="auto"/>
-    </w:pPr>
-    <w:rPr>
-      <w:rFonts w:ascii="Times New Roman" w:eastAsia="Times New Roman" w:hAnsi="Times New Roman" w:cs="Times New Roman"/>
-      <w:sz w:val="24"/>
-      <w:szCs w:val="20"/>
-    </w:rPr>
-  </w:style>
-  <w:style w:type="paragraph" w:customStyle="1" w:styleId="2CAF8B661A444881A001971C462CC3435">
-    <w:name w:val="2CAF8B661A444881A001971C462CC3435"/>
-    <w:rsid w:val="004E2E79"/>
-    <w:pPr>
-      <w:spacing w:after="120" w:line="240" w:lineRule="auto"/>
-    </w:pPr>
-    <w:rPr>
-      <w:rFonts w:ascii="Times New Roman" w:eastAsia="Times New Roman" w:hAnsi="Times New Roman" w:cs="Times New Roman"/>
-      <w:sz w:val="24"/>
-      <w:szCs w:val="24"/>
-    </w:rPr>
-  </w:style>
-  <w:style w:type="paragraph" w:customStyle="1" w:styleId="90C438FFB4F54C97BD2329EF84FB3D2A1">
-    <w:name w:val="90C438FFB4F54C97BD2329EF84FB3D2A1"/>
-    <w:rsid w:val="004E2E79"/>
-    <w:pPr>
-      <w:spacing w:before="40" w:after="40" w:line="240" w:lineRule="auto"/>
-    </w:pPr>
-    <w:rPr>
-      <w:rFonts w:ascii="Times New Roman" w:eastAsia="Times New Roman" w:hAnsi="Times New Roman" w:cs="Times New Roman"/>
-      <w:sz w:val="24"/>
-      <w:szCs w:val="20"/>
-    </w:rPr>
-  </w:style>
-  <w:style w:type="paragraph" w:customStyle="1" w:styleId="DABD770CAE7545158C1FA0A23934C0D31">
-    <w:name w:val="DABD770CAE7545158C1FA0A23934C0D31"/>
-    <w:rsid w:val="004E2E79"/>
-    <w:pPr>
-      <w:spacing w:before="40" w:after="40" w:line="240" w:lineRule="auto"/>
-    </w:pPr>
-    <w:rPr>
-      <w:rFonts w:ascii="Times New Roman" w:eastAsia="Times New Roman" w:hAnsi="Times New Roman" w:cs="Times New Roman"/>
-      <w:sz w:val="24"/>
-      <w:szCs w:val="20"/>
-    </w:rPr>
-  </w:style>
-  <w:style w:type="paragraph" w:customStyle="1" w:styleId="1A024121D88C46E998D1D996726005C81">
-    <w:name w:val="1A024121D88C46E998D1D996726005C81"/>
-    <w:rsid w:val="004E2E79"/>
-    <w:pPr>
-      <w:spacing w:before="40" w:after="40" w:line="240" w:lineRule="auto"/>
-    </w:pPr>
-    <w:rPr>
-      <w:rFonts w:ascii="Times New Roman" w:eastAsia="Times New Roman" w:hAnsi="Times New Roman" w:cs="Times New Roman"/>
-      <w:sz w:val="24"/>
-      <w:szCs w:val="20"/>
-    </w:rPr>
-  </w:style>
-  <w:style w:type="paragraph" w:customStyle="1" w:styleId="98F324914AB045569FB94407DC5852471">
-    <w:name w:val="98F324914AB045569FB94407DC5852471"/>
-    <w:rsid w:val="004E2E79"/>
-    <w:pPr>
-      <w:spacing w:before="40" w:after="40" w:line="240" w:lineRule="auto"/>
-    </w:pPr>
-    <w:rPr>
-      <w:rFonts w:ascii="Times New Roman" w:eastAsia="Times New Roman" w:hAnsi="Times New Roman" w:cs="Times New Roman"/>
-      <w:sz w:val="24"/>
-      <w:szCs w:val="20"/>
-    </w:rPr>
-  </w:style>
-  <w:style w:type="paragraph" w:customStyle="1" w:styleId="2758C0A6B69C4C68BC8C8E9968CCC65F1">
-    <w:name w:val="2758C0A6B69C4C68BC8C8E9968CCC65F1"/>
-    <w:rsid w:val="004E2E79"/>
-    <w:pPr>
-      <w:spacing w:before="40" w:after="40" w:line="240" w:lineRule="auto"/>
-    </w:pPr>
-    <w:rPr>
-      <w:rFonts w:ascii="Times New Roman" w:eastAsia="Times New Roman" w:hAnsi="Times New Roman" w:cs="Times New Roman"/>
-      <w:sz w:val="24"/>
-      <w:szCs w:val="20"/>
-    </w:rPr>
-  </w:style>
-  <w:style w:type="paragraph" w:customStyle="1" w:styleId="2CAF8B661A444881A001971C462CC3436">
-    <w:name w:val="2CAF8B661A444881A001971C462CC3436"/>
-    <w:rsid w:val="004E2E79"/>
-    <w:pPr>
-      <w:spacing w:after="120" w:line="240" w:lineRule="auto"/>
-    </w:pPr>
-    <w:rPr>
-      <w:rFonts w:ascii="Times New Roman" w:eastAsia="Times New Roman" w:hAnsi="Times New Roman" w:cs="Times New Roman"/>
-      <w:sz w:val="24"/>
-      <w:szCs w:val="24"/>
-    </w:rPr>
-  </w:style>
-  <w:style w:type="paragraph" w:customStyle="1" w:styleId="90C438FFB4F54C97BD2329EF84FB3D2A2">
-    <w:name w:val="90C438FFB4F54C97BD2329EF84FB3D2A2"/>
-    <w:rsid w:val="004E2E79"/>
-    <w:pPr>
-      <w:spacing w:before="40" w:after="40" w:line="240" w:lineRule="auto"/>
-    </w:pPr>
-    <w:rPr>
-      <w:rFonts w:ascii="Times New Roman" w:eastAsia="Times New Roman" w:hAnsi="Times New Roman" w:cs="Times New Roman"/>
-      <w:sz w:val="24"/>
-      <w:szCs w:val="20"/>
-    </w:rPr>
-  </w:style>
-  <w:style w:type="paragraph" w:customStyle="1" w:styleId="DABD770CAE7545158C1FA0A23934C0D32">
-    <w:name w:val="DABD770CAE7545158C1FA0A23934C0D32"/>
-    <w:rsid w:val="004E2E79"/>
-    <w:pPr>
-      <w:spacing w:before="40" w:after="40" w:line="240" w:lineRule="auto"/>
-    </w:pPr>
-    <w:rPr>
-      <w:rFonts w:ascii="Times New Roman" w:eastAsia="Times New Roman" w:hAnsi="Times New Roman" w:cs="Times New Roman"/>
-      <w:sz w:val="24"/>
-      <w:szCs w:val="20"/>
-    </w:rPr>
-  </w:style>
-  <w:style w:type="paragraph" w:customStyle="1" w:styleId="1A024121D88C46E998D1D996726005C82">
-    <w:name w:val="1A024121D88C46E998D1D996726005C82"/>
-    <w:rsid w:val="004E2E79"/>
-    <w:pPr>
-      <w:spacing w:before="40" w:after="40" w:line="240" w:lineRule="auto"/>
-    </w:pPr>
-    <w:rPr>
-      <w:rFonts w:ascii="Times New Roman" w:eastAsia="Times New Roman" w:hAnsi="Times New Roman" w:cs="Times New Roman"/>
-      <w:sz w:val="24"/>
-      <w:szCs w:val="20"/>
-    </w:rPr>
-  </w:style>
-  <w:style w:type="paragraph" w:customStyle="1" w:styleId="98F324914AB045569FB94407DC5852472">
-    <w:name w:val="98F324914AB045569FB94407DC5852472"/>
-    <w:rsid w:val="004E2E79"/>
-    <w:pPr>
-      <w:spacing w:before="40" w:after="40" w:line="240" w:lineRule="auto"/>
-    </w:pPr>
-    <w:rPr>
-      <w:rFonts w:ascii="Times New Roman" w:eastAsia="Times New Roman" w:hAnsi="Times New Roman" w:cs="Times New Roman"/>
-      <w:sz w:val="24"/>
-      <w:szCs w:val="20"/>
-    </w:rPr>
-  </w:style>
-  <w:style w:type="paragraph" w:customStyle="1" w:styleId="2758C0A6B69C4C68BC8C8E9968CCC65F2">
-    <w:name w:val="2758C0A6B69C4C68BC8C8E9968CCC65F2"/>
-    <w:rsid w:val="004E2E79"/>
-    <w:pPr>
-      <w:spacing w:before="40" w:after="40" w:line="240" w:lineRule="auto"/>
-    </w:pPr>
-    <w:rPr>
-      <w:rFonts w:ascii="Times New Roman" w:eastAsia="Times New Roman" w:hAnsi="Times New Roman" w:cs="Times New Roman"/>
-      <w:sz w:val="24"/>
-      <w:szCs w:val="20"/>
-    </w:rPr>
-  </w:style>
-  <w:style w:type="paragraph" w:customStyle="1" w:styleId="2CAF8B661A444881A001971C462CC3437">
-    <w:name w:val="2CAF8B661A444881A001971C462CC3437"/>
-    <w:rsid w:val="004E2E79"/>
-    <w:pPr>
-      <w:spacing w:after="120" w:line="240" w:lineRule="auto"/>
-    </w:pPr>
-    <w:rPr>
-      <w:rFonts w:ascii="Times New Roman" w:eastAsia="Times New Roman" w:hAnsi="Times New Roman" w:cs="Times New Roman"/>
-      <w:sz w:val="24"/>
-      <w:szCs w:val="24"/>
-    </w:rPr>
-  </w:style>
-  <w:style w:type="paragraph" w:customStyle="1" w:styleId="90C438FFB4F54C97BD2329EF84FB3D2A3">
-    <w:name w:val="90C438FFB4F54C97BD2329EF84FB3D2A3"/>
-    <w:rsid w:val="004E2E79"/>
-    <w:pPr>
-      <w:spacing w:before="40" w:after="40" w:line="240" w:lineRule="auto"/>
-    </w:pPr>
-    <w:rPr>
-      <w:rFonts w:ascii="Times New Roman" w:eastAsia="Times New Roman" w:hAnsi="Times New Roman" w:cs="Times New Roman"/>
-      <w:sz w:val="24"/>
-      <w:szCs w:val="20"/>
-    </w:rPr>
-  </w:style>
-  <w:style w:type="paragraph" w:customStyle="1" w:styleId="DABD770CAE7545158C1FA0A23934C0D33">
-    <w:name w:val="DABD770CAE7545158C1FA0A23934C0D33"/>
-    <w:rsid w:val="004E2E79"/>
-    <w:pPr>
-      <w:spacing w:before="40" w:after="40" w:line="240" w:lineRule="auto"/>
-    </w:pPr>
-    <w:rPr>
-      <w:rFonts w:ascii="Times New Roman" w:eastAsia="Times New Roman" w:hAnsi="Times New Roman" w:cs="Times New Roman"/>
-      <w:sz w:val="24"/>
-      <w:szCs w:val="20"/>
-    </w:rPr>
-  </w:style>
-  <w:style w:type="paragraph" w:customStyle="1" w:styleId="1A024121D88C46E998D1D996726005C83">
-    <w:name w:val="1A024121D88C46E998D1D996726005C83"/>
-    <w:rsid w:val="004E2E79"/>
-    <w:pPr>
-      <w:spacing w:before="40" w:after="40" w:line="240" w:lineRule="auto"/>
-    </w:pPr>
-    <w:rPr>
-      <w:rFonts w:ascii="Times New Roman" w:eastAsia="Times New Roman" w:hAnsi="Times New Roman" w:cs="Times New Roman"/>
-      <w:sz w:val="24"/>
-      <w:szCs w:val="20"/>
-    </w:rPr>
-  </w:style>
-  <w:style w:type="paragraph" w:customStyle="1" w:styleId="98F324914AB045569FB94407DC5852473">
-    <w:name w:val="98F324914AB045569FB94407DC5852473"/>
-    <w:rsid w:val="004E2E79"/>
-    <w:pPr>
-      <w:spacing w:before="40" w:after="40" w:line="240" w:lineRule="auto"/>
-    </w:pPr>
-    <w:rPr>
-      <w:rFonts w:ascii="Times New Roman" w:eastAsia="Times New Roman" w:hAnsi="Times New Roman" w:cs="Times New Roman"/>
-      <w:sz w:val="24"/>
-      <w:szCs w:val="20"/>
-    </w:rPr>
-  </w:style>
-  <w:style w:type="paragraph" w:customStyle="1" w:styleId="2758C0A6B69C4C68BC8C8E9968CCC65F3">
-    <w:name w:val="2758C0A6B69C4C68BC8C8E9968CCC65F3"/>
-    <w:rsid w:val="004E2E79"/>
-    <w:pPr>
-      <w:spacing w:before="40" w:after="40" w:line="240" w:lineRule="auto"/>
-    </w:pPr>
-    <w:rPr>
-      <w:rFonts w:ascii="Times New Roman" w:eastAsia="Times New Roman" w:hAnsi="Times New Roman" w:cs="Times New Roman"/>
-      <w:sz w:val="24"/>
-      <w:szCs w:val="20"/>
-    </w:rPr>
-  </w:style>
-  <w:style w:type="paragraph" w:customStyle="1" w:styleId="81813845A99343428AAB1E49E2C1B98C">
-    <w:name w:val="81813845A99343428AAB1E49E2C1B98C"/>
-    <w:rsid w:val="004E2E79"/>
-  </w:style>
-  <w:style w:type="paragraph" w:customStyle="1" w:styleId="2CAF8B661A444881A001971C462CC3438">
-    <w:name w:val="2CAF8B661A444881A001971C462CC3438"/>
-    <w:rsid w:val="004E2E79"/>
-    <w:pPr>
-      <w:spacing w:after="120" w:line="240" w:lineRule="auto"/>
-    </w:pPr>
-    <w:rPr>
-      <w:rFonts w:ascii="Times New Roman" w:eastAsia="Times New Roman" w:hAnsi="Times New Roman" w:cs="Times New Roman"/>
-      <w:sz w:val="24"/>
-      <w:szCs w:val="24"/>
-    </w:rPr>
-  </w:style>
-  <w:style w:type="paragraph" w:customStyle="1" w:styleId="90C438FFB4F54C97BD2329EF84FB3D2A4">
-    <w:name w:val="90C438FFB4F54C97BD2329EF84FB3D2A4"/>
-    <w:rsid w:val="004E2E79"/>
-    <w:pPr>
-      <w:spacing w:before="40" w:after="40" w:line="240" w:lineRule="auto"/>
-    </w:pPr>
-    <w:rPr>
-      <w:rFonts w:ascii="Times New Roman" w:eastAsia="Times New Roman" w:hAnsi="Times New Roman" w:cs="Times New Roman"/>
-      <w:sz w:val="24"/>
-      <w:szCs w:val="20"/>
-    </w:rPr>
-  </w:style>
-  <w:style w:type="paragraph" w:customStyle="1" w:styleId="DABD770CAE7545158C1FA0A23934C0D34">
-    <w:name w:val="DABD770CAE7545158C1FA0A23934C0D34"/>
-    <w:rsid w:val="004E2E79"/>
-    <w:pPr>
-      <w:spacing w:before="40" w:after="40" w:line="240" w:lineRule="auto"/>
-    </w:pPr>
-    <w:rPr>
-      <w:rFonts w:ascii="Times New Roman" w:eastAsia="Times New Roman" w:hAnsi="Times New Roman" w:cs="Times New Roman"/>
-      <w:sz w:val="24"/>
-      <w:szCs w:val="20"/>
-    </w:rPr>
-  </w:style>
-  <w:style w:type="paragraph" w:customStyle="1" w:styleId="1A024121D88C46E998D1D996726005C84">
-    <w:name w:val="1A024121D88C46E998D1D996726005C84"/>
-    <w:rsid w:val="004E2E79"/>
-    <w:pPr>
-      <w:spacing w:before="40" w:after="40" w:line="240" w:lineRule="auto"/>
-    </w:pPr>
-    <w:rPr>
-      <w:rFonts w:ascii="Times New Roman" w:eastAsia="Times New Roman" w:hAnsi="Times New Roman" w:cs="Times New Roman"/>
-      <w:sz w:val="24"/>
-      <w:szCs w:val="20"/>
-    </w:rPr>
-  </w:style>
-  <w:style w:type="paragraph" w:customStyle="1" w:styleId="98F324914AB045569FB94407DC5852474">
-    <w:name w:val="98F324914AB045569FB94407DC5852474"/>
-    <w:rsid w:val="004E2E79"/>
-    <w:pPr>
-      <w:spacing w:before="40" w:after="40" w:line="240" w:lineRule="auto"/>
-    </w:pPr>
-    <w:rPr>
-      <w:rFonts w:ascii="Times New Roman" w:eastAsia="Times New Roman" w:hAnsi="Times New Roman" w:cs="Times New Roman"/>
-      <w:sz w:val="24"/>
-      <w:szCs w:val="20"/>
-    </w:rPr>
-  </w:style>
-  <w:style w:type="paragraph" w:customStyle="1" w:styleId="2758C0A6B69C4C68BC8C8E9968CCC65F4">
-    <w:name w:val="2758C0A6B69C4C68BC8C8E9968CCC65F4"/>
-    <w:rsid w:val="004E2E79"/>
-    <w:pPr>
-      <w:spacing w:before="40" w:after="40" w:line="240" w:lineRule="auto"/>
-    </w:pPr>
-    <w:rPr>
-      <w:rFonts w:ascii="Times New Roman" w:eastAsia="Times New Roman" w:hAnsi="Times New Roman" w:cs="Times New Roman"/>
-      <w:sz w:val="24"/>
-      <w:szCs w:val="20"/>
-    </w:rPr>
-  </w:style>
-  <w:style w:type="paragraph" w:customStyle="1" w:styleId="2CAF8B661A444881A001971C462CC3439">
-    <w:name w:val="2CAF8B661A444881A001971C462CC3439"/>
-    <w:rsid w:val="004E2E79"/>
-    <w:pPr>
-      <w:spacing w:after="120" w:line="240" w:lineRule="auto"/>
-    </w:pPr>
-    <w:rPr>
-      <w:rFonts w:ascii="Times New Roman" w:eastAsia="Times New Roman" w:hAnsi="Times New Roman" w:cs="Times New Roman"/>
-      <w:sz w:val="24"/>
-      <w:szCs w:val="24"/>
-    </w:rPr>
-  </w:style>
-  <w:style w:type="paragraph" w:customStyle="1" w:styleId="90C438FFB4F54C97BD2329EF84FB3D2A5">
-    <w:name w:val="90C438FFB4F54C97BD2329EF84FB3D2A5"/>
-    <w:rsid w:val="004E2E79"/>
-    <w:pPr>
-      <w:spacing w:before="40" w:after="40" w:line="240" w:lineRule="auto"/>
-    </w:pPr>
-    <w:rPr>
-      <w:rFonts w:ascii="Times New Roman" w:eastAsia="Times New Roman" w:hAnsi="Times New Roman" w:cs="Times New Roman"/>
-      <w:sz w:val="24"/>
-      <w:szCs w:val="20"/>
-    </w:rPr>
-  </w:style>
-  <w:style w:type="paragraph" w:customStyle="1" w:styleId="DABD770CAE7545158C1FA0A23934C0D35">
-    <w:name w:val="DABD770CAE7545158C1FA0A23934C0D35"/>
-    <w:rsid w:val="004E2E79"/>
-    <w:pPr>
-      <w:spacing w:before="40" w:after="40" w:line="240" w:lineRule="auto"/>
-    </w:pPr>
-    <w:rPr>
-      <w:rFonts w:ascii="Times New Roman" w:eastAsia="Times New Roman" w:hAnsi="Times New Roman" w:cs="Times New Roman"/>
-      <w:sz w:val="24"/>
-      <w:szCs w:val="20"/>
-    </w:rPr>
-  </w:style>
-  <w:style w:type="paragraph" w:customStyle="1" w:styleId="1A024121D88C46E998D1D996726005C85">
-    <w:name w:val="1A024121D88C46E998D1D996726005C85"/>
-    <w:rsid w:val="004E2E79"/>
-    <w:pPr>
-      <w:spacing w:before="40" w:after="40" w:line="240" w:lineRule="auto"/>
-    </w:pPr>
-    <w:rPr>
-      <w:rFonts w:ascii="Times New Roman" w:eastAsia="Times New Roman" w:hAnsi="Times New Roman" w:cs="Times New Roman"/>
-      <w:sz w:val="24"/>
-      <w:szCs w:val="20"/>
-    </w:rPr>
-  </w:style>
-  <w:style w:type="paragraph" w:customStyle="1" w:styleId="98F324914AB045569FB94407DC5852475">
-    <w:name w:val="98F324914AB045569FB94407DC5852475"/>
-    <w:rsid w:val="004E2E79"/>
-    <w:pPr>
-      <w:spacing w:before="40" w:after="40" w:line="240" w:lineRule="auto"/>
-    </w:pPr>
-    <w:rPr>
-      <w:rFonts w:ascii="Times New Roman" w:eastAsia="Times New Roman" w:hAnsi="Times New Roman" w:cs="Times New Roman"/>
-      <w:sz w:val="24"/>
-      <w:szCs w:val="20"/>
-    </w:rPr>
-  </w:style>
-  <w:style w:type="paragraph" w:customStyle="1" w:styleId="2758C0A6B69C4C68BC8C8E9968CCC65F5">
-    <w:name w:val="2758C0A6B69C4C68BC8C8E9968CCC65F5"/>
-    <w:rsid w:val="004E2E79"/>
-    <w:pPr>
-      <w:spacing w:before="40" w:after="40" w:line="240" w:lineRule="auto"/>
-    </w:pPr>
-    <w:rPr>
-      <w:rFonts w:ascii="Times New Roman" w:eastAsia="Times New Roman" w:hAnsi="Times New Roman" w:cs="Times New Roman"/>
-      <w:sz w:val="24"/>
-      <w:szCs w:val="20"/>
-    </w:rPr>
-  </w:style>
-  <w:style w:type="paragraph" w:customStyle="1" w:styleId="2CAF8B661A444881A001971C462CC34310">
-    <w:name w:val="2CAF8B661A444881A001971C462CC34310"/>
-    <w:rsid w:val="004E2E79"/>
-    <w:pPr>
-      <w:spacing w:after="120" w:line="240" w:lineRule="auto"/>
-    </w:pPr>
-    <w:rPr>
-      <w:rFonts w:ascii="Times New Roman" w:eastAsia="Times New Roman" w:hAnsi="Times New Roman" w:cs="Times New Roman"/>
-      <w:sz w:val="24"/>
-      <w:szCs w:val="24"/>
-    </w:rPr>
-  </w:style>
-  <w:style w:type="paragraph" w:customStyle="1" w:styleId="E4BDF4B99CB34CF39D2473999FDED3B4">
-    <w:name w:val="E4BDF4B99CB34CF39D2473999FDED3B4"/>
-    <w:rsid w:val="004E2E79"/>
-    <w:pPr>
-      <w:spacing w:before="40" w:after="40" w:line="240" w:lineRule="auto"/>
-    </w:pPr>
-    <w:rPr>
-      <w:rFonts w:ascii="Times New Roman" w:eastAsia="Times New Roman" w:hAnsi="Times New Roman" w:cs="Times New Roman"/>
-      <w:sz w:val="24"/>
-      <w:szCs w:val="20"/>
-    </w:rPr>
-  </w:style>
-  <w:style w:type="paragraph" w:customStyle="1" w:styleId="27DB7009EF744E1A9AEB227E77E6FDEF">
-    <w:name w:val="27DB7009EF744E1A9AEB227E77E6FDEF"/>
-    <w:rsid w:val="004E2E79"/>
-    <w:pPr>
-      <w:spacing w:before="40" w:after="40" w:line="240" w:lineRule="auto"/>
-    </w:pPr>
-    <w:rPr>
-      <w:rFonts w:ascii="Times New Roman" w:eastAsia="Times New Roman" w:hAnsi="Times New Roman" w:cs="Times New Roman"/>
-      <w:sz w:val="24"/>
-      <w:szCs w:val="20"/>
-    </w:rPr>
-  </w:style>
-  <w:style w:type="paragraph" w:customStyle="1" w:styleId="FCB8CF91EE344237B868217E91257779">
-    <w:name w:val="FCB8CF91EE344237B868217E91257779"/>
-    <w:rsid w:val="004E2E79"/>
-    <w:pPr>
-      <w:spacing w:before="40" w:after="40" w:line="240" w:lineRule="auto"/>
-    </w:pPr>
-    <w:rPr>
-      <w:rFonts w:ascii="Times New Roman" w:eastAsia="Times New Roman" w:hAnsi="Times New Roman" w:cs="Times New Roman"/>
-      <w:sz w:val="24"/>
-      <w:szCs w:val="20"/>
-    </w:rPr>
-  </w:style>
-  <w:style w:type="paragraph" w:customStyle="1" w:styleId="90C438FFB4F54C97BD2329EF84FB3D2A6">
-    <w:name w:val="90C438FFB4F54C97BD2329EF84FB3D2A6"/>
-    <w:rsid w:val="004E2E79"/>
-    <w:pPr>
-      <w:spacing w:before="40" w:after="40" w:line="240" w:lineRule="auto"/>
-    </w:pPr>
-    <w:rPr>
-      <w:rFonts w:ascii="Times New Roman" w:eastAsia="Times New Roman" w:hAnsi="Times New Roman" w:cs="Times New Roman"/>
-      <w:sz w:val="24"/>
-      <w:szCs w:val="20"/>
-    </w:rPr>
-  </w:style>
-  <w:style w:type="paragraph" w:customStyle="1" w:styleId="DABD770CAE7545158C1FA0A23934C0D36">
-    <w:name w:val="DABD770CAE7545158C1FA0A23934C0D36"/>
-    <w:rsid w:val="004E2E79"/>
-    <w:pPr>
-      <w:spacing w:before="40" w:after="40" w:line="240" w:lineRule="auto"/>
-    </w:pPr>
-    <w:rPr>
-      <w:rFonts w:ascii="Times New Roman" w:eastAsia="Times New Roman" w:hAnsi="Times New Roman" w:cs="Times New Roman"/>
-      <w:sz w:val="24"/>
-      <w:szCs w:val="20"/>
-    </w:rPr>
-  </w:style>
-  <w:style w:type="paragraph" w:customStyle="1" w:styleId="1A024121D88C46E998D1D996726005C86">
-    <w:name w:val="1A024121D88C46E998D1D996726005C86"/>
-    <w:rsid w:val="004E2E79"/>
-    <w:pPr>
-      <w:spacing w:before="40" w:after="40" w:line="240" w:lineRule="auto"/>
-    </w:pPr>
-    <w:rPr>
-      <w:rFonts w:ascii="Times New Roman" w:eastAsia="Times New Roman" w:hAnsi="Times New Roman" w:cs="Times New Roman"/>
-      <w:sz w:val="24"/>
-      <w:szCs w:val="20"/>
-    </w:rPr>
-  </w:style>
-  <w:style w:type="paragraph" w:customStyle="1" w:styleId="98F324914AB045569FB94407DC5852476">
-    <w:name w:val="98F324914AB045569FB94407DC5852476"/>
-    <w:rsid w:val="004E2E79"/>
-    <w:pPr>
-      <w:spacing w:before="40" w:after="40" w:line="240" w:lineRule="auto"/>
-    </w:pPr>
-    <w:rPr>
-      <w:rFonts w:ascii="Times New Roman" w:eastAsia="Times New Roman" w:hAnsi="Times New Roman" w:cs="Times New Roman"/>
-      <w:sz w:val="24"/>
-      <w:szCs w:val="20"/>
-    </w:rPr>
-  </w:style>
-  <w:style w:type="paragraph" w:customStyle="1" w:styleId="2758C0A6B69C4C68BC8C8E9968CCC65F6">
-    <w:name w:val="2758C0A6B69C4C68BC8C8E9968CCC65F6"/>
-    <w:rsid w:val="004E2E79"/>
-    <w:pPr>
-      <w:spacing w:before="40" w:after="40" w:line="240" w:lineRule="auto"/>
-    </w:pPr>
-    <w:rPr>
-      <w:rFonts w:ascii="Times New Roman" w:eastAsia="Times New Roman" w:hAnsi="Times New Roman" w:cs="Times New Roman"/>
-      <w:sz w:val="24"/>
-      <w:szCs w:val="20"/>
-    </w:rPr>
-  </w:style>
-  <w:style w:type="paragraph" w:customStyle="1" w:styleId="7540E5E4061643EEA665ABE7860D57A8">
-    <w:name w:val="7540E5E4061643EEA665ABE7860D57A8"/>
-    <w:rsid w:val="004E2E79"/>
-    <w:pPr>
-      <w:spacing w:before="40" w:after="40" w:line="240" w:lineRule="auto"/>
-    </w:pPr>
-    <w:rPr>
-      <w:rFonts w:ascii="Times New Roman" w:eastAsia="Times New Roman" w:hAnsi="Times New Roman" w:cs="Times New Roman"/>
-      <w:sz w:val="24"/>
-      <w:szCs w:val="20"/>
-    </w:rPr>
-  </w:style>
-  <w:style w:type="paragraph" w:customStyle="1" w:styleId="BD8D817EEA2348A8B40DAC08E62629B7">
-    <w:name w:val="BD8D817EEA2348A8B40DAC08E62629B7"/>
-    <w:rsid w:val="004E2E79"/>
-    <w:pPr>
-      <w:spacing w:before="40" w:after="40" w:line="240" w:lineRule="auto"/>
-    </w:pPr>
-    <w:rPr>
-      <w:rFonts w:ascii="Times New Roman" w:eastAsia="Times New Roman" w:hAnsi="Times New Roman" w:cs="Times New Roman"/>
-      <w:sz w:val="24"/>
-      <w:szCs w:val="20"/>
-    </w:rPr>
-  </w:style>
-  <w:style w:type="paragraph" w:customStyle="1" w:styleId="276D18CAAD334447B0BAEFF35B086C64">
-    <w:name w:val="276D18CAAD334447B0BAEFF35B086C64"/>
-    <w:rsid w:val="004E2E79"/>
-    <w:pPr>
-      <w:spacing w:before="40" w:after="40" w:line="240" w:lineRule="auto"/>
-    </w:pPr>
-    <w:rPr>
-      <w:rFonts w:ascii="Times New Roman" w:eastAsia="Times New Roman" w:hAnsi="Times New Roman" w:cs="Times New Roman"/>
-      <w:sz w:val="24"/>
-      <w:szCs w:val="20"/>
-    </w:rPr>
-  </w:style>
-  <w:style w:type="paragraph" w:customStyle="1" w:styleId="EF378C158C644386842577CA818626B0">
-    <w:name w:val="EF378C158C644386842577CA818626B0"/>
-    <w:rsid w:val="004E2E79"/>
-    <w:pPr>
-      <w:spacing w:before="40" w:after="40" w:line="240" w:lineRule="auto"/>
-    </w:pPr>
-    <w:rPr>
-      <w:rFonts w:ascii="Times New Roman" w:eastAsia="Times New Roman" w:hAnsi="Times New Roman" w:cs="Times New Roman"/>
-      <w:sz w:val="24"/>
-      <w:szCs w:val="20"/>
-    </w:rPr>
-  </w:style>
-  <w:style w:type="paragraph" w:customStyle="1" w:styleId="700CEBAEB99A44A4B1C816229B56C119">
-    <w:name w:val="700CEBAEB99A44A4B1C816229B56C119"/>
-    <w:rsid w:val="004E2E79"/>
-    <w:pPr>
-      <w:spacing w:before="40" w:after="40" w:line="240" w:lineRule="auto"/>
-    </w:pPr>
-    <w:rPr>
-      <w:rFonts w:ascii="Times New Roman" w:eastAsia="Times New Roman" w:hAnsi="Times New Roman" w:cs="Times New Roman"/>
-      <w:sz w:val="24"/>
-      <w:szCs w:val="20"/>
-    </w:rPr>
-  </w:style>
-  <w:style w:type="paragraph" w:customStyle="1" w:styleId="1A446072B6B74F538C67D4C16FCEF87E">
-    <w:name w:val="1A446072B6B74F538C67D4C16FCEF87E"/>
-    <w:rsid w:val="004E2E79"/>
-  </w:style>
-  <w:style w:type="paragraph" w:customStyle="1" w:styleId="2CAF8B661A444881A001971C462CC34311">
-    <w:name w:val="2CAF8B661A444881A001971C462CC34311"/>
-    <w:rsid w:val="004E2E79"/>
-    <w:pPr>
-      <w:spacing w:after="120" w:line="240" w:lineRule="auto"/>
-    </w:pPr>
-    <w:rPr>
-      <w:rFonts w:ascii="Times New Roman" w:eastAsia="Times New Roman" w:hAnsi="Times New Roman" w:cs="Times New Roman"/>
-      <w:sz w:val="24"/>
-      <w:szCs w:val="24"/>
-    </w:rPr>
-  </w:style>
-  <w:style w:type="paragraph" w:customStyle="1" w:styleId="C696749CBD7D432B8F903C047E9641DA">
-    <w:name w:val="C696749CBD7D432B8F903C047E9641DA"/>
-    <w:rsid w:val="004E2E79"/>
-    <w:pPr>
-      <w:spacing w:after="120" w:line="240" w:lineRule="auto"/>
-    </w:pPr>
-    <w:rPr>
-      <w:rFonts w:ascii="Times New Roman" w:eastAsia="Times New Roman" w:hAnsi="Times New Roman" w:cs="Times New Roman"/>
-      <w:sz w:val="24"/>
-      <w:szCs w:val="24"/>
-    </w:rPr>
-  </w:style>
-  <w:style w:type="paragraph" w:customStyle="1" w:styleId="E4BDF4B99CB34CF39D2473999FDED3B41">
-    <w:name w:val="E4BDF4B99CB34CF39D2473999FDED3B41"/>
-    <w:rsid w:val="004E2E79"/>
-    <w:pPr>
-      <w:spacing w:before="40" w:after="40" w:line="240" w:lineRule="auto"/>
-    </w:pPr>
-    <w:rPr>
-      <w:rFonts w:ascii="Times New Roman" w:eastAsia="Times New Roman" w:hAnsi="Times New Roman" w:cs="Times New Roman"/>
-      <w:sz w:val="24"/>
-      <w:szCs w:val="20"/>
-    </w:rPr>
-  </w:style>
-  <w:style w:type="paragraph" w:customStyle="1" w:styleId="27DB7009EF744E1A9AEB227E77E6FDEF1">
-    <w:name w:val="27DB7009EF744E1A9AEB227E77E6FDEF1"/>
-    <w:rsid w:val="004E2E79"/>
-    <w:pPr>
-      <w:spacing w:before="40" w:after="40" w:line="240" w:lineRule="auto"/>
-    </w:pPr>
-    <w:rPr>
-      <w:rFonts w:ascii="Times New Roman" w:eastAsia="Times New Roman" w:hAnsi="Times New Roman" w:cs="Times New Roman"/>
-      <w:sz w:val="24"/>
-      <w:szCs w:val="20"/>
-    </w:rPr>
-  </w:style>
-  <w:style w:type="paragraph" w:customStyle="1" w:styleId="FCB8CF91EE344237B868217E912577791">
-    <w:name w:val="FCB8CF91EE344237B868217E912577791"/>
-    <w:rsid w:val="004E2E79"/>
-    <w:pPr>
-      <w:spacing w:before="40" w:after="40" w:line="240" w:lineRule="auto"/>
-    </w:pPr>
-    <w:rPr>
-      <w:rFonts w:ascii="Times New Roman" w:eastAsia="Times New Roman" w:hAnsi="Times New Roman" w:cs="Times New Roman"/>
-      <w:sz w:val="24"/>
-      <w:szCs w:val="20"/>
-    </w:rPr>
-  </w:style>
-  <w:style w:type="paragraph" w:customStyle="1" w:styleId="90C438FFB4F54C97BD2329EF84FB3D2A7">
-    <w:name w:val="90C438FFB4F54C97BD2329EF84FB3D2A7"/>
-    <w:rsid w:val="004E2E79"/>
-    <w:pPr>
-      <w:spacing w:before="40" w:after="40" w:line="240" w:lineRule="auto"/>
-    </w:pPr>
-    <w:rPr>
-      <w:rFonts w:ascii="Times New Roman" w:eastAsia="Times New Roman" w:hAnsi="Times New Roman" w:cs="Times New Roman"/>
-      <w:sz w:val="24"/>
-      <w:szCs w:val="20"/>
-    </w:rPr>
-  </w:style>
-  <w:style w:type="paragraph" w:customStyle="1" w:styleId="DABD770CAE7545158C1FA0A23934C0D37">
-    <w:name w:val="DABD770CAE7545158C1FA0A23934C0D37"/>
-    <w:rsid w:val="004E2E79"/>
-    <w:pPr>
-      <w:spacing w:before="40" w:after="40" w:line="240" w:lineRule="auto"/>
-    </w:pPr>
-    <w:rPr>
-      <w:rFonts w:ascii="Times New Roman" w:eastAsia="Times New Roman" w:hAnsi="Times New Roman" w:cs="Times New Roman"/>
-      <w:sz w:val="24"/>
-      <w:szCs w:val="20"/>
-    </w:rPr>
-  </w:style>
-  <w:style w:type="paragraph" w:customStyle="1" w:styleId="1A024121D88C46E998D1D996726005C87">
-    <w:name w:val="1A024121D88C46E998D1D996726005C87"/>
-    <w:rsid w:val="004E2E79"/>
-    <w:pPr>
-      <w:spacing w:before="40" w:after="40" w:line="240" w:lineRule="auto"/>
-    </w:pPr>
-    <w:rPr>
-      <w:rFonts w:ascii="Times New Roman" w:eastAsia="Times New Roman" w:hAnsi="Times New Roman" w:cs="Times New Roman"/>
-      <w:sz w:val="24"/>
-      <w:szCs w:val="20"/>
-    </w:rPr>
-  </w:style>
-  <w:style w:type="paragraph" w:customStyle="1" w:styleId="98F324914AB045569FB94407DC5852477">
-    <w:name w:val="98F324914AB045569FB94407DC5852477"/>
-    <w:rsid w:val="004E2E79"/>
-    <w:pPr>
-      <w:spacing w:before="40" w:after="40" w:line="240" w:lineRule="auto"/>
-    </w:pPr>
-    <w:rPr>
-      <w:rFonts w:ascii="Times New Roman" w:eastAsia="Times New Roman" w:hAnsi="Times New Roman" w:cs="Times New Roman"/>
-      <w:sz w:val="24"/>
-      <w:szCs w:val="20"/>
-    </w:rPr>
-  </w:style>
-  <w:style w:type="paragraph" w:customStyle="1" w:styleId="2758C0A6B69C4C68BC8C8E9968CCC65F7">
-    <w:name w:val="2758C0A6B69C4C68BC8C8E9968CCC65F7"/>
-    <w:rsid w:val="004E2E79"/>
-    <w:pPr>
-      <w:spacing w:before="40" w:after="40" w:line="240" w:lineRule="auto"/>
-    </w:pPr>
-    <w:rPr>
-      <w:rFonts w:ascii="Times New Roman" w:eastAsia="Times New Roman" w:hAnsi="Times New Roman" w:cs="Times New Roman"/>
-      <w:sz w:val="24"/>
-      <w:szCs w:val="20"/>
-    </w:rPr>
-  </w:style>
-  <w:style w:type="paragraph" w:customStyle="1" w:styleId="7540E5E4061643EEA665ABE7860D57A81">
-    <w:name w:val="7540E5E4061643EEA665ABE7860D57A81"/>
-    <w:rsid w:val="004E2E79"/>
-    <w:pPr>
-      <w:spacing w:before="40" w:after="40" w:line="240" w:lineRule="auto"/>
-    </w:pPr>
-    <w:rPr>
-      <w:rFonts w:ascii="Times New Roman" w:eastAsia="Times New Roman" w:hAnsi="Times New Roman" w:cs="Times New Roman"/>
-      <w:sz w:val="24"/>
-      <w:szCs w:val="20"/>
-    </w:rPr>
-  </w:style>
-  <w:style w:type="paragraph" w:customStyle="1" w:styleId="BD8D817EEA2348A8B40DAC08E62629B71">
-    <w:name w:val="BD8D817EEA2348A8B40DAC08E62629B71"/>
-    <w:rsid w:val="004E2E79"/>
-    <w:pPr>
-      <w:spacing w:before="40" w:after="40" w:line="240" w:lineRule="auto"/>
-    </w:pPr>
-    <w:rPr>
-      <w:rFonts w:ascii="Times New Roman" w:eastAsia="Times New Roman" w:hAnsi="Times New Roman" w:cs="Times New Roman"/>
-      <w:sz w:val="24"/>
-      <w:szCs w:val="20"/>
-    </w:rPr>
-  </w:style>
-  <w:style w:type="paragraph" w:customStyle="1" w:styleId="276D18CAAD334447B0BAEFF35B086C641">
-    <w:name w:val="276D18CAAD334447B0BAEFF35B086C641"/>
-    <w:rsid w:val="004E2E79"/>
-    <w:pPr>
-      <w:spacing w:before="40" w:after="40" w:line="240" w:lineRule="auto"/>
-    </w:pPr>
-    <w:rPr>
-      <w:rFonts w:ascii="Times New Roman" w:eastAsia="Times New Roman" w:hAnsi="Times New Roman" w:cs="Times New Roman"/>
-      <w:sz w:val="24"/>
-      <w:szCs w:val="20"/>
-    </w:rPr>
-  </w:style>
-  <w:style w:type="paragraph" w:customStyle="1" w:styleId="EF378C158C644386842577CA818626B01">
-    <w:name w:val="EF378C158C644386842577CA818626B01"/>
-    <w:rsid w:val="004E2E79"/>
-    <w:pPr>
-      <w:spacing w:before="40" w:after="40" w:line="240" w:lineRule="auto"/>
-    </w:pPr>
-    <w:rPr>
-      <w:rFonts w:ascii="Times New Roman" w:eastAsia="Times New Roman" w:hAnsi="Times New Roman" w:cs="Times New Roman"/>
-      <w:sz w:val="24"/>
-      <w:szCs w:val="20"/>
-    </w:rPr>
-  </w:style>
-  <w:style w:type="paragraph" w:customStyle="1" w:styleId="700CEBAEB99A44A4B1C816229B56C1191">
-    <w:name w:val="700CEBAEB99A44A4B1C816229B56C1191"/>
-    <w:rsid w:val="004E2E79"/>
-    <w:pPr>
-      <w:spacing w:before="40" w:after="40" w:line="240" w:lineRule="auto"/>
-    </w:pPr>
-    <w:rPr>
-      <w:rFonts w:ascii="Times New Roman" w:eastAsia="Times New Roman" w:hAnsi="Times New Roman" w:cs="Times New Roman"/>
-      <w:sz w:val="24"/>
-      <w:szCs w:val="20"/>
-    </w:rPr>
-  </w:style>
-  <w:style w:type="paragraph" w:customStyle="1" w:styleId="2CAF8B661A444881A001971C462CC34312">
-    <w:name w:val="2CAF8B661A444881A001971C462CC34312"/>
-    <w:rsid w:val="004E2E79"/>
-    <w:pPr>
-      <w:spacing w:after="120" w:line="240" w:lineRule="auto"/>
-    </w:pPr>
-    <w:rPr>
-      <w:rFonts w:ascii="Times New Roman" w:eastAsia="Times New Roman" w:hAnsi="Times New Roman" w:cs="Times New Roman"/>
-      <w:sz w:val="24"/>
-      <w:szCs w:val="24"/>
-    </w:rPr>
-  </w:style>
-  <w:style w:type="paragraph" w:customStyle="1" w:styleId="C696749CBD7D432B8F903C047E9641DA1">
-    <w:name w:val="C696749CBD7D432B8F903C047E9641DA1"/>
-    <w:rsid w:val="004E2E79"/>
-    <w:pPr>
-      <w:spacing w:after="120" w:line="240" w:lineRule="auto"/>
-    </w:pPr>
-    <w:rPr>
-      <w:rFonts w:ascii="Times New Roman" w:eastAsia="Times New Roman" w:hAnsi="Times New Roman" w:cs="Times New Roman"/>
-      <w:sz w:val="24"/>
-      <w:szCs w:val="24"/>
-    </w:rPr>
-  </w:style>
-  <w:style w:type="paragraph" w:customStyle="1" w:styleId="E4BDF4B99CB34CF39D2473999FDED3B42">
-    <w:name w:val="E4BDF4B99CB34CF39D2473999FDED3B42"/>
-    <w:rsid w:val="004E2E79"/>
-    <w:pPr>
-      <w:spacing w:before="40" w:after="40" w:line="240" w:lineRule="auto"/>
-    </w:pPr>
-    <w:rPr>
-      <w:rFonts w:ascii="Times New Roman" w:eastAsia="Times New Roman" w:hAnsi="Times New Roman" w:cs="Times New Roman"/>
-      <w:sz w:val="24"/>
-      <w:szCs w:val="20"/>
-    </w:rPr>
-  </w:style>
-  <w:style w:type="paragraph" w:customStyle="1" w:styleId="27DB7009EF744E1A9AEB227E77E6FDEF2">
-    <w:name w:val="27DB7009EF744E1A9AEB227E77E6FDEF2"/>
-    <w:rsid w:val="004E2E79"/>
-    <w:pPr>
-      <w:spacing w:before="40" w:after="40" w:line="240" w:lineRule="auto"/>
-    </w:pPr>
-    <w:rPr>
-      <w:rFonts w:ascii="Times New Roman" w:eastAsia="Times New Roman" w:hAnsi="Times New Roman" w:cs="Times New Roman"/>
-      <w:sz w:val="24"/>
-      <w:szCs w:val="20"/>
-    </w:rPr>
-  </w:style>
-  <w:style w:type="paragraph" w:customStyle="1" w:styleId="FCB8CF91EE344237B868217E912577792">
-    <w:name w:val="FCB8CF91EE344237B868217E912577792"/>
-    <w:rsid w:val="004E2E79"/>
-    <w:pPr>
-      <w:spacing w:before="40" w:after="40" w:line="240" w:lineRule="auto"/>
-    </w:pPr>
-    <w:rPr>
-      <w:rFonts w:ascii="Times New Roman" w:eastAsia="Times New Roman" w:hAnsi="Times New Roman" w:cs="Times New Roman"/>
-      <w:sz w:val="24"/>
-      <w:szCs w:val="20"/>
-    </w:rPr>
-  </w:style>
-  <w:style w:type="paragraph" w:customStyle="1" w:styleId="90C438FFB4F54C97BD2329EF84FB3D2A8">
-    <w:name w:val="90C438FFB4F54C97BD2329EF84FB3D2A8"/>
-    <w:rsid w:val="004E2E79"/>
-    <w:pPr>
-      <w:spacing w:before="40" w:after="40" w:line="240" w:lineRule="auto"/>
-    </w:pPr>
-    <w:rPr>
-      <w:rFonts w:ascii="Times New Roman" w:eastAsia="Times New Roman" w:hAnsi="Times New Roman" w:cs="Times New Roman"/>
-      <w:sz w:val="24"/>
-      <w:szCs w:val="20"/>
-    </w:rPr>
-  </w:style>
-  <w:style w:type="paragraph" w:customStyle="1" w:styleId="DABD770CAE7545158C1FA0A23934C0D38">
-    <w:name w:val="DABD770CAE7545158C1FA0A23934C0D38"/>
-    <w:rsid w:val="004E2E79"/>
-    <w:pPr>
-      <w:spacing w:before="40" w:after="40" w:line="240" w:lineRule="auto"/>
-    </w:pPr>
-    <w:rPr>
-      <w:rFonts w:ascii="Times New Roman" w:eastAsia="Times New Roman" w:hAnsi="Times New Roman" w:cs="Times New Roman"/>
-      <w:sz w:val="24"/>
-      <w:szCs w:val="20"/>
-    </w:rPr>
-  </w:style>
-  <w:style w:type="paragraph" w:customStyle="1" w:styleId="1A024121D88C46E998D1D996726005C88">
-    <w:name w:val="1A024121D88C46E998D1D996726005C88"/>
-    <w:rsid w:val="004E2E79"/>
-    <w:pPr>
-      <w:spacing w:before="40" w:after="40" w:line="240" w:lineRule="auto"/>
-    </w:pPr>
-    <w:rPr>
-      <w:rFonts w:ascii="Times New Roman" w:eastAsia="Times New Roman" w:hAnsi="Times New Roman" w:cs="Times New Roman"/>
-      <w:sz w:val="24"/>
-      <w:szCs w:val="20"/>
-    </w:rPr>
-  </w:style>
-  <w:style w:type="paragraph" w:customStyle="1" w:styleId="98F324914AB045569FB94407DC5852478">
-    <w:name w:val="98F324914AB045569FB94407DC5852478"/>
-    <w:rsid w:val="004E2E79"/>
-    <w:pPr>
-      <w:spacing w:before="40" w:after="40" w:line="240" w:lineRule="auto"/>
-    </w:pPr>
-    <w:rPr>
-      <w:rFonts w:ascii="Times New Roman" w:eastAsia="Times New Roman" w:hAnsi="Times New Roman" w:cs="Times New Roman"/>
-      <w:sz w:val="24"/>
-      <w:szCs w:val="20"/>
-    </w:rPr>
-  </w:style>
-  <w:style w:type="paragraph" w:customStyle="1" w:styleId="2758C0A6B69C4C68BC8C8E9968CCC65F8">
-    <w:name w:val="2758C0A6B69C4C68BC8C8E9968CCC65F8"/>
-    <w:rsid w:val="004E2E79"/>
-    <w:pPr>
-      <w:spacing w:before="40" w:after="40" w:line="240" w:lineRule="auto"/>
-    </w:pPr>
-    <w:rPr>
-      <w:rFonts w:ascii="Times New Roman" w:eastAsia="Times New Roman" w:hAnsi="Times New Roman" w:cs="Times New Roman"/>
-      <w:sz w:val="24"/>
-      <w:szCs w:val="20"/>
-    </w:rPr>
-  </w:style>
-  <w:style w:type="paragraph" w:customStyle="1" w:styleId="7540E5E4061643EEA665ABE7860D57A82">
-    <w:name w:val="7540E5E4061643EEA665ABE7860D57A82"/>
-    <w:rsid w:val="004E2E79"/>
-    <w:pPr>
-      <w:spacing w:before="40" w:after="40" w:line="240" w:lineRule="auto"/>
-    </w:pPr>
-    <w:rPr>
-      <w:rFonts w:ascii="Times New Roman" w:eastAsia="Times New Roman" w:hAnsi="Times New Roman" w:cs="Times New Roman"/>
-      <w:sz w:val="24"/>
-      <w:szCs w:val="20"/>
-    </w:rPr>
-  </w:style>
-  <w:style w:type="paragraph" w:customStyle="1" w:styleId="BD8D817EEA2348A8B40DAC08E62629B72">
-    <w:name w:val="BD8D817EEA2348A8B40DAC08E62629B72"/>
-    <w:rsid w:val="004E2E79"/>
-    <w:pPr>
-      <w:spacing w:before="40" w:after="40" w:line="240" w:lineRule="auto"/>
-    </w:pPr>
-    <w:rPr>
-      <w:rFonts w:ascii="Times New Roman" w:eastAsia="Times New Roman" w:hAnsi="Times New Roman" w:cs="Times New Roman"/>
-      <w:sz w:val="24"/>
-      <w:szCs w:val="20"/>
-    </w:rPr>
-  </w:style>
-  <w:style w:type="paragraph" w:customStyle="1" w:styleId="276D18CAAD334447B0BAEFF35B086C642">
-    <w:name w:val="276D18CAAD334447B0BAEFF35B086C642"/>
-    <w:rsid w:val="004E2E79"/>
-    <w:pPr>
-      <w:spacing w:before="40" w:after="40" w:line="240" w:lineRule="auto"/>
-    </w:pPr>
-    <w:rPr>
-      <w:rFonts w:ascii="Times New Roman" w:eastAsia="Times New Roman" w:hAnsi="Times New Roman" w:cs="Times New Roman"/>
-      <w:sz w:val="24"/>
-      <w:szCs w:val="20"/>
-    </w:rPr>
-  </w:style>
-  <w:style w:type="paragraph" w:customStyle="1" w:styleId="EF378C158C644386842577CA818626B02">
-    <w:name w:val="EF378C158C644386842577CA818626B02"/>
-    <w:rsid w:val="004E2E79"/>
-    <w:pPr>
-      <w:spacing w:before="40" w:after="40" w:line="240" w:lineRule="auto"/>
-    </w:pPr>
-    <w:rPr>
-      <w:rFonts w:ascii="Times New Roman" w:eastAsia="Times New Roman" w:hAnsi="Times New Roman" w:cs="Times New Roman"/>
-      <w:sz w:val="24"/>
-      <w:szCs w:val="20"/>
-    </w:rPr>
-  </w:style>
-  <w:style w:type="paragraph" w:customStyle="1" w:styleId="700CEBAEB99A44A4B1C816229B56C1192">
-    <w:name w:val="700CEBAEB99A44A4B1C816229B56C1192"/>
-    <w:rsid w:val="004E2E79"/>
-    <w:pPr>
-      <w:spacing w:before="40" w:after="40" w:line="240" w:lineRule="auto"/>
-    </w:pPr>
-    <w:rPr>
-      <w:rFonts w:ascii="Times New Roman" w:eastAsia="Times New Roman" w:hAnsi="Times New Roman" w:cs="Times New Roman"/>
-      <w:sz w:val="24"/>
-      <w:szCs w:val="20"/>
-    </w:rPr>
-  </w:style>
-  <w:style w:type="paragraph" w:customStyle="1" w:styleId="2CAF8B661A444881A001971C462CC34313">
-    <w:name w:val="2CAF8B661A444881A001971C462CC34313"/>
-    <w:rsid w:val="004E2E79"/>
-    <w:pPr>
-      <w:spacing w:after="120" w:line="240" w:lineRule="auto"/>
-    </w:pPr>
-    <w:rPr>
-      <w:rFonts w:ascii="Times New Roman" w:eastAsia="Times New Roman" w:hAnsi="Times New Roman" w:cs="Times New Roman"/>
-      <w:sz w:val="24"/>
-      <w:szCs w:val="24"/>
-    </w:rPr>
-  </w:style>
-  <w:style w:type="paragraph" w:customStyle="1" w:styleId="C696749CBD7D432B8F903C047E9641DA2">
-    <w:name w:val="C696749CBD7D432B8F903C047E9641DA2"/>
-    <w:rsid w:val="004E2E79"/>
-    <w:pPr>
-      <w:spacing w:after="120" w:line="240" w:lineRule="auto"/>
-    </w:pPr>
-    <w:rPr>
-      <w:rFonts w:ascii="Times New Roman" w:eastAsia="Times New Roman" w:hAnsi="Times New Roman" w:cs="Times New Roman"/>
-      <w:sz w:val="24"/>
-      <w:szCs w:val="24"/>
-    </w:rPr>
-  </w:style>
-  <w:style w:type="paragraph" w:customStyle="1" w:styleId="E4BDF4B99CB34CF39D2473999FDED3B43">
-    <w:name w:val="E4BDF4B99CB34CF39D2473999FDED3B43"/>
-    <w:rsid w:val="004E2E79"/>
-    <w:pPr>
-      <w:spacing w:before="40" w:after="40" w:line="240" w:lineRule="auto"/>
-    </w:pPr>
-    <w:rPr>
-      <w:rFonts w:ascii="Times New Roman" w:eastAsia="Times New Roman" w:hAnsi="Times New Roman" w:cs="Times New Roman"/>
-      <w:sz w:val="24"/>
-      <w:szCs w:val="20"/>
-    </w:rPr>
-  </w:style>
-  <w:style w:type="paragraph" w:customStyle="1" w:styleId="27DB7009EF744E1A9AEB227E77E6FDEF3">
-    <w:name w:val="27DB7009EF744E1A9AEB227E77E6FDEF3"/>
-    <w:rsid w:val="004E2E79"/>
-    <w:pPr>
-      <w:spacing w:before="40" w:after="40" w:line="240" w:lineRule="auto"/>
-    </w:pPr>
-    <w:rPr>
-      <w:rFonts w:ascii="Times New Roman" w:eastAsia="Times New Roman" w:hAnsi="Times New Roman" w:cs="Times New Roman"/>
-      <w:sz w:val="24"/>
-      <w:szCs w:val="20"/>
-    </w:rPr>
-  </w:style>
-  <w:style w:type="paragraph" w:customStyle="1" w:styleId="FCB8CF91EE344237B868217E912577793">
-    <w:name w:val="FCB8CF91EE344237B868217E912577793"/>
-    <w:rsid w:val="004E2E79"/>
-    <w:pPr>
-      <w:spacing w:before="40" w:after="40" w:line="240" w:lineRule="auto"/>
-    </w:pPr>
-    <w:rPr>
-      <w:rFonts w:ascii="Times New Roman" w:eastAsia="Times New Roman" w:hAnsi="Times New Roman" w:cs="Times New Roman"/>
-      <w:sz w:val="24"/>
-      <w:szCs w:val="20"/>
-    </w:rPr>
-  </w:style>
-  <w:style w:type="paragraph" w:customStyle="1" w:styleId="90C438FFB4F54C97BD2329EF84FB3D2A9">
-    <w:name w:val="90C438FFB4F54C97BD2329EF84FB3D2A9"/>
-    <w:rsid w:val="004E2E79"/>
-    <w:pPr>
-      <w:spacing w:before="40" w:after="40" w:line="240" w:lineRule="auto"/>
-    </w:pPr>
-    <w:rPr>
-      <w:rFonts w:ascii="Times New Roman" w:eastAsia="Times New Roman" w:hAnsi="Times New Roman" w:cs="Times New Roman"/>
-      <w:sz w:val="24"/>
-      <w:szCs w:val="20"/>
-    </w:rPr>
-  </w:style>
-  <w:style w:type="paragraph" w:customStyle="1" w:styleId="DABD770CAE7545158C1FA0A23934C0D39">
-    <w:name w:val="DABD770CAE7545158C1FA0A23934C0D39"/>
-    <w:rsid w:val="004E2E79"/>
-    <w:pPr>
-      <w:spacing w:before="40" w:after="40" w:line="240" w:lineRule="auto"/>
-    </w:pPr>
-    <w:rPr>
-      <w:rFonts w:ascii="Times New Roman" w:eastAsia="Times New Roman" w:hAnsi="Times New Roman" w:cs="Times New Roman"/>
-      <w:sz w:val="24"/>
-      <w:szCs w:val="20"/>
-    </w:rPr>
-  </w:style>
-  <w:style w:type="paragraph" w:customStyle="1" w:styleId="1A024121D88C46E998D1D996726005C89">
-    <w:name w:val="1A024121D88C46E998D1D996726005C89"/>
-    <w:rsid w:val="004E2E79"/>
-    <w:pPr>
-      <w:spacing w:before="40" w:after="40" w:line="240" w:lineRule="auto"/>
-    </w:pPr>
-    <w:rPr>
-      <w:rFonts w:ascii="Times New Roman" w:eastAsia="Times New Roman" w:hAnsi="Times New Roman" w:cs="Times New Roman"/>
-      <w:sz w:val="24"/>
-      <w:szCs w:val="20"/>
-    </w:rPr>
-  </w:style>
-  <w:style w:type="paragraph" w:customStyle="1" w:styleId="98F324914AB045569FB94407DC5852479">
-    <w:name w:val="98F324914AB045569FB94407DC5852479"/>
-    <w:rsid w:val="004E2E79"/>
-    <w:pPr>
-      <w:spacing w:before="40" w:after="40" w:line="240" w:lineRule="auto"/>
-    </w:pPr>
-    <w:rPr>
-      <w:rFonts w:ascii="Times New Roman" w:eastAsia="Times New Roman" w:hAnsi="Times New Roman" w:cs="Times New Roman"/>
-      <w:sz w:val="24"/>
-      <w:szCs w:val="20"/>
-    </w:rPr>
-  </w:style>
-  <w:style w:type="paragraph" w:customStyle="1" w:styleId="2758C0A6B69C4C68BC8C8E9968CCC65F9">
-    <w:name w:val="2758C0A6B69C4C68BC8C8E9968CCC65F9"/>
-    <w:rsid w:val="004E2E79"/>
-    <w:pPr>
-      <w:spacing w:before="40" w:after="40" w:line="240" w:lineRule="auto"/>
-    </w:pPr>
-    <w:rPr>
-      <w:rFonts w:ascii="Times New Roman" w:eastAsia="Times New Roman" w:hAnsi="Times New Roman" w:cs="Times New Roman"/>
-      <w:sz w:val="24"/>
-      <w:szCs w:val="20"/>
-    </w:rPr>
-  </w:style>
-  <w:style w:type="paragraph" w:customStyle="1" w:styleId="7540E5E4061643EEA665ABE7860D57A83">
-    <w:name w:val="7540E5E4061643EEA665ABE7860D57A83"/>
-    <w:rsid w:val="004E2E79"/>
-    <w:pPr>
-      <w:spacing w:before="40" w:after="40" w:line="240" w:lineRule="auto"/>
-    </w:pPr>
-    <w:rPr>
-      <w:rFonts w:ascii="Times New Roman" w:eastAsia="Times New Roman" w:hAnsi="Times New Roman" w:cs="Times New Roman"/>
-      <w:sz w:val="24"/>
-      <w:szCs w:val="20"/>
-    </w:rPr>
-  </w:style>
-  <w:style w:type="paragraph" w:customStyle="1" w:styleId="BD8D817EEA2348A8B40DAC08E62629B73">
-    <w:name w:val="BD8D817EEA2348A8B40DAC08E62629B73"/>
-    <w:rsid w:val="004E2E79"/>
-    <w:pPr>
-      <w:spacing w:before="40" w:after="40" w:line="240" w:lineRule="auto"/>
-    </w:pPr>
-    <w:rPr>
-      <w:rFonts w:ascii="Times New Roman" w:eastAsia="Times New Roman" w:hAnsi="Times New Roman" w:cs="Times New Roman"/>
-      <w:sz w:val="24"/>
-      <w:szCs w:val="20"/>
-    </w:rPr>
-  </w:style>
-  <w:style w:type="paragraph" w:customStyle="1" w:styleId="276D18CAAD334447B0BAEFF35B086C643">
-    <w:name w:val="276D18CAAD334447B0BAEFF35B086C643"/>
-    <w:rsid w:val="004E2E79"/>
-    <w:pPr>
-      <w:spacing w:before="40" w:after="40" w:line="240" w:lineRule="auto"/>
-    </w:pPr>
-    <w:rPr>
-      <w:rFonts w:ascii="Times New Roman" w:eastAsia="Times New Roman" w:hAnsi="Times New Roman" w:cs="Times New Roman"/>
-      <w:sz w:val="24"/>
-      <w:szCs w:val="20"/>
-    </w:rPr>
-  </w:style>
-  <w:style w:type="paragraph" w:customStyle="1" w:styleId="EF378C158C644386842577CA818626B03">
-    <w:name w:val="EF378C158C644386842577CA818626B03"/>
-    <w:rsid w:val="004E2E79"/>
-    <w:pPr>
-      <w:spacing w:before="40" w:after="40" w:line="240" w:lineRule="auto"/>
-    </w:pPr>
-    <w:rPr>
-      <w:rFonts w:ascii="Times New Roman" w:eastAsia="Times New Roman" w:hAnsi="Times New Roman" w:cs="Times New Roman"/>
-      <w:sz w:val="24"/>
-      <w:szCs w:val="20"/>
-    </w:rPr>
-  </w:style>
-  <w:style w:type="paragraph" w:customStyle="1" w:styleId="700CEBAEB99A44A4B1C816229B56C1193">
-    <w:name w:val="700CEBAEB99A44A4B1C816229B56C1193"/>
-    <w:rsid w:val="004E2E79"/>
-    <w:pPr>
-      <w:spacing w:before="40" w:after="40" w:line="240" w:lineRule="auto"/>
-    </w:pPr>
-    <w:rPr>
-      <w:rFonts w:ascii="Times New Roman" w:eastAsia="Times New Roman" w:hAnsi="Times New Roman" w:cs="Times New Roman"/>
-      <w:sz w:val="24"/>
-      <w:szCs w:val="20"/>
-    </w:rPr>
-  </w:style>
-  <w:style w:type="paragraph" w:customStyle="1" w:styleId="2CAF8B661A444881A001971C462CC34314">
-    <w:name w:val="2CAF8B661A444881A001971C462CC34314"/>
-    <w:rsid w:val="003F5030"/>
-    <w:pPr>
-      <w:spacing w:after="120" w:line="240" w:lineRule="auto"/>
-    </w:pPr>
-    <w:rPr>
-      <w:rFonts w:ascii="Times New Roman" w:eastAsia="Times New Roman" w:hAnsi="Times New Roman" w:cs="Times New Roman"/>
-      <w:sz w:val="24"/>
-      <w:szCs w:val="24"/>
-    </w:rPr>
-  </w:style>
-  <w:style w:type="paragraph" w:customStyle="1" w:styleId="C696749CBD7D432B8F903C047E9641DA3">
-    <w:name w:val="C696749CBD7D432B8F903C047E9641DA3"/>
-    <w:rsid w:val="003F5030"/>
-    <w:pPr>
-      <w:spacing w:after="120" w:line="240" w:lineRule="auto"/>
-    </w:pPr>
-    <w:rPr>
-      <w:rFonts w:ascii="Times New Roman" w:eastAsia="Times New Roman" w:hAnsi="Times New Roman" w:cs="Times New Roman"/>
-      <w:sz w:val="24"/>
-      <w:szCs w:val="24"/>
-    </w:rPr>
-  </w:style>
-  <w:style w:type="paragraph" w:customStyle="1" w:styleId="E4BDF4B99CB34CF39D2473999FDED3B44">
-    <w:name w:val="E4BDF4B99CB34CF39D2473999FDED3B44"/>
-    <w:rsid w:val="003F5030"/>
-    <w:pPr>
-      <w:spacing w:before="40" w:after="40" w:line="240" w:lineRule="auto"/>
-    </w:pPr>
-    <w:rPr>
-      <w:rFonts w:ascii="Times New Roman" w:eastAsia="Times New Roman" w:hAnsi="Times New Roman" w:cs="Times New Roman"/>
-      <w:sz w:val="24"/>
-      <w:szCs w:val="20"/>
-    </w:rPr>
-  </w:style>
-  <w:style w:type="paragraph" w:customStyle="1" w:styleId="27DB7009EF744E1A9AEB227E77E6FDEF4">
-    <w:name w:val="27DB7009EF744E1A9AEB227E77E6FDEF4"/>
-    <w:rsid w:val="003F5030"/>
-    <w:pPr>
-      <w:spacing w:before="40" w:after="40" w:line="240" w:lineRule="auto"/>
-    </w:pPr>
-    <w:rPr>
-      <w:rFonts w:ascii="Times New Roman" w:eastAsia="Times New Roman" w:hAnsi="Times New Roman" w:cs="Times New Roman"/>
-      <w:sz w:val="24"/>
-      <w:szCs w:val="20"/>
-    </w:rPr>
-  </w:style>
-  <w:style w:type="paragraph" w:customStyle="1" w:styleId="FCB8CF91EE344237B868217E912577794">
-    <w:name w:val="FCB8CF91EE344237B868217E912577794"/>
-    <w:rsid w:val="003F5030"/>
-    <w:pPr>
-      <w:spacing w:before="40" w:after="40" w:line="240" w:lineRule="auto"/>
-    </w:pPr>
-    <w:rPr>
-      <w:rFonts w:ascii="Times New Roman" w:eastAsia="Times New Roman" w:hAnsi="Times New Roman" w:cs="Times New Roman"/>
-      <w:sz w:val="24"/>
-      <w:szCs w:val="20"/>
-    </w:rPr>
-  </w:style>
-  <w:style w:type="paragraph" w:customStyle="1" w:styleId="90C438FFB4F54C97BD2329EF84FB3D2A10">
-    <w:name w:val="90C438FFB4F54C97BD2329EF84FB3D2A10"/>
-    <w:rsid w:val="003F5030"/>
-    <w:pPr>
-      <w:spacing w:before="40" w:after="40" w:line="240" w:lineRule="auto"/>
-    </w:pPr>
-    <w:rPr>
-      <w:rFonts w:ascii="Times New Roman" w:eastAsia="Times New Roman" w:hAnsi="Times New Roman" w:cs="Times New Roman"/>
-      <w:sz w:val="24"/>
-      <w:szCs w:val="20"/>
-    </w:rPr>
-  </w:style>
-  <w:style w:type="paragraph" w:customStyle="1" w:styleId="7540E5E4061643EEA665ABE7860D57A84">
-    <w:name w:val="7540E5E4061643EEA665ABE7860D57A84"/>
-    <w:rsid w:val="003F5030"/>
-    <w:pPr>
-      <w:spacing w:before="40" w:after="40" w:line="240" w:lineRule="auto"/>
-    </w:pPr>
-    <w:rPr>
-      <w:rFonts w:ascii="Times New Roman" w:eastAsia="Times New Roman" w:hAnsi="Times New Roman" w:cs="Times New Roman"/>
-      <w:sz w:val="24"/>
-      <w:szCs w:val="20"/>
-    </w:rPr>
-  </w:style>
-  <w:style w:type="paragraph" w:customStyle="1" w:styleId="BD8D817EEA2348A8B40DAC08E62629B74">
-    <w:name w:val="BD8D817EEA2348A8B40DAC08E62629B74"/>
-    <w:rsid w:val="003F5030"/>
-    <w:pPr>
-      <w:spacing w:before="40" w:after="40" w:line="240" w:lineRule="auto"/>
-    </w:pPr>
-    <w:rPr>
-      <w:rFonts w:ascii="Times New Roman" w:eastAsia="Times New Roman" w:hAnsi="Times New Roman" w:cs="Times New Roman"/>
-      <w:sz w:val="24"/>
-      <w:szCs w:val="20"/>
-    </w:rPr>
-  </w:style>
-  <w:style w:type="paragraph" w:customStyle="1" w:styleId="276D18CAAD334447B0BAEFF35B086C644">
-    <w:name w:val="276D18CAAD334447B0BAEFF35B086C644"/>
-    <w:rsid w:val="003F5030"/>
-    <w:pPr>
-      <w:spacing w:before="40" w:after="40" w:line="240" w:lineRule="auto"/>
-    </w:pPr>
-    <w:rPr>
-      <w:rFonts w:ascii="Times New Roman" w:eastAsia="Times New Roman" w:hAnsi="Times New Roman" w:cs="Times New Roman"/>
-      <w:sz w:val="24"/>
-      <w:szCs w:val="20"/>
-    </w:rPr>
-  </w:style>
-  <w:style w:type="paragraph" w:customStyle="1" w:styleId="EF378C158C644386842577CA818626B04">
-    <w:name w:val="EF378C158C644386842577CA818626B04"/>
-    <w:rsid w:val="003F5030"/>
-    <w:pPr>
-      <w:spacing w:before="40" w:after="40" w:line="240" w:lineRule="auto"/>
-    </w:pPr>
-    <w:rPr>
-      <w:rFonts w:ascii="Times New Roman" w:eastAsia="Times New Roman" w:hAnsi="Times New Roman" w:cs="Times New Roman"/>
-      <w:sz w:val="24"/>
-      <w:szCs w:val="20"/>
-    </w:rPr>
-  </w:style>
-  <w:style w:type="paragraph" w:customStyle="1" w:styleId="700CEBAEB99A44A4B1C816229B56C1194">
-    <w:name w:val="700CEBAEB99A44A4B1C816229B56C1194"/>
-    <w:rsid w:val="003F5030"/>
-    <w:pPr>
-      <w:spacing w:before="40" w:after="40" w:line="240" w:lineRule="auto"/>
-    </w:pPr>
-    <w:rPr>
-      <w:rFonts w:ascii="Times New Roman" w:eastAsia="Times New Roman" w:hAnsi="Times New Roman" w:cs="Times New Roman"/>
-      <w:sz w:val="24"/>
-      <w:szCs w:val="20"/>
-    </w:rPr>
-  </w:style>
-  <w:style w:type="paragraph" w:customStyle="1" w:styleId="2CAF8B661A444881A001971C462CC34315">
-    <w:name w:val="2CAF8B661A444881A001971C462CC34315"/>
-    <w:rsid w:val="003F5030"/>
-    <w:pPr>
-      <w:spacing w:after="120" w:line="240" w:lineRule="auto"/>
-    </w:pPr>
-    <w:rPr>
-      <w:rFonts w:ascii="Times New Roman" w:eastAsia="Times New Roman" w:hAnsi="Times New Roman" w:cs="Times New Roman"/>
-      <w:sz w:val="24"/>
-      <w:szCs w:val="24"/>
-    </w:rPr>
-  </w:style>
-  <w:style w:type="paragraph" w:customStyle="1" w:styleId="C696749CBD7D432B8F903C047E9641DA4">
-    <w:name w:val="C696749CBD7D432B8F903C047E9641DA4"/>
-    <w:rsid w:val="003F5030"/>
-    <w:pPr>
-      <w:spacing w:after="120" w:line="240" w:lineRule="auto"/>
-    </w:pPr>
-    <w:rPr>
-      <w:rFonts w:ascii="Times New Roman" w:eastAsia="Times New Roman" w:hAnsi="Times New Roman" w:cs="Times New Roman"/>
-      <w:sz w:val="24"/>
-      <w:szCs w:val="24"/>
-    </w:rPr>
-  </w:style>
-  <w:style w:type="paragraph" w:customStyle="1" w:styleId="E4BDF4B99CB34CF39D2473999FDED3B45">
-    <w:name w:val="E4BDF4B99CB34CF39D2473999FDED3B45"/>
-    <w:rsid w:val="003F5030"/>
-    <w:pPr>
-      <w:spacing w:before="40" w:after="40" w:line="240" w:lineRule="auto"/>
-    </w:pPr>
-    <w:rPr>
-      <w:rFonts w:ascii="Times New Roman" w:eastAsia="Times New Roman" w:hAnsi="Times New Roman" w:cs="Times New Roman"/>
-      <w:sz w:val="24"/>
-      <w:szCs w:val="20"/>
-    </w:rPr>
-  </w:style>
-  <w:style w:type="paragraph" w:customStyle="1" w:styleId="27DB7009EF744E1A9AEB227E77E6FDEF5">
-    <w:name w:val="27DB7009EF744E1A9AEB227E77E6FDEF5"/>
-    <w:rsid w:val="003F5030"/>
-    <w:pPr>
-      <w:spacing w:before="40" w:after="40" w:line="240" w:lineRule="auto"/>
-    </w:pPr>
-    <w:rPr>
-      <w:rFonts w:ascii="Times New Roman" w:eastAsia="Times New Roman" w:hAnsi="Times New Roman" w:cs="Times New Roman"/>
-      <w:sz w:val="24"/>
-      <w:szCs w:val="20"/>
-    </w:rPr>
-  </w:style>
-  <w:style w:type="paragraph" w:customStyle="1" w:styleId="FCB8CF91EE344237B868217E912577795">
-    <w:name w:val="FCB8CF91EE344237B868217E912577795"/>
-    <w:rsid w:val="003F5030"/>
-    <w:pPr>
-      <w:spacing w:before="40" w:after="40" w:line="240" w:lineRule="auto"/>
-    </w:pPr>
-    <w:rPr>
-      <w:rFonts w:ascii="Times New Roman" w:eastAsia="Times New Roman" w:hAnsi="Times New Roman" w:cs="Times New Roman"/>
-      <w:sz w:val="24"/>
-      <w:szCs w:val="20"/>
-    </w:rPr>
-  </w:style>
-  <w:style w:type="paragraph" w:customStyle="1" w:styleId="90C438FFB4F54C97BD2329EF84FB3D2A11">
-    <w:name w:val="90C438FFB4F54C97BD2329EF84FB3D2A11"/>
-    <w:rsid w:val="003F5030"/>
-    <w:pPr>
-      <w:spacing w:before="40" w:after="40" w:line="240" w:lineRule="auto"/>
-    </w:pPr>
-    <w:rPr>
-      <w:rFonts w:ascii="Times New Roman" w:eastAsia="Times New Roman" w:hAnsi="Times New Roman" w:cs="Times New Roman"/>
-      <w:sz w:val="24"/>
-      <w:szCs w:val="20"/>
-    </w:rPr>
-  </w:style>
-  <w:style w:type="paragraph" w:customStyle="1" w:styleId="7540E5E4061643EEA665ABE7860D57A85">
-    <w:name w:val="7540E5E4061643EEA665ABE7860D57A85"/>
-    <w:rsid w:val="003F5030"/>
-    <w:pPr>
-      <w:spacing w:before="40" w:after="40" w:line="240" w:lineRule="auto"/>
-    </w:pPr>
-    <w:rPr>
-      <w:rFonts w:ascii="Times New Roman" w:eastAsia="Times New Roman" w:hAnsi="Times New Roman" w:cs="Times New Roman"/>
-      <w:sz w:val="24"/>
-      <w:szCs w:val="20"/>
-    </w:rPr>
-  </w:style>
-  <w:style w:type="paragraph" w:customStyle="1" w:styleId="BD8D817EEA2348A8B40DAC08E62629B75">
-    <w:name w:val="BD8D817EEA2348A8B40DAC08E62629B75"/>
-    <w:rsid w:val="003F5030"/>
-    <w:pPr>
-      <w:spacing w:before="40" w:after="40" w:line="240" w:lineRule="auto"/>
-    </w:pPr>
-    <w:rPr>
-      <w:rFonts w:ascii="Times New Roman" w:eastAsia="Times New Roman" w:hAnsi="Times New Roman" w:cs="Times New Roman"/>
-      <w:sz w:val="24"/>
-      <w:szCs w:val="20"/>
-    </w:rPr>
-  </w:style>
-  <w:style w:type="paragraph" w:customStyle="1" w:styleId="276D18CAAD334447B0BAEFF35B086C645">
-    <w:name w:val="276D18CAAD334447B0BAEFF35B086C645"/>
-    <w:rsid w:val="003F5030"/>
-    <w:pPr>
-      <w:spacing w:before="40" w:after="40" w:line="240" w:lineRule="auto"/>
-    </w:pPr>
-    <w:rPr>
-      <w:rFonts w:ascii="Times New Roman" w:eastAsia="Times New Roman" w:hAnsi="Times New Roman" w:cs="Times New Roman"/>
-      <w:sz w:val="24"/>
-      <w:szCs w:val="20"/>
-    </w:rPr>
-  </w:style>
-  <w:style w:type="paragraph" w:customStyle="1" w:styleId="EF378C158C644386842577CA818626B05">
-    <w:name w:val="EF378C158C644386842577CA818626B05"/>
-    <w:rsid w:val="003F5030"/>
-    <w:pPr>
-      <w:spacing w:before="40" w:after="40" w:line="240" w:lineRule="auto"/>
-    </w:pPr>
-    <w:rPr>
-      <w:rFonts w:ascii="Times New Roman" w:eastAsia="Times New Roman" w:hAnsi="Times New Roman" w:cs="Times New Roman"/>
-      <w:sz w:val="24"/>
-      <w:szCs w:val="20"/>
-    </w:rPr>
-  </w:style>
-  <w:style w:type="paragraph" w:customStyle="1" w:styleId="700CEBAEB99A44A4B1C816229B56C1195">
-    <w:name w:val="700CEBAEB99A44A4B1C816229B56C1195"/>
-    <w:rsid w:val="003F5030"/>
-    <w:pPr>
-      <w:spacing w:before="40" w:after="40" w:line="240" w:lineRule="auto"/>
-    </w:pPr>
-    <w:rPr>
-      <w:rFonts w:ascii="Times New Roman" w:eastAsia="Times New Roman" w:hAnsi="Times New Roman" w:cs="Times New Roman"/>
-      <w:sz w:val="24"/>
-      <w:szCs w:val="20"/>
-    </w:rPr>
-  </w:style>
-  <w:style w:type="paragraph" w:customStyle="1" w:styleId="9D7C7ACFA710445494FBFAFEFBE09307">
-    <w:name w:val="9D7C7ACFA710445494FBFAFEFBE09307"/>
-    <w:rsid w:val="003F5030"/>
-    <w:pPr>
-      <w:spacing w:after="0" w:line="240" w:lineRule="auto"/>
-    </w:pPr>
-    <w:rPr>
-      <w:rFonts w:ascii="Times New Roman" w:eastAsia="Times New Roman" w:hAnsi="Times New Roman" w:cs="Times New Roman"/>
-      <w:sz w:val="24"/>
-      <w:szCs w:val="24"/>
-    </w:rPr>
-  </w:style>
-  <w:style w:type="paragraph" w:customStyle="1" w:styleId="2CAF8B661A444881A001971C462CC34316">
-    <w:name w:val="2CAF8B661A444881A001971C462CC34316"/>
-    <w:rsid w:val="009E4DD6"/>
-    <w:pPr>
-      <w:spacing w:after="120" w:line="240" w:lineRule="auto"/>
-    </w:pPr>
-    <w:rPr>
-      <w:rFonts w:ascii="Times New Roman" w:eastAsia="Times New Roman" w:hAnsi="Times New Roman" w:cs="Times New Roman"/>
-      <w:sz w:val="24"/>
-      <w:szCs w:val="24"/>
-    </w:rPr>
-  </w:style>
-  <w:style w:type="paragraph" w:customStyle="1" w:styleId="C696749CBD7D432B8F903C047E9641DA5">
-    <w:name w:val="C696749CBD7D432B8F903C047E9641DA5"/>
-    <w:rsid w:val="009E4DD6"/>
-    <w:pPr>
-      <w:spacing w:after="120" w:line="240" w:lineRule="auto"/>
-    </w:pPr>
-    <w:rPr>
-      <w:rFonts w:ascii="Times New Roman" w:eastAsia="Times New Roman" w:hAnsi="Times New Roman" w:cs="Times New Roman"/>
-      <w:sz w:val="24"/>
-      <w:szCs w:val="24"/>
-    </w:rPr>
-  </w:style>
-  <w:style w:type="paragraph" w:customStyle="1" w:styleId="E4BDF4B99CB34CF39D2473999FDED3B46">
-    <w:name w:val="E4BDF4B99CB34CF39D2473999FDED3B46"/>
-    <w:rsid w:val="009E4DD6"/>
-    <w:pPr>
-      <w:spacing w:before="40" w:after="40" w:line="240" w:lineRule="auto"/>
-    </w:pPr>
-    <w:rPr>
-      <w:rFonts w:ascii="Times New Roman" w:eastAsia="Times New Roman" w:hAnsi="Times New Roman" w:cs="Times New Roman"/>
-      <w:sz w:val="24"/>
-      <w:szCs w:val="20"/>
-    </w:rPr>
-  </w:style>
-  <w:style w:type="paragraph" w:customStyle="1" w:styleId="27DB7009EF744E1A9AEB227E77E6FDEF6">
-    <w:name w:val="27DB7009EF744E1A9AEB227E77E6FDEF6"/>
-    <w:rsid w:val="009E4DD6"/>
-    <w:pPr>
-      <w:spacing w:before="40" w:after="40" w:line="240" w:lineRule="auto"/>
-    </w:pPr>
-    <w:rPr>
-      <w:rFonts w:ascii="Times New Roman" w:eastAsia="Times New Roman" w:hAnsi="Times New Roman" w:cs="Times New Roman"/>
-      <w:sz w:val="24"/>
-      <w:szCs w:val="20"/>
-    </w:rPr>
-  </w:style>
-  <w:style w:type="paragraph" w:customStyle="1" w:styleId="FCB8CF91EE344237B868217E912577796">
-    <w:name w:val="FCB8CF91EE344237B868217E912577796"/>
-    <w:rsid w:val="009E4DD6"/>
-    <w:pPr>
-      <w:spacing w:before="40" w:after="40" w:line="240" w:lineRule="auto"/>
-    </w:pPr>
-    <w:rPr>
-      <w:rFonts w:ascii="Times New Roman" w:eastAsia="Times New Roman" w:hAnsi="Times New Roman" w:cs="Times New Roman"/>
-      <w:sz w:val="24"/>
-      <w:szCs w:val="20"/>
-    </w:rPr>
-  </w:style>
-  <w:style w:type="paragraph" w:customStyle="1" w:styleId="90C438FFB4F54C97BD2329EF84FB3D2A12">
-    <w:name w:val="90C438FFB4F54C97BD2329EF84FB3D2A12"/>
-    <w:rsid w:val="009E4DD6"/>
-    <w:pPr>
-      <w:spacing w:before="40" w:after="40" w:line="240" w:lineRule="auto"/>
-    </w:pPr>
-    <w:rPr>
-      <w:rFonts w:ascii="Times New Roman" w:eastAsia="Times New Roman" w:hAnsi="Times New Roman" w:cs="Times New Roman"/>
-      <w:sz w:val="24"/>
-      <w:szCs w:val="20"/>
-    </w:rPr>
-  </w:style>
-  <w:style w:type="paragraph" w:customStyle="1" w:styleId="0659E56E73AA461496D6122DD480F6A9">
-    <w:name w:val="0659E56E73AA461496D6122DD480F6A9"/>
-    <w:rsid w:val="009E4DD6"/>
-    <w:pPr>
-      <w:spacing w:before="40" w:after="40" w:line="240" w:lineRule="auto"/>
-    </w:pPr>
-    <w:rPr>
-      <w:rFonts w:ascii="Times New Roman" w:eastAsia="Times New Roman" w:hAnsi="Times New Roman" w:cs="Times New Roman"/>
-      <w:sz w:val="24"/>
-      <w:szCs w:val="20"/>
-    </w:rPr>
-  </w:style>
-  <w:style w:type="paragraph" w:customStyle="1" w:styleId="F0658C2745424A1B8BE4612BD87143B1">
-    <w:name w:val="F0658C2745424A1B8BE4612BD87143B1"/>
-    <w:rsid w:val="009E4DD6"/>
-    <w:pPr>
-      <w:spacing w:before="40" w:after="40" w:line="240" w:lineRule="auto"/>
-    </w:pPr>
-    <w:rPr>
-      <w:rFonts w:ascii="Times New Roman" w:eastAsia="Times New Roman" w:hAnsi="Times New Roman" w:cs="Times New Roman"/>
-      <w:sz w:val="24"/>
-      <w:szCs w:val="20"/>
-    </w:rPr>
-  </w:style>
-  <w:style w:type="paragraph" w:customStyle="1" w:styleId="BD8D817EEA2348A8B40DAC08E62629B76">
-    <w:name w:val="BD8D817EEA2348A8B40DAC08E62629B76"/>
-    <w:rsid w:val="009E4DD6"/>
-    <w:pPr>
-      <w:spacing w:before="40" w:after="40" w:line="240" w:lineRule="auto"/>
-    </w:pPr>
-    <w:rPr>
-      <w:rFonts w:ascii="Times New Roman" w:eastAsia="Times New Roman" w:hAnsi="Times New Roman" w:cs="Times New Roman"/>
-      <w:sz w:val="24"/>
-      <w:szCs w:val="20"/>
-    </w:rPr>
-  </w:style>
-  <w:style w:type="paragraph" w:customStyle="1" w:styleId="276D18CAAD334447B0BAEFF35B086C646">
-    <w:name w:val="276D18CAAD334447B0BAEFF35B086C646"/>
-    <w:rsid w:val="009E4DD6"/>
-    <w:pPr>
-      <w:spacing w:before="40" w:after="40" w:line="240" w:lineRule="auto"/>
-    </w:pPr>
-    <w:rPr>
-      <w:rFonts w:ascii="Times New Roman" w:eastAsia="Times New Roman" w:hAnsi="Times New Roman" w:cs="Times New Roman"/>
-      <w:sz w:val="24"/>
-      <w:szCs w:val="20"/>
-    </w:rPr>
-  </w:style>
-  <w:style w:type="paragraph" w:customStyle="1" w:styleId="EF378C158C644386842577CA818626B06">
-    <w:name w:val="EF378C158C644386842577CA818626B06"/>
-    <w:rsid w:val="009E4DD6"/>
-    <w:pPr>
-      <w:spacing w:before="40" w:after="40" w:line="240" w:lineRule="auto"/>
-    </w:pPr>
-    <w:rPr>
-      <w:rFonts w:ascii="Times New Roman" w:eastAsia="Times New Roman" w:hAnsi="Times New Roman" w:cs="Times New Roman"/>
-      <w:sz w:val="24"/>
-      <w:szCs w:val="20"/>
-    </w:rPr>
-  </w:style>
-  <w:style w:type="paragraph" w:customStyle="1" w:styleId="700CEBAEB99A44A4B1C816229B56C1196">
-    <w:name w:val="700CEBAEB99A44A4B1C816229B56C1196"/>
-    <w:rsid w:val="009E4DD6"/>
-    <w:pPr>
-      <w:spacing w:before="40" w:after="40" w:line="240" w:lineRule="auto"/>
-    </w:pPr>
-    <w:rPr>
-      <w:rFonts w:ascii="Times New Roman" w:eastAsia="Times New Roman" w:hAnsi="Times New Roman" w:cs="Times New Roman"/>
-      <w:sz w:val="24"/>
-      <w:szCs w:val="20"/>
-    </w:rPr>
-  </w:style>
-  <w:style w:type="paragraph" w:customStyle="1" w:styleId="9D7C7ACFA710445494FBFAFEFBE093071">
-    <w:name w:val="9D7C7ACFA710445494FBFAFEFBE093071"/>
-    <w:rsid w:val="009E4DD6"/>
-    <w:pPr>
-      <w:spacing w:after="0" w:line="240" w:lineRule="auto"/>
-    </w:pPr>
-    <w:rPr>
-      <w:rFonts w:ascii="Times New Roman" w:eastAsia="Times New Roman" w:hAnsi="Times New Roman" w:cs="Times New Roman"/>
-      <w:sz w:val="24"/>
-      <w:szCs w:val="24"/>
-    </w:rPr>
-  </w:style>
-  <w:style w:type="paragraph" w:customStyle="1" w:styleId="2CAF8B661A444881A001971C462CC34317">
-    <w:name w:val="2CAF8B661A444881A001971C462CC34317"/>
-    <w:rsid w:val="00503926"/>
-    <w:pPr>
-      <w:spacing w:after="120" w:line="240" w:lineRule="auto"/>
-    </w:pPr>
-    <w:rPr>
-      <w:rFonts w:ascii="Times New Roman" w:eastAsia="Times New Roman" w:hAnsi="Times New Roman" w:cs="Times New Roman"/>
-      <w:sz w:val="24"/>
-      <w:szCs w:val="24"/>
-    </w:rPr>
-  </w:style>
-  <w:style w:type="paragraph" w:customStyle="1" w:styleId="C696749CBD7D432B8F903C047E9641DA6">
-    <w:name w:val="C696749CBD7D432B8F903C047E9641DA6"/>
-    <w:rsid w:val="00503926"/>
-    <w:pPr>
-      <w:spacing w:after="120" w:line="240" w:lineRule="auto"/>
-    </w:pPr>
-    <w:rPr>
-      <w:rFonts w:ascii="Times New Roman" w:eastAsia="Times New Roman" w:hAnsi="Times New Roman" w:cs="Times New Roman"/>
-      <w:sz w:val="24"/>
-      <w:szCs w:val="24"/>
-    </w:rPr>
-  </w:style>
-  <w:style w:type="paragraph" w:customStyle="1" w:styleId="E4BDF4B99CB34CF39D2473999FDED3B47">
-    <w:name w:val="E4BDF4B99CB34CF39D2473999FDED3B47"/>
-    <w:rsid w:val="00503926"/>
-    <w:pPr>
-      <w:spacing w:before="40" w:after="40" w:line="240" w:lineRule="auto"/>
-    </w:pPr>
-    <w:rPr>
-      <w:rFonts w:ascii="Times New Roman" w:eastAsia="Times New Roman" w:hAnsi="Times New Roman" w:cs="Times New Roman"/>
-      <w:sz w:val="24"/>
-      <w:szCs w:val="20"/>
-    </w:rPr>
-  </w:style>
-  <w:style w:type="paragraph" w:customStyle="1" w:styleId="27DB7009EF744E1A9AEB227E77E6FDEF7">
-    <w:name w:val="27DB7009EF744E1A9AEB227E77E6FDEF7"/>
-    <w:rsid w:val="00503926"/>
-    <w:pPr>
-      <w:spacing w:before="40" w:after="40" w:line="240" w:lineRule="auto"/>
-    </w:pPr>
-    <w:rPr>
-      <w:rFonts w:ascii="Times New Roman" w:eastAsia="Times New Roman" w:hAnsi="Times New Roman" w:cs="Times New Roman"/>
-      <w:sz w:val="24"/>
-      <w:szCs w:val="20"/>
-    </w:rPr>
-  </w:style>
-  <w:style w:type="paragraph" w:customStyle="1" w:styleId="FCB8CF91EE344237B868217E912577797">
-    <w:name w:val="FCB8CF91EE344237B868217E912577797"/>
-    <w:rsid w:val="00503926"/>
-    <w:pPr>
-      <w:spacing w:before="40" w:after="40" w:line="240" w:lineRule="auto"/>
-    </w:pPr>
-    <w:rPr>
-      <w:rFonts w:ascii="Times New Roman" w:eastAsia="Times New Roman" w:hAnsi="Times New Roman" w:cs="Times New Roman"/>
-      <w:sz w:val="24"/>
-      <w:szCs w:val="20"/>
-    </w:rPr>
-  </w:style>
-  <w:style w:type="paragraph" w:customStyle="1" w:styleId="90C438FFB4F54C97BD2329EF84FB3D2A13">
-    <w:name w:val="90C438FFB4F54C97BD2329EF84FB3D2A13"/>
-    <w:rsid w:val="00503926"/>
-    <w:pPr>
-      <w:spacing w:before="40" w:after="40" w:line="240" w:lineRule="auto"/>
-    </w:pPr>
-    <w:rPr>
-      <w:rFonts w:ascii="Times New Roman" w:eastAsia="Times New Roman" w:hAnsi="Times New Roman" w:cs="Times New Roman"/>
-      <w:sz w:val="24"/>
-      <w:szCs w:val="20"/>
-    </w:rPr>
-  </w:style>
-  <w:style w:type="paragraph" w:customStyle="1" w:styleId="0659E56E73AA461496D6122DD480F6A91">
-    <w:name w:val="0659E56E73AA461496D6122DD480F6A91"/>
-    <w:rsid w:val="00503926"/>
-    <w:pPr>
-      <w:spacing w:before="40" w:after="40" w:line="240" w:lineRule="auto"/>
-    </w:pPr>
-    <w:rPr>
-      <w:rFonts w:ascii="Times New Roman" w:eastAsia="Times New Roman" w:hAnsi="Times New Roman" w:cs="Times New Roman"/>
-      <w:sz w:val="24"/>
-      <w:szCs w:val="20"/>
-    </w:rPr>
-  </w:style>
-  <w:style w:type="paragraph" w:customStyle="1" w:styleId="F0658C2745424A1B8BE4612BD87143B11">
-    <w:name w:val="F0658C2745424A1B8BE4612BD87143B11"/>
-    <w:rsid w:val="00503926"/>
-    <w:pPr>
-      <w:spacing w:before="40" w:after="40" w:line="240" w:lineRule="auto"/>
-    </w:pPr>
-    <w:rPr>
-      <w:rFonts w:ascii="Times New Roman" w:eastAsia="Times New Roman" w:hAnsi="Times New Roman" w:cs="Times New Roman"/>
-      <w:sz w:val="24"/>
-      <w:szCs w:val="20"/>
-    </w:rPr>
-  </w:style>
-  <w:style w:type="paragraph" w:customStyle="1" w:styleId="BD8D817EEA2348A8B40DAC08E62629B77">
-    <w:name w:val="BD8D817EEA2348A8B40DAC08E62629B77"/>
-    <w:rsid w:val="00503926"/>
-    <w:pPr>
-      <w:spacing w:before="40" w:after="40" w:line="240" w:lineRule="auto"/>
-    </w:pPr>
-    <w:rPr>
-      <w:rFonts w:ascii="Times New Roman" w:eastAsia="Times New Roman" w:hAnsi="Times New Roman" w:cs="Times New Roman"/>
-      <w:sz w:val="24"/>
-      <w:szCs w:val="20"/>
-    </w:rPr>
-  </w:style>
-  <w:style w:type="paragraph" w:customStyle="1" w:styleId="276D18CAAD334447B0BAEFF35B086C647">
-    <w:name w:val="276D18CAAD334447B0BAEFF35B086C647"/>
-    <w:rsid w:val="00503926"/>
-    <w:pPr>
-      <w:spacing w:before="40" w:after="40" w:line="240" w:lineRule="auto"/>
-    </w:pPr>
-    <w:rPr>
-      <w:rFonts w:ascii="Times New Roman" w:eastAsia="Times New Roman" w:hAnsi="Times New Roman" w:cs="Times New Roman"/>
-      <w:sz w:val="24"/>
-      <w:szCs w:val="20"/>
-    </w:rPr>
-  </w:style>
-  <w:style w:type="paragraph" w:customStyle="1" w:styleId="EF378C158C644386842577CA818626B07">
-    <w:name w:val="EF378C158C644386842577CA818626B07"/>
-    <w:rsid w:val="00503926"/>
-    <w:pPr>
-      <w:spacing w:before="40" w:after="40" w:line="240" w:lineRule="auto"/>
-    </w:pPr>
-    <w:rPr>
-      <w:rFonts w:ascii="Times New Roman" w:eastAsia="Times New Roman" w:hAnsi="Times New Roman" w:cs="Times New Roman"/>
-      <w:sz w:val="24"/>
-      <w:szCs w:val="20"/>
-    </w:rPr>
-  </w:style>
-  <w:style w:type="paragraph" w:customStyle="1" w:styleId="700CEBAEB99A44A4B1C816229B56C1197">
-    <w:name w:val="700CEBAEB99A44A4B1C816229B56C1197"/>
-    <w:rsid w:val="00503926"/>
-    <w:pPr>
-      <w:spacing w:before="40" w:after="40" w:line="240" w:lineRule="auto"/>
-    </w:pPr>
-    <w:rPr>
-      <w:rFonts w:ascii="Times New Roman" w:eastAsia="Times New Roman" w:hAnsi="Times New Roman" w:cs="Times New Roman"/>
-      <w:sz w:val="24"/>
-      <w:szCs w:val="20"/>
-    </w:rPr>
-  </w:style>
-  <w:style w:type="paragraph" w:customStyle="1" w:styleId="9D7C7ACFA710445494FBFAFEFBE093072">
-    <w:name w:val="9D7C7ACFA710445494FBFAFEFBE093072"/>
-    <w:rsid w:val="00503926"/>
-    <w:pPr>
-      <w:spacing w:after="0" w:line="240" w:lineRule="auto"/>
-    </w:pPr>
-    <w:rPr>
-      <w:rFonts w:ascii="Times New Roman" w:eastAsia="Times New Roman" w:hAnsi="Times New Roman" w:cs="Times New Roman"/>
-      <w:sz w:val="24"/>
-      <w:szCs w:val="24"/>
-    </w:rPr>
-  </w:style>
-  <w:style w:type="paragraph" w:customStyle="1" w:styleId="2CAF8B661A444881A001971C462CC34318">
-    <w:name w:val="2CAF8B661A444881A001971C462CC34318"/>
-    <w:rsid w:val="00E944FB"/>
-    <w:pPr>
-      <w:spacing w:after="120" w:line="240" w:lineRule="auto"/>
-    </w:pPr>
-    <w:rPr>
-      <w:rFonts w:ascii="Times New Roman" w:eastAsia="Times New Roman" w:hAnsi="Times New Roman" w:cs="Times New Roman"/>
-      <w:sz w:val="24"/>
-      <w:szCs w:val="24"/>
-    </w:rPr>
-  </w:style>
-  <w:style w:type="paragraph" w:customStyle="1" w:styleId="C696749CBD7D432B8F903C047E9641DA7">
-    <w:name w:val="C696749CBD7D432B8F903C047E9641DA7"/>
-    <w:rsid w:val="00E944FB"/>
-    <w:pPr>
-      <w:spacing w:after="120" w:line="240" w:lineRule="auto"/>
-    </w:pPr>
-    <w:rPr>
-      <w:rFonts w:ascii="Times New Roman" w:eastAsia="Times New Roman" w:hAnsi="Times New Roman" w:cs="Times New Roman"/>
-      <w:sz w:val="24"/>
-      <w:szCs w:val="24"/>
-    </w:rPr>
-  </w:style>
-  <w:style w:type="paragraph" w:customStyle="1" w:styleId="E4BDF4B99CB34CF39D2473999FDED3B48">
-    <w:name w:val="E4BDF4B99CB34CF39D2473999FDED3B48"/>
-    <w:rsid w:val="00E944FB"/>
-    <w:pPr>
-      <w:spacing w:before="40" w:after="40" w:line="240" w:lineRule="auto"/>
-    </w:pPr>
-    <w:rPr>
-      <w:rFonts w:ascii="Times New Roman" w:eastAsia="Times New Roman" w:hAnsi="Times New Roman" w:cs="Times New Roman"/>
-      <w:sz w:val="24"/>
-      <w:szCs w:val="20"/>
-    </w:rPr>
-  </w:style>
-  <w:style w:type="paragraph" w:customStyle="1" w:styleId="27DB7009EF744E1A9AEB227E77E6FDEF8">
-    <w:name w:val="27DB7009EF744E1A9AEB227E77E6FDEF8"/>
-    <w:rsid w:val="00E944FB"/>
-    <w:pPr>
-      <w:spacing w:before="40" w:after="40" w:line="240" w:lineRule="auto"/>
-    </w:pPr>
-    <w:rPr>
-      <w:rFonts w:ascii="Times New Roman" w:eastAsia="Times New Roman" w:hAnsi="Times New Roman" w:cs="Times New Roman"/>
-      <w:sz w:val="24"/>
-      <w:szCs w:val="20"/>
-    </w:rPr>
-  </w:style>
-  <w:style w:type="paragraph" w:customStyle="1" w:styleId="FCB8CF91EE344237B868217E912577798">
-    <w:name w:val="FCB8CF91EE344237B868217E912577798"/>
-    <w:rsid w:val="00E944FB"/>
-    <w:pPr>
-      <w:spacing w:before="40" w:after="40" w:line="240" w:lineRule="auto"/>
-    </w:pPr>
-    <w:rPr>
-      <w:rFonts w:ascii="Times New Roman" w:eastAsia="Times New Roman" w:hAnsi="Times New Roman" w:cs="Times New Roman"/>
-      <w:sz w:val="24"/>
-      <w:szCs w:val="20"/>
-    </w:rPr>
-  </w:style>
-  <w:style w:type="paragraph" w:customStyle="1" w:styleId="90C438FFB4F54C97BD2329EF84FB3D2A14">
-    <w:name w:val="90C438FFB4F54C97BD2329EF84FB3D2A14"/>
-    <w:rsid w:val="00E944FB"/>
-    <w:pPr>
-      <w:spacing w:before="40" w:after="40" w:line="240" w:lineRule="auto"/>
-    </w:pPr>
-    <w:rPr>
-      <w:rFonts w:ascii="Times New Roman" w:eastAsia="Times New Roman" w:hAnsi="Times New Roman" w:cs="Times New Roman"/>
-      <w:sz w:val="24"/>
-      <w:szCs w:val="20"/>
-    </w:rPr>
-  </w:style>
-  <w:style w:type="paragraph" w:customStyle="1" w:styleId="0659E56E73AA461496D6122DD480F6A92">
-    <w:name w:val="0659E56E73AA461496D6122DD480F6A92"/>
-    <w:rsid w:val="00E944FB"/>
-    <w:pPr>
-      <w:spacing w:before="40" w:after="40" w:line="240" w:lineRule="auto"/>
-    </w:pPr>
-    <w:rPr>
-      <w:rFonts w:ascii="Times New Roman" w:eastAsia="Times New Roman" w:hAnsi="Times New Roman" w:cs="Times New Roman"/>
-      <w:sz w:val="24"/>
-      <w:szCs w:val="20"/>
-    </w:rPr>
-  </w:style>
-  <w:style w:type="paragraph" w:customStyle="1" w:styleId="F0658C2745424A1B8BE4612BD87143B12">
-    <w:name w:val="F0658C2745424A1B8BE4612BD87143B12"/>
-    <w:rsid w:val="00E944FB"/>
-    <w:pPr>
-      <w:spacing w:before="40" w:after="40" w:line="240" w:lineRule="auto"/>
-    </w:pPr>
-    <w:rPr>
-      <w:rFonts w:ascii="Times New Roman" w:eastAsia="Times New Roman" w:hAnsi="Times New Roman" w:cs="Times New Roman"/>
-      <w:sz w:val="24"/>
-      <w:szCs w:val="20"/>
-    </w:rPr>
-  </w:style>
-  <w:style w:type="paragraph" w:customStyle="1" w:styleId="BD8D817EEA2348A8B40DAC08E62629B78">
-    <w:name w:val="BD8D817EEA2348A8B40DAC08E62629B78"/>
-    <w:rsid w:val="00E944FB"/>
-    <w:pPr>
-      <w:spacing w:before="40" w:after="40" w:line="240" w:lineRule="auto"/>
-    </w:pPr>
-    <w:rPr>
-      <w:rFonts w:ascii="Times New Roman" w:eastAsia="Times New Roman" w:hAnsi="Times New Roman" w:cs="Times New Roman"/>
-      <w:sz w:val="24"/>
-      <w:szCs w:val="20"/>
-    </w:rPr>
-  </w:style>
-  <w:style w:type="paragraph" w:customStyle="1" w:styleId="276D18CAAD334447B0BAEFF35B086C648">
-    <w:name w:val="276D18CAAD334447B0BAEFF35B086C648"/>
-    <w:rsid w:val="00E944FB"/>
-    <w:pPr>
-      <w:spacing w:before="40" w:after="40" w:line="240" w:lineRule="auto"/>
-    </w:pPr>
-    <w:rPr>
-      <w:rFonts w:ascii="Times New Roman" w:eastAsia="Times New Roman" w:hAnsi="Times New Roman" w:cs="Times New Roman"/>
-      <w:sz w:val="24"/>
-      <w:szCs w:val="20"/>
-    </w:rPr>
-  </w:style>
-  <w:style w:type="paragraph" w:customStyle="1" w:styleId="EF378C158C644386842577CA818626B08">
-    <w:name w:val="EF378C158C644386842577CA818626B08"/>
-    <w:rsid w:val="00E944FB"/>
-    <w:pPr>
-      <w:spacing w:before="40" w:after="40" w:line="240" w:lineRule="auto"/>
-    </w:pPr>
-    <w:rPr>
-      <w:rFonts w:ascii="Times New Roman" w:eastAsia="Times New Roman" w:hAnsi="Times New Roman" w:cs="Times New Roman"/>
-      <w:sz w:val="24"/>
-      <w:szCs w:val="20"/>
-    </w:rPr>
-  </w:style>
-  <w:style w:type="paragraph" w:customStyle="1" w:styleId="700CEBAEB99A44A4B1C816229B56C1198">
-    <w:name w:val="700CEBAEB99A44A4B1C816229B56C1198"/>
-    <w:rsid w:val="00E944FB"/>
-    <w:pPr>
-      <w:spacing w:before="40" w:after="40" w:line="240" w:lineRule="auto"/>
-    </w:pPr>
-    <w:rPr>
-      <w:rFonts w:ascii="Times New Roman" w:eastAsia="Times New Roman" w:hAnsi="Times New Roman" w:cs="Times New Roman"/>
-      <w:sz w:val="24"/>
-      <w:szCs w:val="20"/>
-    </w:rPr>
-  </w:style>
-  <w:style w:type="paragraph" w:customStyle="1" w:styleId="9D7C7ACFA710445494FBFAFEFBE093073">
-    <w:name w:val="9D7C7ACFA710445494FBFAFEFBE093073"/>
-    <w:rsid w:val="00E944FB"/>
-    <w:pPr>
-      <w:spacing w:after="0" w:line="240" w:lineRule="auto"/>
-    </w:pPr>
-    <w:rPr>
-      <w:rFonts w:ascii="Times New Roman" w:eastAsia="Times New Roman" w:hAnsi="Times New Roman" w:cs="Times New Roman"/>
-      <w:sz w:val="24"/>
-      <w:szCs w:val="24"/>
-    </w:rPr>
-  </w:style>
-  <w:style w:type="paragraph" w:customStyle="1" w:styleId="2CAF8B661A444881A001971C462CC34319">
-    <w:name w:val="2CAF8B661A444881A001971C462CC34319"/>
-    <w:rsid w:val="00E944FB"/>
-    <w:pPr>
-      <w:spacing w:after="120" w:line="240" w:lineRule="auto"/>
-    </w:pPr>
-    <w:rPr>
-      <w:rFonts w:ascii="Times New Roman" w:eastAsia="Times New Roman" w:hAnsi="Times New Roman" w:cs="Times New Roman"/>
-      <w:sz w:val="24"/>
-      <w:szCs w:val="24"/>
-    </w:rPr>
-  </w:style>
-  <w:style w:type="paragraph" w:customStyle="1" w:styleId="C696749CBD7D432B8F903C047E9641DA8">
-    <w:name w:val="C696749CBD7D432B8F903C047E9641DA8"/>
-    <w:rsid w:val="00E944FB"/>
-    <w:pPr>
-      <w:spacing w:after="120" w:line="240" w:lineRule="auto"/>
-    </w:pPr>
-    <w:rPr>
-      <w:rFonts w:ascii="Times New Roman" w:eastAsia="Times New Roman" w:hAnsi="Times New Roman" w:cs="Times New Roman"/>
-      <w:sz w:val="24"/>
-      <w:szCs w:val="24"/>
-    </w:rPr>
-  </w:style>
-  <w:style w:type="paragraph" w:customStyle="1" w:styleId="E4BDF4B99CB34CF39D2473999FDED3B49">
-    <w:name w:val="E4BDF4B99CB34CF39D2473999FDED3B49"/>
-    <w:rsid w:val="00E944FB"/>
-    <w:pPr>
-      <w:spacing w:before="40" w:after="40" w:line="240" w:lineRule="auto"/>
-    </w:pPr>
-    <w:rPr>
-      <w:rFonts w:ascii="Times New Roman" w:eastAsia="Times New Roman" w:hAnsi="Times New Roman" w:cs="Times New Roman"/>
-      <w:sz w:val="24"/>
-      <w:szCs w:val="20"/>
-    </w:rPr>
-  </w:style>
-  <w:style w:type="paragraph" w:customStyle="1" w:styleId="27DB7009EF744E1A9AEB227E77E6FDEF9">
-    <w:name w:val="27DB7009EF744E1A9AEB227E77E6FDEF9"/>
-    <w:rsid w:val="00E944FB"/>
-    <w:pPr>
-      <w:spacing w:before="40" w:after="40" w:line="240" w:lineRule="auto"/>
-    </w:pPr>
-    <w:rPr>
-      <w:rFonts w:ascii="Times New Roman" w:eastAsia="Times New Roman" w:hAnsi="Times New Roman" w:cs="Times New Roman"/>
-      <w:sz w:val="24"/>
-      <w:szCs w:val="20"/>
-    </w:rPr>
-  </w:style>
-  <w:style w:type="paragraph" w:customStyle="1" w:styleId="FCB8CF91EE344237B868217E912577799">
-    <w:name w:val="FCB8CF91EE344237B868217E912577799"/>
-    <w:rsid w:val="00E944FB"/>
-    <w:pPr>
-      <w:spacing w:before="40" w:after="40" w:line="240" w:lineRule="auto"/>
-    </w:pPr>
-    <w:rPr>
-      <w:rFonts w:ascii="Times New Roman" w:eastAsia="Times New Roman" w:hAnsi="Times New Roman" w:cs="Times New Roman"/>
-      <w:sz w:val="24"/>
-      <w:szCs w:val="20"/>
-    </w:rPr>
-  </w:style>
-  <w:style w:type="paragraph" w:customStyle="1" w:styleId="90C438FFB4F54C97BD2329EF84FB3D2A15">
-    <w:name w:val="90C438FFB4F54C97BD2329EF84FB3D2A15"/>
-    <w:rsid w:val="00E944FB"/>
-    <w:pPr>
-      <w:spacing w:before="40" w:after="40" w:line="240" w:lineRule="auto"/>
-    </w:pPr>
-    <w:rPr>
-      <w:rFonts w:ascii="Times New Roman" w:eastAsia="Times New Roman" w:hAnsi="Times New Roman" w:cs="Times New Roman"/>
-      <w:sz w:val="24"/>
-      <w:szCs w:val="20"/>
-    </w:rPr>
-  </w:style>
-  <w:style w:type="paragraph" w:customStyle="1" w:styleId="2CAF8B661A444881A001971C462CC34320">
-    <w:name w:val="2CAF8B661A444881A001971C462CC34320"/>
-    <w:rsid w:val="00100F04"/>
-    <w:pPr>
-      <w:spacing w:after="120" w:line="240" w:lineRule="auto"/>
-    </w:pPr>
-    <w:rPr>
-      <w:rFonts w:ascii="Times New Roman" w:eastAsia="Times New Roman" w:hAnsi="Times New Roman" w:cs="Times New Roman"/>
-      <w:sz w:val="24"/>
-      <w:szCs w:val="24"/>
-    </w:rPr>
-  </w:style>
-  <w:style w:type="paragraph" w:customStyle="1" w:styleId="C696749CBD7D432B8F903C047E9641DA9">
-    <w:name w:val="C696749CBD7D432B8F903C047E9641DA9"/>
-    <w:rsid w:val="00100F04"/>
-    <w:pPr>
-      <w:spacing w:after="120" w:line="240" w:lineRule="auto"/>
-    </w:pPr>
-    <w:rPr>
-      <w:rFonts w:ascii="Times New Roman" w:eastAsia="Times New Roman" w:hAnsi="Times New Roman" w:cs="Times New Roman"/>
-      <w:sz w:val="24"/>
-      <w:szCs w:val="24"/>
-    </w:rPr>
-  </w:style>
-  <w:style w:type="paragraph" w:customStyle="1" w:styleId="E4BDF4B99CB34CF39D2473999FDED3B410">
-    <w:name w:val="E4BDF4B99CB34CF39D2473999FDED3B410"/>
-    <w:rsid w:val="00100F04"/>
-    <w:pPr>
-      <w:spacing w:before="40" w:after="40" w:line="240" w:lineRule="auto"/>
-    </w:pPr>
-    <w:rPr>
-      <w:rFonts w:ascii="Times New Roman" w:eastAsia="Times New Roman" w:hAnsi="Times New Roman" w:cs="Times New Roman"/>
-      <w:sz w:val="24"/>
-      <w:szCs w:val="20"/>
-    </w:rPr>
-  </w:style>
-  <w:style w:type="paragraph" w:customStyle="1" w:styleId="27DB7009EF744E1A9AEB227E77E6FDEF10">
-    <w:name w:val="27DB7009EF744E1A9AEB227E77E6FDEF10"/>
-    <w:rsid w:val="00100F04"/>
-    <w:pPr>
-      <w:spacing w:before="40" w:after="40" w:line="240" w:lineRule="auto"/>
-    </w:pPr>
-    <w:rPr>
-      <w:rFonts w:ascii="Times New Roman" w:eastAsia="Times New Roman" w:hAnsi="Times New Roman" w:cs="Times New Roman"/>
-      <w:sz w:val="24"/>
-      <w:szCs w:val="20"/>
-    </w:rPr>
-  </w:style>
-  <w:style w:type="paragraph" w:customStyle="1" w:styleId="FCB8CF91EE344237B868217E9125777910">
-    <w:name w:val="FCB8CF91EE344237B868217E9125777910"/>
-    <w:rsid w:val="00100F04"/>
-    <w:pPr>
-      <w:spacing w:before="40" w:after="40" w:line="240" w:lineRule="auto"/>
-    </w:pPr>
-    <w:rPr>
-      <w:rFonts w:ascii="Times New Roman" w:eastAsia="Times New Roman" w:hAnsi="Times New Roman" w:cs="Times New Roman"/>
-      <w:sz w:val="24"/>
-      <w:szCs w:val="20"/>
-    </w:rPr>
-  </w:style>
-  <w:style w:type="paragraph" w:customStyle="1" w:styleId="90C438FFB4F54C97BD2329EF84FB3D2A16">
-    <w:name w:val="90C438FFB4F54C97BD2329EF84FB3D2A16"/>
-    <w:rsid w:val="00100F04"/>
-    <w:pPr>
-      <w:spacing w:before="40" w:after="40" w:line="240" w:lineRule="auto"/>
-    </w:pPr>
-    <w:rPr>
-      <w:rFonts w:ascii="Times New Roman" w:eastAsia="Times New Roman" w:hAnsi="Times New Roman" w:cs="Times New Roman"/>
-      <w:sz w:val="24"/>
-      <w:szCs w:val="20"/>
-    </w:rPr>
-  </w:style>
-  <w:style w:type="paragraph" w:customStyle="1" w:styleId="0659E56E73AA461496D6122DD480F6A93">
-    <w:name w:val="0659E56E73AA461496D6122DD480F6A93"/>
-    <w:rsid w:val="00100F04"/>
-    <w:pPr>
-      <w:spacing w:before="40" w:after="40" w:line="240" w:lineRule="auto"/>
-    </w:pPr>
-    <w:rPr>
-      <w:rFonts w:ascii="Times New Roman" w:eastAsia="Times New Roman" w:hAnsi="Times New Roman" w:cs="Times New Roman"/>
-      <w:sz w:val="24"/>
-      <w:szCs w:val="20"/>
-    </w:rPr>
-  </w:style>
-  <w:style w:type="paragraph" w:customStyle="1" w:styleId="F0658C2745424A1B8BE4612BD87143B13">
-    <w:name w:val="F0658C2745424A1B8BE4612BD87143B13"/>
-    <w:rsid w:val="00100F04"/>
-    <w:pPr>
-      <w:spacing w:before="40" w:after="40" w:line="240" w:lineRule="auto"/>
-    </w:pPr>
-    <w:rPr>
-      <w:rFonts w:ascii="Times New Roman" w:eastAsia="Times New Roman" w:hAnsi="Times New Roman" w:cs="Times New Roman"/>
-      <w:sz w:val="24"/>
-      <w:szCs w:val="20"/>
-    </w:rPr>
-  </w:style>
-  <w:style w:type="paragraph" w:customStyle="1" w:styleId="BD8D817EEA2348A8B40DAC08E62629B79">
-    <w:name w:val="BD8D817EEA2348A8B40DAC08E62629B79"/>
-    <w:rsid w:val="00100F04"/>
-    <w:pPr>
-      <w:spacing w:before="40" w:after="40" w:line="240" w:lineRule="auto"/>
-    </w:pPr>
-    <w:rPr>
-      <w:rFonts w:ascii="Times New Roman" w:eastAsia="Times New Roman" w:hAnsi="Times New Roman" w:cs="Times New Roman"/>
-      <w:sz w:val="24"/>
-      <w:szCs w:val="20"/>
-    </w:rPr>
-  </w:style>
-  <w:style w:type="paragraph" w:customStyle="1" w:styleId="276D18CAAD334447B0BAEFF35B086C649">
-    <w:name w:val="276D18CAAD334447B0BAEFF35B086C649"/>
-    <w:rsid w:val="00100F04"/>
-    <w:pPr>
-      <w:spacing w:before="40" w:after="40" w:line="240" w:lineRule="auto"/>
-    </w:pPr>
-    <w:rPr>
-      <w:rFonts w:ascii="Times New Roman" w:eastAsia="Times New Roman" w:hAnsi="Times New Roman" w:cs="Times New Roman"/>
-      <w:sz w:val="24"/>
-      <w:szCs w:val="20"/>
-    </w:rPr>
-  </w:style>
-  <w:style w:type="paragraph" w:customStyle="1" w:styleId="EF378C158C644386842577CA818626B09">
-    <w:name w:val="EF378C158C644386842577CA818626B09"/>
-    <w:rsid w:val="00100F04"/>
-    <w:pPr>
-      <w:spacing w:before="40" w:after="40" w:line="240" w:lineRule="auto"/>
-    </w:pPr>
-    <w:rPr>
-      <w:rFonts w:ascii="Times New Roman" w:eastAsia="Times New Roman" w:hAnsi="Times New Roman" w:cs="Times New Roman"/>
-      <w:sz w:val="24"/>
-      <w:szCs w:val="20"/>
-    </w:rPr>
-  </w:style>
-  <w:style w:type="paragraph" w:customStyle="1" w:styleId="700CEBAEB99A44A4B1C816229B56C1199">
-    <w:name w:val="700CEBAEB99A44A4B1C816229B56C1199"/>
-    <w:rsid w:val="00100F04"/>
-    <w:pPr>
-      <w:spacing w:before="40" w:after="40" w:line="240" w:lineRule="auto"/>
-    </w:pPr>
-    <w:rPr>
-      <w:rFonts w:ascii="Times New Roman" w:eastAsia="Times New Roman" w:hAnsi="Times New Roman" w:cs="Times New Roman"/>
-      <w:sz w:val="24"/>
-      <w:szCs w:val="20"/>
-    </w:rPr>
-  </w:style>
-  <w:style w:type="paragraph" w:customStyle="1" w:styleId="9D7C7ACFA710445494FBFAFEFBE093074">
-    <w:name w:val="9D7C7ACFA710445494FBFAFEFBE093074"/>
-    <w:rsid w:val="00100F04"/>
-    <w:pPr>
-      <w:spacing w:after="0" w:line="240" w:lineRule="auto"/>
-    </w:pPr>
-    <w:rPr>
-      <w:rFonts w:ascii="Times New Roman" w:eastAsia="Times New Roman" w:hAnsi="Times New Roman" w:cs="Times New Roman"/>
-      <w:sz w:val="24"/>
-      <w:szCs w:val="24"/>
-    </w:rPr>
-  </w:style>
-  <w:style w:type="paragraph" w:customStyle="1" w:styleId="9A9998A8221849649F6256C79A8F2B32">
-    <w:name w:val="9A9998A8221849649F6256C79A8F2B32"/>
-    <w:rsid w:val="00100F04"/>
-  </w:style>
-  <w:style w:type="paragraph" w:customStyle="1" w:styleId="770B919B1B5945799AAEADD1ECDBD6C6">
-    <w:name w:val="770B919B1B5945799AAEADD1ECDBD6C6"/>
-    <w:rsid w:val="00100F04"/>
-  </w:style>
-  <w:style w:type="paragraph" w:customStyle="1" w:styleId="C1AFDD95814C4D55B3D0B9B3F9816FDB">
-    <w:name w:val="C1AFDD95814C4D55B3D0B9B3F9816FDB"/>
-    <w:rsid w:val="00100F04"/>
-  </w:style>
-  <w:style w:type="paragraph" w:customStyle="1" w:styleId="FDE20E34DCB54EF7BC714BF0647803BD">
-    <w:name w:val="FDE20E34DCB54EF7BC714BF0647803BD"/>
-    <w:rsid w:val="00100F04"/>
-  </w:style>
-  <w:style w:type="paragraph" w:customStyle="1" w:styleId="C95535B5B9AF404383AF0FB92A3ED63F">
-    <w:name w:val="C95535B5B9AF404383AF0FB92A3ED63F"/>
-    <w:rsid w:val="00100F04"/>
-  </w:style>
-  <w:style w:type="paragraph" w:customStyle="1" w:styleId="2CAF8B661A444881A001971C462CC34321">
-    <w:name w:val="2CAF8B661A444881A001971C462CC34321"/>
-    <w:rsid w:val="00100F04"/>
-    <w:pPr>
-      <w:spacing w:after="120" w:line="240" w:lineRule="auto"/>
-    </w:pPr>
-    <w:rPr>
-      <w:rFonts w:ascii="Times New Roman" w:eastAsia="Times New Roman" w:hAnsi="Times New Roman" w:cs="Times New Roman"/>
-      <w:sz w:val="24"/>
-      <w:szCs w:val="24"/>
-    </w:rPr>
-  </w:style>
-  <w:style w:type="paragraph" w:customStyle="1" w:styleId="C696749CBD7D432B8F903C047E9641DA10">
-    <w:name w:val="C696749CBD7D432B8F903C047E9641DA10"/>
-    <w:rsid w:val="00100F04"/>
-    <w:pPr>
-      <w:spacing w:after="120" w:line="240" w:lineRule="auto"/>
-    </w:pPr>
-    <w:rPr>
-      <w:rFonts w:ascii="Times New Roman" w:eastAsia="Times New Roman" w:hAnsi="Times New Roman" w:cs="Times New Roman"/>
-      <w:sz w:val="24"/>
-      <w:szCs w:val="24"/>
-    </w:rPr>
-  </w:style>
-  <w:style w:type="paragraph" w:customStyle="1" w:styleId="E4BDF4B99CB34CF39D2473999FDED3B411">
-    <w:name w:val="E4BDF4B99CB34CF39D2473999FDED3B411"/>
-    <w:rsid w:val="00100F04"/>
-    <w:pPr>
-      <w:spacing w:before="40" w:after="40" w:line="240" w:lineRule="auto"/>
-    </w:pPr>
-    <w:rPr>
-      <w:rFonts w:ascii="Times New Roman" w:eastAsia="Times New Roman" w:hAnsi="Times New Roman" w:cs="Times New Roman"/>
-      <w:sz w:val="24"/>
-      <w:szCs w:val="20"/>
-    </w:rPr>
-  </w:style>
-  <w:style w:type="paragraph" w:customStyle="1" w:styleId="27DB7009EF744E1A9AEB227E77E6FDEF11">
-    <w:name w:val="27DB7009EF744E1A9AEB227E77E6FDEF11"/>
-    <w:rsid w:val="00100F04"/>
-    <w:pPr>
-      <w:spacing w:before="40" w:after="40" w:line="240" w:lineRule="auto"/>
-    </w:pPr>
-    <w:rPr>
-      <w:rFonts w:ascii="Times New Roman" w:eastAsia="Times New Roman" w:hAnsi="Times New Roman" w:cs="Times New Roman"/>
-      <w:sz w:val="24"/>
-      <w:szCs w:val="20"/>
-    </w:rPr>
-  </w:style>
-  <w:style w:type="paragraph" w:customStyle="1" w:styleId="FCB8CF91EE344237B868217E9125777911">
-    <w:name w:val="FCB8CF91EE344237B868217E9125777911"/>
-    <w:rsid w:val="00100F04"/>
-    <w:pPr>
-      <w:spacing w:before="40" w:after="40" w:line="240" w:lineRule="auto"/>
-    </w:pPr>
-    <w:rPr>
-      <w:rFonts w:ascii="Times New Roman" w:eastAsia="Times New Roman" w:hAnsi="Times New Roman" w:cs="Times New Roman"/>
-      <w:sz w:val="24"/>
-      <w:szCs w:val="20"/>
-    </w:rPr>
-  </w:style>
-  <w:style w:type="paragraph" w:customStyle="1" w:styleId="90C438FFB4F54C97BD2329EF84FB3D2A17">
-    <w:name w:val="90C438FFB4F54C97BD2329EF84FB3D2A17"/>
-    <w:rsid w:val="00100F04"/>
-    <w:pPr>
-      <w:spacing w:before="40" w:after="40" w:line="240" w:lineRule="auto"/>
-    </w:pPr>
-    <w:rPr>
-      <w:rFonts w:ascii="Times New Roman" w:eastAsia="Times New Roman" w:hAnsi="Times New Roman" w:cs="Times New Roman"/>
-      <w:sz w:val="24"/>
-      <w:szCs w:val="20"/>
-    </w:rPr>
-  </w:style>
-  <w:style w:type="paragraph" w:customStyle="1" w:styleId="8BBCDE6CCA374F74827854B8B72718EA">
-    <w:name w:val="8BBCDE6CCA374F74827854B8B72718EA"/>
-    <w:rsid w:val="00100F04"/>
-    <w:pPr>
-      <w:spacing w:before="40" w:after="40" w:line="240" w:lineRule="auto"/>
-    </w:pPr>
-    <w:rPr>
-      <w:rFonts w:ascii="Times New Roman" w:eastAsia="Times New Roman" w:hAnsi="Times New Roman" w:cs="Times New Roman"/>
-      <w:sz w:val="24"/>
-      <w:szCs w:val="20"/>
-    </w:rPr>
-  </w:style>
-  <w:style w:type="paragraph" w:customStyle="1" w:styleId="2CAF8B661A444881A001971C462CC34322">
-    <w:name w:val="2CAF8B661A444881A001971C462CC34322"/>
-    <w:rsid w:val="00DC4D73"/>
-    <w:pPr>
-      <w:spacing w:after="120" w:line="240" w:lineRule="auto"/>
-    </w:pPr>
-    <w:rPr>
-      <w:rFonts w:ascii="Times New Roman" w:eastAsia="Times New Roman" w:hAnsi="Times New Roman" w:cs="Times New Roman"/>
-      <w:sz w:val="24"/>
-      <w:szCs w:val="24"/>
-    </w:rPr>
-  </w:style>
-  <w:style w:type="paragraph" w:customStyle="1" w:styleId="C696749CBD7D432B8F903C047E9641DA11">
-    <w:name w:val="C696749CBD7D432B8F903C047E9641DA11"/>
-    <w:rsid w:val="00DC4D73"/>
-    <w:pPr>
-      <w:spacing w:after="120" w:line="240" w:lineRule="auto"/>
-    </w:pPr>
-    <w:rPr>
-      <w:rFonts w:ascii="Times New Roman" w:eastAsia="Times New Roman" w:hAnsi="Times New Roman" w:cs="Times New Roman"/>
-      <w:sz w:val="24"/>
-      <w:szCs w:val="24"/>
-    </w:rPr>
-  </w:style>
-  <w:style w:type="paragraph" w:customStyle="1" w:styleId="E4BDF4B99CB34CF39D2473999FDED3B412">
-    <w:name w:val="E4BDF4B99CB34CF39D2473999FDED3B412"/>
-    <w:rsid w:val="00DC4D73"/>
-    <w:pPr>
-      <w:spacing w:before="40" w:after="40" w:line="240" w:lineRule="auto"/>
-    </w:pPr>
-    <w:rPr>
-      <w:rFonts w:ascii="Times New Roman" w:eastAsia="Times New Roman" w:hAnsi="Times New Roman" w:cs="Times New Roman"/>
-      <w:sz w:val="24"/>
-      <w:szCs w:val="20"/>
-    </w:rPr>
-  </w:style>
-  <w:style w:type="paragraph" w:customStyle="1" w:styleId="27DB7009EF744E1A9AEB227E77E6FDEF12">
-    <w:name w:val="27DB7009EF744E1A9AEB227E77E6FDEF12"/>
-    <w:rsid w:val="00DC4D73"/>
-    <w:pPr>
-      <w:spacing w:before="40" w:after="40" w:line="240" w:lineRule="auto"/>
-    </w:pPr>
-    <w:rPr>
-      <w:rFonts w:ascii="Times New Roman" w:eastAsia="Times New Roman" w:hAnsi="Times New Roman" w:cs="Times New Roman"/>
-      <w:sz w:val="24"/>
-      <w:szCs w:val="20"/>
-    </w:rPr>
-  </w:style>
-  <w:style w:type="paragraph" w:customStyle="1" w:styleId="FCB8CF91EE344237B868217E9125777912">
-    <w:name w:val="FCB8CF91EE344237B868217E9125777912"/>
-    <w:rsid w:val="00DC4D73"/>
-    <w:pPr>
-      <w:spacing w:before="40" w:after="40" w:line="240" w:lineRule="auto"/>
-    </w:pPr>
-    <w:rPr>
-      <w:rFonts w:ascii="Times New Roman" w:eastAsia="Times New Roman" w:hAnsi="Times New Roman" w:cs="Times New Roman"/>
-      <w:sz w:val="24"/>
-      <w:szCs w:val="20"/>
-    </w:rPr>
-  </w:style>
-  <w:style w:type="paragraph" w:customStyle="1" w:styleId="90C438FFB4F54C97BD2329EF84FB3D2A18">
-    <w:name w:val="90C438FFB4F54C97BD2329EF84FB3D2A18"/>
-    <w:rsid w:val="00DC4D73"/>
-    <w:pPr>
-      <w:spacing w:before="40" w:after="40" w:line="240" w:lineRule="auto"/>
-    </w:pPr>
-    <w:rPr>
-      <w:rFonts w:ascii="Times New Roman" w:eastAsia="Times New Roman" w:hAnsi="Times New Roman" w:cs="Times New Roman"/>
-      <w:sz w:val="24"/>
-      <w:szCs w:val="20"/>
-    </w:rPr>
-  </w:style>
-  <w:style w:type="paragraph" w:customStyle="1" w:styleId="8BBCDE6CCA374F74827854B8B72718EA1">
-    <w:name w:val="8BBCDE6CCA374F74827854B8B72718EA1"/>
-    <w:rsid w:val="00DC4D73"/>
-    <w:pPr>
-      <w:spacing w:before="40" w:after="40" w:line="240" w:lineRule="auto"/>
-    </w:pPr>
-    <w:rPr>
-      <w:rFonts w:ascii="Times New Roman" w:eastAsia="Times New Roman" w:hAnsi="Times New Roman" w:cs="Times New Roman"/>
-      <w:sz w:val="24"/>
-      <w:szCs w:val="20"/>
-    </w:rPr>
-  </w:style>
-  <w:style w:type="paragraph" w:customStyle="1" w:styleId="94CB07D23F304CA3A28C0B00738EE78A">
-    <w:name w:val="94CB07D23F304CA3A28C0B00738EE78A"/>
-    <w:rsid w:val="00DC4D73"/>
-    <w:pPr>
-      <w:spacing w:before="40" w:after="40" w:line="240" w:lineRule="auto"/>
-    </w:pPr>
-    <w:rPr>
-      <w:rFonts w:ascii="Times New Roman" w:eastAsia="Times New Roman" w:hAnsi="Times New Roman" w:cs="Times New Roman"/>
-      <w:sz w:val="24"/>
-      <w:szCs w:val="20"/>
-    </w:rPr>
-  </w:style>
-  <w:style w:type="paragraph" w:customStyle="1" w:styleId="0D0741B38C4C476890121A6F2901FAA1">
-    <w:name w:val="0D0741B38C4C476890121A6F2901FAA1"/>
-    <w:rsid w:val="00DC4D73"/>
-    <w:pPr>
-      <w:spacing w:before="40" w:after="40" w:line="240" w:lineRule="auto"/>
-    </w:pPr>
-    <w:rPr>
-      <w:rFonts w:ascii="Times New Roman" w:eastAsia="Times New Roman" w:hAnsi="Times New Roman" w:cs="Times New Roman"/>
-      <w:sz w:val="24"/>
-      <w:szCs w:val="20"/>
-    </w:rPr>
-  </w:style>
-  <w:style w:type="paragraph" w:customStyle="1" w:styleId="CBB32F7093A946C39681A39A721EB2DC">
-    <w:name w:val="CBB32F7093A946C39681A39A721EB2DC"/>
-    <w:rsid w:val="00DC4D73"/>
-    <w:pPr>
-      <w:spacing w:before="40" w:after="40" w:line="240" w:lineRule="auto"/>
-    </w:pPr>
-    <w:rPr>
-      <w:rFonts w:ascii="Times New Roman" w:eastAsia="Times New Roman" w:hAnsi="Times New Roman" w:cs="Times New Roman"/>
-      <w:sz w:val="24"/>
-      <w:szCs w:val="20"/>
-    </w:rPr>
-  </w:style>
-  <w:style w:type="paragraph" w:customStyle="1" w:styleId="1F71DE3E31AD4D4DB5356017327714A7">
-    <w:name w:val="1F71DE3E31AD4D4DB5356017327714A7"/>
-    <w:rsid w:val="00DC4D73"/>
-    <w:pPr>
-      <w:spacing w:before="40" w:after="40" w:line="240" w:lineRule="auto"/>
-    </w:pPr>
-    <w:rPr>
-      <w:rFonts w:ascii="Times New Roman" w:eastAsia="Times New Roman" w:hAnsi="Times New Roman" w:cs="Times New Roman"/>
-      <w:sz w:val="24"/>
-      <w:szCs w:val="20"/>
-    </w:rPr>
-  </w:style>
-  <w:style w:type="paragraph" w:customStyle="1" w:styleId="FDE20E34DCB54EF7BC714BF0647803BD1">
-    <w:name w:val="FDE20E34DCB54EF7BC714BF0647803BD1"/>
-    <w:rsid w:val="00DC4D73"/>
-    <w:pPr>
-      <w:spacing w:before="40" w:after="40" w:line="240" w:lineRule="auto"/>
-    </w:pPr>
-    <w:rPr>
-      <w:rFonts w:ascii="Times New Roman" w:eastAsia="Times New Roman" w:hAnsi="Times New Roman" w:cs="Times New Roman"/>
-      <w:sz w:val="24"/>
-      <w:szCs w:val="20"/>
-    </w:rPr>
-  </w:style>
-  <w:style w:type="paragraph" w:customStyle="1" w:styleId="770B919B1B5945799AAEADD1ECDBD6C61">
-    <w:name w:val="770B919B1B5945799AAEADD1ECDBD6C61"/>
-    <w:rsid w:val="00DC4D73"/>
-    <w:pPr>
-      <w:spacing w:before="40" w:after="40" w:line="240" w:lineRule="auto"/>
-    </w:pPr>
-    <w:rPr>
-      <w:rFonts w:ascii="Times New Roman" w:eastAsia="Times New Roman" w:hAnsi="Times New Roman" w:cs="Times New Roman"/>
-      <w:sz w:val="24"/>
-      <w:szCs w:val="20"/>
-    </w:rPr>
-  </w:style>
-  <w:style w:type="paragraph" w:customStyle="1" w:styleId="C95535B5B9AF404383AF0FB92A3ED63F1">
-    <w:name w:val="C95535B5B9AF404383AF0FB92A3ED63F1"/>
-    <w:rsid w:val="00DC4D73"/>
-    <w:pPr>
-      <w:spacing w:before="40" w:after="40" w:line="240" w:lineRule="auto"/>
-    </w:pPr>
-    <w:rPr>
-      <w:rFonts w:ascii="Times New Roman" w:eastAsia="Times New Roman" w:hAnsi="Times New Roman" w:cs="Times New Roman"/>
-      <w:sz w:val="24"/>
-      <w:szCs w:val="20"/>
-    </w:rPr>
-  </w:style>
-  <w:style w:type="paragraph" w:customStyle="1" w:styleId="C1AFDD95814C4D55B3D0B9B3F9816FDB1">
-    <w:name w:val="C1AFDD95814C4D55B3D0B9B3F9816FDB1"/>
-    <w:rsid w:val="00DC4D73"/>
-    <w:pPr>
-      <w:spacing w:before="40" w:after="40" w:line="240" w:lineRule="auto"/>
-    </w:pPr>
-    <w:rPr>
-      <w:rFonts w:ascii="Times New Roman" w:eastAsia="Times New Roman" w:hAnsi="Times New Roman" w:cs="Times New Roman"/>
-      <w:sz w:val="24"/>
-      <w:szCs w:val="20"/>
-    </w:rPr>
-  </w:style>
-  <w:style w:type="paragraph" w:customStyle="1" w:styleId="0659E56E73AA461496D6122DD480F6A94">
-    <w:name w:val="0659E56E73AA461496D6122DD480F6A94"/>
-    <w:rsid w:val="00DC4D73"/>
-    <w:pPr>
-      <w:spacing w:before="40" w:after="40" w:line="240" w:lineRule="auto"/>
-    </w:pPr>
-    <w:rPr>
-      <w:rFonts w:ascii="Times New Roman" w:eastAsia="Times New Roman" w:hAnsi="Times New Roman" w:cs="Times New Roman"/>
-      <w:sz w:val="24"/>
-      <w:szCs w:val="20"/>
-    </w:rPr>
-  </w:style>
-  <w:style w:type="paragraph" w:customStyle="1" w:styleId="F0658C2745424A1B8BE4612BD87143B14">
-    <w:name w:val="F0658C2745424A1B8BE4612BD87143B14"/>
-    <w:rsid w:val="00DC4D73"/>
-    <w:pPr>
-      <w:spacing w:before="40" w:after="40" w:line="240" w:lineRule="auto"/>
-    </w:pPr>
-    <w:rPr>
-      <w:rFonts w:ascii="Times New Roman" w:eastAsia="Times New Roman" w:hAnsi="Times New Roman" w:cs="Times New Roman"/>
-      <w:sz w:val="24"/>
-      <w:szCs w:val="20"/>
-    </w:rPr>
-  </w:style>
-  <w:style w:type="paragraph" w:customStyle="1" w:styleId="BD8D817EEA2348A8B40DAC08E62629B710">
-    <w:name w:val="BD8D817EEA2348A8B40DAC08E62629B710"/>
-    <w:rsid w:val="00DC4D73"/>
-    <w:pPr>
-      <w:spacing w:before="40" w:after="40" w:line="240" w:lineRule="auto"/>
-    </w:pPr>
-    <w:rPr>
-      <w:rFonts w:ascii="Times New Roman" w:eastAsia="Times New Roman" w:hAnsi="Times New Roman" w:cs="Times New Roman"/>
-      <w:sz w:val="24"/>
-      <w:szCs w:val="20"/>
-    </w:rPr>
-  </w:style>
-  <w:style w:type="paragraph" w:customStyle="1" w:styleId="276D18CAAD334447B0BAEFF35B086C6410">
-    <w:name w:val="276D18CAAD334447B0BAEFF35B086C6410"/>
-    <w:rsid w:val="00DC4D73"/>
-    <w:pPr>
-      <w:spacing w:before="40" w:after="40" w:line="240" w:lineRule="auto"/>
-    </w:pPr>
-    <w:rPr>
-      <w:rFonts w:ascii="Times New Roman" w:eastAsia="Times New Roman" w:hAnsi="Times New Roman" w:cs="Times New Roman"/>
-      <w:sz w:val="24"/>
-      <w:szCs w:val="20"/>
-    </w:rPr>
-  </w:style>
-  <w:style w:type="paragraph" w:customStyle="1" w:styleId="EF378C158C644386842577CA818626B010">
-    <w:name w:val="EF378C158C644386842577CA818626B010"/>
-    <w:rsid w:val="00DC4D73"/>
-    <w:pPr>
-      <w:spacing w:before="40" w:after="40" w:line="240" w:lineRule="auto"/>
-    </w:pPr>
-    <w:rPr>
-      <w:rFonts w:ascii="Times New Roman" w:eastAsia="Times New Roman" w:hAnsi="Times New Roman" w:cs="Times New Roman"/>
-      <w:sz w:val="24"/>
-      <w:szCs w:val="20"/>
-    </w:rPr>
-  </w:style>
-  <w:style w:type="paragraph" w:customStyle="1" w:styleId="700CEBAEB99A44A4B1C816229B56C11910">
-    <w:name w:val="700CEBAEB99A44A4B1C816229B56C11910"/>
-    <w:rsid w:val="00DC4D73"/>
-    <w:pPr>
-      <w:spacing w:before="40" w:after="40" w:line="240" w:lineRule="auto"/>
-    </w:pPr>
-    <w:rPr>
-      <w:rFonts w:ascii="Times New Roman" w:eastAsia="Times New Roman" w:hAnsi="Times New Roman" w:cs="Times New Roman"/>
-      <w:sz w:val="24"/>
-      <w:szCs w:val="20"/>
-    </w:rPr>
-  </w:style>
-  <w:style w:type="paragraph" w:customStyle="1" w:styleId="9D7C7ACFA710445494FBFAFEFBE093075">
-    <w:name w:val="9D7C7ACFA710445494FBFAFEFBE093075"/>
-    <w:rsid w:val="00DC4D73"/>
-    <w:pPr>
-      <w:spacing w:after="0" w:line="240" w:lineRule="auto"/>
-    </w:pPr>
-    <w:rPr>
-      <w:rFonts w:ascii="Times New Roman" w:eastAsia="Times New Roman" w:hAnsi="Times New Roman" w:cs="Times New Roman"/>
-      <w:sz w:val="24"/>
-      <w:szCs w:val="24"/>
-    </w:rPr>
-  </w:style>
-  <w:style w:type="paragraph" w:customStyle="1" w:styleId="2CAF8B661A444881A001971C462CC34323">
-    <w:name w:val="2CAF8B661A444881A001971C462CC34323"/>
-    <w:rsid w:val="00FD257E"/>
-    <w:pPr>
-      <w:spacing w:after="120" w:line="240" w:lineRule="auto"/>
-    </w:pPr>
-    <w:rPr>
-      <w:rFonts w:ascii="Times New Roman" w:eastAsia="Times New Roman" w:hAnsi="Times New Roman" w:cs="Times New Roman"/>
-      <w:sz w:val="24"/>
-      <w:szCs w:val="24"/>
-    </w:rPr>
-  </w:style>
-  <w:style w:type="paragraph" w:customStyle="1" w:styleId="C696749CBD7D432B8F903C047E9641DA12">
-    <w:name w:val="C696749CBD7D432B8F903C047E9641DA12"/>
-    <w:rsid w:val="00FD257E"/>
-    <w:pPr>
-      <w:spacing w:after="120" w:line="240" w:lineRule="auto"/>
-    </w:pPr>
-    <w:rPr>
-      <w:rFonts w:ascii="Times New Roman" w:eastAsia="Times New Roman" w:hAnsi="Times New Roman" w:cs="Times New Roman"/>
-      <w:sz w:val="24"/>
-      <w:szCs w:val="24"/>
-    </w:rPr>
-  </w:style>
-  <w:style w:type="paragraph" w:customStyle="1" w:styleId="E4BDF4B99CB34CF39D2473999FDED3B413">
-    <w:name w:val="E4BDF4B99CB34CF39D2473999FDED3B413"/>
-    <w:rsid w:val="00FD257E"/>
-    <w:pPr>
-      <w:spacing w:before="40" w:after="40" w:line="240" w:lineRule="auto"/>
-    </w:pPr>
-    <w:rPr>
-      <w:rFonts w:ascii="Times New Roman" w:eastAsia="Times New Roman" w:hAnsi="Times New Roman" w:cs="Times New Roman"/>
-      <w:sz w:val="24"/>
-      <w:szCs w:val="20"/>
-    </w:rPr>
-  </w:style>
-  <w:style w:type="paragraph" w:customStyle="1" w:styleId="27DB7009EF744E1A9AEB227E77E6FDEF13">
-    <w:name w:val="27DB7009EF744E1A9AEB227E77E6FDEF13"/>
-    <w:rsid w:val="00FD257E"/>
-    <w:pPr>
-      <w:spacing w:before="40" w:after="40" w:line="240" w:lineRule="auto"/>
-    </w:pPr>
-    <w:rPr>
-      <w:rFonts w:ascii="Times New Roman" w:eastAsia="Times New Roman" w:hAnsi="Times New Roman" w:cs="Times New Roman"/>
-      <w:sz w:val="24"/>
-      <w:szCs w:val="20"/>
-    </w:rPr>
-  </w:style>
-  <w:style w:type="paragraph" w:customStyle="1" w:styleId="FCB8CF91EE344237B868217E9125777913">
-    <w:name w:val="FCB8CF91EE344237B868217E9125777913"/>
-    <w:rsid w:val="00FD257E"/>
-    <w:pPr>
-      <w:spacing w:before="40" w:after="40" w:line="240" w:lineRule="auto"/>
-    </w:pPr>
-    <w:rPr>
-      <w:rFonts w:ascii="Times New Roman" w:eastAsia="Times New Roman" w:hAnsi="Times New Roman" w:cs="Times New Roman"/>
-      <w:sz w:val="24"/>
-      <w:szCs w:val="20"/>
-    </w:rPr>
-  </w:style>
-  <w:style w:type="paragraph" w:customStyle="1" w:styleId="90C438FFB4F54C97BD2329EF84FB3D2A19">
-    <w:name w:val="90C438FFB4F54C97BD2329EF84FB3D2A19"/>
-    <w:rsid w:val="00FD257E"/>
-    <w:pPr>
-      <w:spacing w:before="40" w:after="40" w:line="240" w:lineRule="auto"/>
-    </w:pPr>
-    <w:rPr>
-      <w:rFonts w:ascii="Times New Roman" w:eastAsia="Times New Roman" w:hAnsi="Times New Roman" w:cs="Times New Roman"/>
-      <w:sz w:val="24"/>
-      <w:szCs w:val="20"/>
-    </w:rPr>
-  </w:style>
-  <w:style w:type="paragraph" w:customStyle="1" w:styleId="8BBCDE6CCA374F74827854B8B72718EA2">
-    <w:name w:val="8BBCDE6CCA374F74827854B8B72718EA2"/>
-    <w:rsid w:val="00FD257E"/>
-    <w:pPr>
-      <w:spacing w:before="40" w:after="40" w:line="240" w:lineRule="auto"/>
-    </w:pPr>
-    <w:rPr>
-      <w:rFonts w:ascii="Times New Roman" w:eastAsia="Times New Roman" w:hAnsi="Times New Roman" w:cs="Times New Roman"/>
-      <w:sz w:val="24"/>
-      <w:szCs w:val="20"/>
-    </w:rPr>
-  </w:style>
-  <w:style w:type="paragraph" w:customStyle="1" w:styleId="94CB07D23F304CA3A28C0B00738EE78A1">
-    <w:name w:val="94CB07D23F304CA3A28C0B00738EE78A1"/>
-    <w:rsid w:val="00FD257E"/>
-    <w:pPr>
-      <w:spacing w:before="40" w:after="40" w:line="240" w:lineRule="auto"/>
-    </w:pPr>
-    <w:rPr>
-      <w:rFonts w:ascii="Times New Roman" w:eastAsia="Times New Roman" w:hAnsi="Times New Roman" w:cs="Times New Roman"/>
-      <w:sz w:val="24"/>
-      <w:szCs w:val="20"/>
-    </w:rPr>
-  </w:style>
-  <w:style w:type="paragraph" w:customStyle="1" w:styleId="0D0741B38C4C476890121A6F2901FAA11">
-    <w:name w:val="0D0741B38C4C476890121A6F2901FAA11"/>
-    <w:rsid w:val="00FD257E"/>
-    <w:pPr>
-      <w:spacing w:before="40" w:after="40" w:line="240" w:lineRule="auto"/>
-    </w:pPr>
-    <w:rPr>
-      <w:rFonts w:ascii="Times New Roman" w:eastAsia="Times New Roman" w:hAnsi="Times New Roman" w:cs="Times New Roman"/>
-      <w:sz w:val="24"/>
-      <w:szCs w:val="20"/>
-    </w:rPr>
-  </w:style>
-  <w:style w:type="paragraph" w:customStyle="1" w:styleId="CBB32F7093A946C39681A39A721EB2DC1">
-    <w:name w:val="CBB32F7093A946C39681A39A721EB2DC1"/>
-    <w:rsid w:val="00FD257E"/>
-    <w:pPr>
-      <w:spacing w:before="40" w:after="40" w:line="240" w:lineRule="auto"/>
-    </w:pPr>
-    <w:rPr>
-      <w:rFonts w:ascii="Times New Roman" w:eastAsia="Times New Roman" w:hAnsi="Times New Roman" w:cs="Times New Roman"/>
-      <w:sz w:val="24"/>
-      <w:szCs w:val="20"/>
-    </w:rPr>
-  </w:style>
-  <w:style w:type="paragraph" w:customStyle="1" w:styleId="1F71DE3E31AD4D4DB5356017327714A71">
-    <w:name w:val="1F71DE3E31AD4D4DB5356017327714A71"/>
-    <w:rsid w:val="00FD257E"/>
-    <w:pPr>
-      <w:spacing w:before="40" w:after="40" w:line="240" w:lineRule="auto"/>
-    </w:pPr>
-    <w:rPr>
-      <w:rFonts w:ascii="Times New Roman" w:eastAsia="Times New Roman" w:hAnsi="Times New Roman" w:cs="Times New Roman"/>
-      <w:sz w:val="24"/>
-      <w:szCs w:val="20"/>
-    </w:rPr>
-  </w:style>
-  <w:style w:type="paragraph" w:customStyle="1" w:styleId="FDE20E34DCB54EF7BC714BF0647803BD2">
-    <w:name w:val="FDE20E34DCB54EF7BC714BF0647803BD2"/>
-    <w:rsid w:val="00FD257E"/>
-    <w:pPr>
-      <w:spacing w:before="40" w:after="40" w:line="240" w:lineRule="auto"/>
-    </w:pPr>
-    <w:rPr>
-      <w:rFonts w:ascii="Times New Roman" w:eastAsia="Times New Roman" w:hAnsi="Times New Roman" w:cs="Times New Roman"/>
-      <w:sz w:val="24"/>
-      <w:szCs w:val="20"/>
-    </w:rPr>
-  </w:style>
-  <w:style w:type="paragraph" w:customStyle="1" w:styleId="770B919B1B5945799AAEADD1ECDBD6C62">
-    <w:name w:val="770B919B1B5945799AAEADD1ECDBD6C62"/>
-    <w:rsid w:val="00FD257E"/>
-    <w:pPr>
-      <w:spacing w:before="40" w:after="40" w:line="240" w:lineRule="auto"/>
-    </w:pPr>
-    <w:rPr>
-      <w:rFonts w:ascii="Times New Roman" w:eastAsia="Times New Roman" w:hAnsi="Times New Roman" w:cs="Times New Roman"/>
-      <w:sz w:val="24"/>
-      <w:szCs w:val="20"/>
-    </w:rPr>
-  </w:style>
-  <w:style w:type="paragraph" w:customStyle="1" w:styleId="C95535B5B9AF404383AF0FB92A3ED63F2">
-    <w:name w:val="C95535B5B9AF404383AF0FB92A3ED63F2"/>
-    <w:rsid w:val="00FD257E"/>
-    <w:pPr>
-      <w:spacing w:before="40" w:after="40" w:line="240" w:lineRule="auto"/>
-    </w:pPr>
-    <w:rPr>
-      <w:rFonts w:ascii="Times New Roman" w:eastAsia="Times New Roman" w:hAnsi="Times New Roman" w:cs="Times New Roman"/>
-      <w:sz w:val="24"/>
-      <w:szCs w:val="20"/>
-    </w:rPr>
-  </w:style>
-  <w:style w:type="paragraph" w:customStyle="1" w:styleId="C1AFDD95814C4D55B3D0B9B3F9816FDB2">
-    <w:name w:val="C1AFDD95814C4D55B3D0B9B3F9816FDB2"/>
-    <w:rsid w:val="00FD257E"/>
-    <w:pPr>
-      <w:spacing w:before="40" w:after="40" w:line="240" w:lineRule="auto"/>
-    </w:pPr>
-    <w:rPr>
-      <w:rFonts w:ascii="Times New Roman" w:eastAsia="Times New Roman" w:hAnsi="Times New Roman" w:cs="Times New Roman"/>
-      <w:sz w:val="24"/>
-      <w:szCs w:val="20"/>
-    </w:rPr>
-  </w:style>
-  <w:style w:type="paragraph" w:customStyle="1" w:styleId="0659E56E73AA461496D6122DD480F6A95">
-    <w:name w:val="0659E56E73AA461496D6122DD480F6A95"/>
-    <w:rsid w:val="00FD257E"/>
-    <w:pPr>
-      <w:spacing w:before="40" w:after="40" w:line="240" w:lineRule="auto"/>
-    </w:pPr>
-    <w:rPr>
-      <w:rFonts w:ascii="Times New Roman" w:eastAsia="Times New Roman" w:hAnsi="Times New Roman" w:cs="Times New Roman"/>
-      <w:sz w:val="24"/>
-      <w:szCs w:val="20"/>
-    </w:rPr>
-  </w:style>
-  <w:style w:type="paragraph" w:customStyle="1" w:styleId="F0658C2745424A1B8BE4612BD87143B15">
-    <w:name w:val="F0658C2745424A1B8BE4612BD87143B15"/>
-    <w:rsid w:val="00FD257E"/>
-    <w:pPr>
-      <w:spacing w:before="40" w:after="40" w:line="240" w:lineRule="auto"/>
-    </w:pPr>
-    <w:rPr>
-      <w:rFonts w:ascii="Times New Roman" w:eastAsia="Times New Roman" w:hAnsi="Times New Roman" w:cs="Times New Roman"/>
-      <w:sz w:val="24"/>
-      <w:szCs w:val="20"/>
-    </w:rPr>
-  </w:style>
-  <w:style w:type="paragraph" w:customStyle="1" w:styleId="BD8D817EEA2348A8B40DAC08E62629B711">
-    <w:name w:val="BD8D817EEA2348A8B40DAC08E62629B711"/>
-    <w:rsid w:val="00FD257E"/>
-    <w:pPr>
-      <w:spacing w:before="40" w:after="40" w:line="240" w:lineRule="auto"/>
-    </w:pPr>
-    <w:rPr>
-      <w:rFonts w:ascii="Times New Roman" w:eastAsia="Times New Roman" w:hAnsi="Times New Roman" w:cs="Times New Roman"/>
-      <w:sz w:val="24"/>
-      <w:szCs w:val="20"/>
-    </w:rPr>
-  </w:style>
-  <w:style w:type="paragraph" w:customStyle="1" w:styleId="276D18CAAD334447B0BAEFF35B086C6411">
-    <w:name w:val="276D18CAAD334447B0BAEFF35B086C6411"/>
-    <w:rsid w:val="00FD257E"/>
-    <w:pPr>
-      <w:spacing w:before="40" w:after="40" w:line="240" w:lineRule="auto"/>
-    </w:pPr>
-    <w:rPr>
-      <w:rFonts w:ascii="Times New Roman" w:eastAsia="Times New Roman" w:hAnsi="Times New Roman" w:cs="Times New Roman"/>
-      <w:sz w:val="24"/>
-      <w:szCs w:val="20"/>
-    </w:rPr>
-  </w:style>
-  <w:style w:type="paragraph" w:customStyle="1" w:styleId="EF378C158C644386842577CA818626B011">
-    <w:name w:val="EF378C158C644386842577CA818626B011"/>
-    <w:rsid w:val="00FD257E"/>
-    <w:pPr>
-      <w:spacing w:before="40" w:after="40" w:line="240" w:lineRule="auto"/>
-    </w:pPr>
-    <w:rPr>
-      <w:rFonts w:ascii="Times New Roman" w:eastAsia="Times New Roman" w:hAnsi="Times New Roman" w:cs="Times New Roman"/>
-      <w:sz w:val="24"/>
-      <w:szCs w:val="20"/>
-    </w:rPr>
-  </w:style>
-  <w:style w:type="paragraph" w:customStyle="1" w:styleId="700CEBAEB99A44A4B1C816229B56C11911">
-    <w:name w:val="700CEBAEB99A44A4B1C816229B56C11911"/>
-    <w:rsid w:val="00FD257E"/>
-    <w:pPr>
-      <w:spacing w:before="40" w:after="40" w:line="240" w:lineRule="auto"/>
-    </w:pPr>
-    <w:rPr>
-      <w:rFonts w:ascii="Times New Roman" w:eastAsia="Times New Roman" w:hAnsi="Times New Roman" w:cs="Times New Roman"/>
-      <w:sz w:val="24"/>
-      <w:szCs w:val="20"/>
-    </w:rPr>
-  </w:style>
-  <w:style w:type="paragraph" w:customStyle="1" w:styleId="9D7C7ACFA710445494FBFAFEFBE093076">
-    <w:name w:val="9D7C7ACFA710445494FBFAFEFBE093076"/>
-    <w:rsid w:val="00FD257E"/>
-    <w:pPr>
-      <w:spacing w:after="0" w:line="240" w:lineRule="auto"/>
-    </w:pPr>
-    <w:rPr>
-      <w:rFonts w:ascii="Times New Roman" w:eastAsia="Times New Roman" w:hAnsi="Times New Roman" w:cs="Times New Roman"/>
-      <w:sz w:val="24"/>
-      <w:szCs w:val="24"/>
-    </w:rPr>
-  </w:style>
-  <w:style w:type="paragraph" w:customStyle="1" w:styleId="2CAF8B661A444881A001971C462CC34324">
-    <w:name w:val="2CAF8B661A444881A001971C462CC34324"/>
-    <w:rsid w:val="00566F2A"/>
-    <w:pPr>
-      <w:spacing w:after="120" w:line="240" w:lineRule="auto"/>
-    </w:pPr>
-    <w:rPr>
-      <w:rFonts w:ascii="Times New Roman" w:eastAsia="Times New Roman" w:hAnsi="Times New Roman" w:cs="Times New Roman"/>
-      <w:sz w:val="24"/>
-      <w:szCs w:val="24"/>
-    </w:rPr>
-  </w:style>
-  <w:style w:type="paragraph" w:customStyle="1" w:styleId="C696749CBD7D432B8F903C047E9641DA13">
-    <w:name w:val="C696749CBD7D432B8F903C047E9641DA13"/>
-    <w:rsid w:val="00566F2A"/>
-    <w:pPr>
-      <w:spacing w:after="120" w:line="240" w:lineRule="auto"/>
-    </w:pPr>
-    <w:rPr>
-      <w:rFonts w:ascii="Times New Roman" w:eastAsia="Times New Roman" w:hAnsi="Times New Roman" w:cs="Times New Roman"/>
-      <w:sz w:val="24"/>
-      <w:szCs w:val="24"/>
-    </w:rPr>
-  </w:style>
-  <w:style w:type="paragraph" w:customStyle="1" w:styleId="E4BDF4B99CB34CF39D2473999FDED3B414">
-    <w:name w:val="E4BDF4B99CB34CF39D2473999FDED3B414"/>
-    <w:rsid w:val="00566F2A"/>
-    <w:pPr>
-      <w:spacing w:before="40" w:after="40" w:line="240" w:lineRule="auto"/>
-    </w:pPr>
-    <w:rPr>
-      <w:rFonts w:ascii="Times New Roman" w:eastAsia="Times New Roman" w:hAnsi="Times New Roman" w:cs="Times New Roman"/>
-      <w:sz w:val="24"/>
-      <w:szCs w:val="20"/>
-    </w:rPr>
-  </w:style>
-  <w:style w:type="paragraph" w:customStyle="1" w:styleId="27DB7009EF744E1A9AEB227E77E6FDEF14">
-    <w:name w:val="27DB7009EF744E1A9AEB227E77E6FDEF14"/>
-    <w:rsid w:val="00566F2A"/>
-    <w:pPr>
-      <w:spacing w:before="40" w:after="40" w:line="240" w:lineRule="auto"/>
-    </w:pPr>
-    <w:rPr>
-      <w:rFonts w:ascii="Times New Roman" w:eastAsia="Times New Roman" w:hAnsi="Times New Roman" w:cs="Times New Roman"/>
-      <w:sz w:val="24"/>
-      <w:szCs w:val="20"/>
-    </w:rPr>
-  </w:style>
-  <w:style w:type="paragraph" w:customStyle="1" w:styleId="FCB8CF91EE344237B868217E9125777914">
-    <w:name w:val="FCB8CF91EE344237B868217E9125777914"/>
-    <w:rsid w:val="00566F2A"/>
-    <w:pPr>
-      <w:spacing w:before="40" w:after="40" w:line="240" w:lineRule="auto"/>
-    </w:pPr>
-    <w:rPr>
-      <w:rFonts w:ascii="Times New Roman" w:eastAsia="Times New Roman" w:hAnsi="Times New Roman" w:cs="Times New Roman"/>
-      <w:sz w:val="24"/>
-      <w:szCs w:val="20"/>
-    </w:rPr>
-  </w:style>
-  <w:style w:type="paragraph" w:customStyle="1" w:styleId="90C438FFB4F54C97BD2329EF84FB3D2A20">
-    <w:name w:val="90C438FFB4F54C97BD2329EF84FB3D2A20"/>
-    <w:rsid w:val="00566F2A"/>
-    <w:pPr>
-      <w:spacing w:before="40" w:after="40" w:line="240" w:lineRule="auto"/>
-    </w:pPr>
-    <w:rPr>
-      <w:rFonts w:ascii="Times New Roman" w:eastAsia="Times New Roman" w:hAnsi="Times New Roman" w:cs="Times New Roman"/>
-      <w:sz w:val="24"/>
-      <w:szCs w:val="20"/>
-    </w:rPr>
-  </w:style>
-  <w:style w:type="paragraph" w:customStyle="1" w:styleId="8BBCDE6CCA374F74827854B8B72718EA3">
-    <w:name w:val="8BBCDE6CCA374F74827854B8B72718EA3"/>
-    <w:rsid w:val="00566F2A"/>
-    <w:pPr>
-      <w:spacing w:before="40" w:after="40" w:line="240" w:lineRule="auto"/>
-    </w:pPr>
-    <w:rPr>
-      <w:rFonts w:ascii="Times New Roman" w:eastAsia="Times New Roman" w:hAnsi="Times New Roman" w:cs="Times New Roman"/>
-      <w:sz w:val="24"/>
-      <w:szCs w:val="20"/>
-    </w:rPr>
-  </w:style>
-  <w:style w:type="paragraph" w:customStyle="1" w:styleId="BA3620BA6A094A79BEE5D7A49F96F448">
-    <w:name w:val="BA3620BA6A094A79BEE5D7A49F96F448"/>
-    <w:rsid w:val="00566F2A"/>
-  </w:style>
-  <w:style w:type="paragraph" w:customStyle="1" w:styleId="2CAF8B661A444881A001971C462CC34325">
-    <w:name w:val="2CAF8B661A444881A001971C462CC34325"/>
-    <w:rsid w:val="00697F72"/>
-    <w:pPr>
-      <w:spacing w:after="120" w:line="240" w:lineRule="auto"/>
-    </w:pPr>
-    <w:rPr>
-      <w:rFonts w:ascii="Times New Roman" w:eastAsia="Times New Roman" w:hAnsi="Times New Roman" w:cs="Times New Roman"/>
-      <w:sz w:val="24"/>
-      <w:szCs w:val="24"/>
-    </w:rPr>
-  </w:style>
-  <w:style w:type="paragraph" w:customStyle="1" w:styleId="C696749CBD7D432B8F903C047E9641DA14">
-    <w:name w:val="C696749CBD7D432B8F903C047E9641DA14"/>
-    <w:rsid w:val="00697F72"/>
-    <w:pPr>
-      <w:spacing w:after="120" w:line="240" w:lineRule="auto"/>
-    </w:pPr>
-    <w:rPr>
-      <w:rFonts w:ascii="Times New Roman" w:eastAsia="Times New Roman" w:hAnsi="Times New Roman" w:cs="Times New Roman"/>
-      <w:sz w:val="24"/>
-      <w:szCs w:val="24"/>
-    </w:rPr>
-  </w:style>
-  <w:style w:type="paragraph" w:customStyle="1" w:styleId="E4BDF4B99CB34CF39D2473999FDED3B415">
-    <w:name w:val="E4BDF4B99CB34CF39D2473999FDED3B415"/>
-    <w:rsid w:val="00697F72"/>
-    <w:pPr>
-      <w:spacing w:before="40" w:after="40" w:line="240" w:lineRule="auto"/>
-    </w:pPr>
-    <w:rPr>
-      <w:rFonts w:ascii="Times New Roman" w:eastAsia="Times New Roman" w:hAnsi="Times New Roman" w:cs="Times New Roman"/>
-      <w:sz w:val="24"/>
-      <w:szCs w:val="20"/>
-    </w:rPr>
-  </w:style>
-  <w:style w:type="paragraph" w:customStyle="1" w:styleId="27DB7009EF744E1A9AEB227E77E6FDEF15">
-    <w:name w:val="27DB7009EF744E1A9AEB227E77E6FDEF15"/>
-    <w:rsid w:val="00697F72"/>
-    <w:pPr>
-      <w:spacing w:before="40" w:after="40" w:line="240" w:lineRule="auto"/>
-    </w:pPr>
-    <w:rPr>
-      <w:rFonts w:ascii="Times New Roman" w:eastAsia="Times New Roman" w:hAnsi="Times New Roman" w:cs="Times New Roman"/>
-      <w:sz w:val="24"/>
-      <w:szCs w:val="20"/>
-    </w:rPr>
-  </w:style>
-  <w:style w:type="paragraph" w:customStyle="1" w:styleId="FCB8CF91EE344237B868217E9125777915">
-    <w:name w:val="FCB8CF91EE344237B868217E9125777915"/>
-    <w:rsid w:val="00697F72"/>
-    <w:pPr>
-      <w:spacing w:before="40" w:after="40" w:line="240" w:lineRule="auto"/>
-    </w:pPr>
-    <w:rPr>
-      <w:rFonts w:ascii="Times New Roman" w:eastAsia="Times New Roman" w:hAnsi="Times New Roman" w:cs="Times New Roman"/>
-      <w:sz w:val="24"/>
-      <w:szCs w:val="20"/>
-    </w:rPr>
-  </w:style>
-  <w:style w:type="paragraph" w:customStyle="1" w:styleId="90C438FFB4F54C97BD2329EF84FB3D2A21">
-    <w:name w:val="90C438FFB4F54C97BD2329EF84FB3D2A21"/>
-    <w:rsid w:val="00697F72"/>
-    <w:pPr>
-      <w:spacing w:before="40" w:after="40" w:line="240" w:lineRule="auto"/>
-    </w:pPr>
-    <w:rPr>
-      <w:rFonts w:ascii="Times New Roman" w:eastAsia="Times New Roman" w:hAnsi="Times New Roman" w:cs="Times New Roman"/>
-      <w:sz w:val="24"/>
-      <w:szCs w:val="20"/>
-    </w:rPr>
-  </w:style>
-  <w:style w:type="paragraph" w:customStyle="1" w:styleId="8BBCDE6CCA374F74827854B8B72718EA4">
-    <w:name w:val="8BBCDE6CCA374F74827854B8B72718EA4"/>
-    <w:rsid w:val="00697F72"/>
-    <w:pPr>
-      <w:spacing w:before="40" w:after="40" w:line="240" w:lineRule="auto"/>
-    </w:pPr>
-    <w:rPr>
-      <w:rFonts w:ascii="Times New Roman" w:eastAsia="Times New Roman" w:hAnsi="Times New Roman" w:cs="Times New Roman"/>
-      <w:sz w:val="24"/>
-      <w:szCs w:val="20"/>
-    </w:rPr>
-  </w:style>
-  <w:style w:type="paragraph" w:customStyle="1" w:styleId="94CB07D23F304CA3A28C0B00738EE78A2">
-    <w:name w:val="94CB07D23F304CA3A28C0B00738EE78A2"/>
-    <w:rsid w:val="00697F72"/>
-    <w:pPr>
-      <w:spacing w:before="40" w:after="40" w:line="240" w:lineRule="auto"/>
-    </w:pPr>
-    <w:rPr>
-      <w:rFonts w:ascii="Times New Roman" w:eastAsia="Times New Roman" w:hAnsi="Times New Roman" w:cs="Times New Roman"/>
-      <w:sz w:val="24"/>
-      <w:szCs w:val="20"/>
-    </w:rPr>
-  </w:style>
-  <w:style w:type="paragraph" w:customStyle="1" w:styleId="0D0741B38C4C476890121A6F2901FAA12">
-    <w:name w:val="0D0741B38C4C476890121A6F2901FAA12"/>
-    <w:rsid w:val="00697F72"/>
-    <w:pPr>
-      <w:spacing w:before="40" w:after="40" w:line="240" w:lineRule="auto"/>
-    </w:pPr>
-    <w:rPr>
-      <w:rFonts w:ascii="Times New Roman" w:eastAsia="Times New Roman" w:hAnsi="Times New Roman" w:cs="Times New Roman"/>
-      <w:sz w:val="24"/>
-      <w:szCs w:val="20"/>
-    </w:rPr>
-  </w:style>
-  <w:style w:type="paragraph" w:customStyle="1" w:styleId="CBB32F7093A946C39681A39A721EB2DC2">
-    <w:name w:val="CBB32F7093A946C39681A39A721EB2DC2"/>
-    <w:rsid w:val="00697F72"/>
-    <w:pPr>
-      <w:spacing w:before="40" w:after="40" w:line="240" w:lineRule="auto"/>
-    </w:pPr>
-    <w:rPr>
-      <w:rFonts w:ascii="Times New Roman" w:eastAsia="Times New Roman" w:hAnsi="Times New Roman" w:cs="Times New Roman"/>
-      <w:sz w:val="24"/>
-      <w:szCs w:val="20"/>
-    </w:rPr>
-  </w:style>
-  <w:style w:type="paragraph" w:customStyle="1" w:styleId="1F71DE3E31AD4D4DB5356017327714A72">
-    <w:name w:val="1F71DE3E31AD4D4DB5356017327714A72"/>
-    <w:rsid w:val="00697F72"/>
-    <w:pPr>
-      <w:spacing w:before="40" w:after="40" w:line="240" w:lineRule="auto"/>
-    </w:pPr>
-    <w:rPr>
-      <w:rFonts w:ascii="Times New Roman" w:eastAsia="Times New Roman" w:hAnsi="Times New Roman" w:cs="Times New Roman"/>
-      <w:sz w:val="24"/>
-      <w:szCs w:val="20"/>
-    </w:rPr>
-  </w:style>
-  <w:style w:type="paragraph" w:customStyle="1" w:styleId="FDE20E34DCB54EF7BC714BF0647803BD3">
-    <w:name w:val="FDE20E34DCB54EF7BC714BF0647803BD3"/>
-    <w:rsid w:val="00697F72"/>
-    <w:pPr>
-      <w:spacing w:before="40" w:after="40" w:line="240" w:lineRule="auto"/>
-    </w:pPr>
-    <w:rPr>
-      <w:rFonts w:ascii="Times New Roman" w:eastAsia="Times New Roman" w:hAnsi="Times New Roman" w:cs="Times New Roman"/>
-      <w:sz w:val="24"/>
-      <w:szCs w:val="20"/>
-    </w:rPr>
-  </w:style>
-  <w:style w:type="paragraph" w:customStyle="1" w:styleId="770B919B1B5945799AAEADD1ECDBD6C63">
-    <w:name w:val="770B919B1B5945799AAEADD1ECDBD6C63"/>
-    <w:rsid w:val="00697F72"/>
-    <w:pPr>
-      <w:spacing w:before="40" w:after="40" w:line="240" w:lineRule="auto"/>
-    </w:pPr>
-    <w:rPr>
-      <w:rFonts w:ascii="Times New Roman" w:eastAsia="Times New Roman" w:hAnsi="Times New Roman" w:cs="Times New Roman"/>
-      <w:sz w:val="24"/>
-      <w:szCs w:val="20"/>
-    </w:rPr>
-  </w:style>
-  <w:style w:type="paragraph" w:customStyle="1" w:styleId="C95535B5B9AF404383AF0FB92A3ED63F3">
-    <w:name w:val="C95535B5B9AF404383AF0FB92A3ED63F3"/>
-    <w:rsid w:val="00697F72"/>
-    <w:pPr>
-      <w:spacing w:before="40" w:after="40" w:line="240" w:lineRule="auto"/>
-    </w:pPr>
-    <w:rPr>
-      <w:rFonts w:ascii="Times New Roman" w:eastAsia="Times New Roman" w:hAnsi="Times New Roman" w:cs="Times New Roman"/>
-      <w:sz w:val="24"/>
-      <w:szCs w:val="20"/>
-    </w:rPr>
-  </w:style>
-  <w:style w:type="paragraph" w:customStyle="1" w:styleId="C1AFDD95814C4D55B3D0B9B3F9816FDB3">
-    <w:name w:val="C1AFDD95814C4D55B3D0B9B3F9816FDB3"/>
-    <w:rsid w:val="00697F72"/>
-    <w:pPr>
-      <w:spacing w:before="40" w:after="40" w:line="240" w:lineRule="auto"/>
-    </w:pPr>
-    <w:rPr>
-      <w:rFonts w:ascii="Times New Roman" w:eastAsia="Times New Roman" w:hAnsi="Times New Roman" w:cs="Times New Roman"/>
-      <w:sz w:val="24"/>
-      <w:szCs w:val="20"/>
-    </w:rPr>
-  </w:style>
-  <w:style w:type="paragraph" w:customStyle="1" w:styleId="0659E56E73AA461496D6122DD480F6A96">
-    <w:name w:val="0659E56E73AA461496D6122DD480F6A96"/>
-    <w:rsid w:val="00697F72"/>
-    <w:pPr>
-      <w:spacing w:before="40" w:after="40" w:line="240" w:lineRule="auto"/>
-    </w:pPr>
-    <w:rPr>
-      <w:rFonts w:ascii="Times New Roman" w:eastAsia="Times New Roman" w:hAnsi="Times New Roman" w:cs="Times New Roman"/>
-      <w:sz w:val="24"/>
-      <w:szCs w:val="20"/>
-    </w:rPr>
-  </w:style>
-  <w:style w:type="paragraph" w:customStyle="1" w:styleId="F0658C2745424A1B8BE4612BD87143B16">
-    <w:name w:val="F0658C2745424A1B8BE4612BD87143B16"/>
-    <w:rsid w:val="00697F72"/>
-    <w:pPr>
-      <w:spacing w:before="40" w:after="40" w:line="240" w:lineRule="auto"/>
-    </w:pPr>
-    <w:rPr>
-      <w:rFonts w:ascii="Times New Roman" w:eastAsia="Times New Roman" w:hAnsi="Times New Roman" w:cs="Times New Roman"/>
-      <w:sz w:val="24"/>
-      <w:szCs w:val="20"/>
-    </w:rPr>
-  </w:style>
-  <w:style w:type="paragraph" w:customStyle="1" w:styleId="BD8D817EEA2348A8B40DAC08E62629B712">
-    <w:name w:val="BD8D817EEA2348A8B40DAC08E62629B712"/>
-    <w:rsid w:val="00697F72"/>
-    <w:pPr>
-      <w:spacing w:before="40" w:after="40" w:line="240" w:lineRule="auto"/>
-    </w:pPr>
-    <w:rPr>
-      <w:rFonts w:ascii="Times New Roman" w:eastAsia="Times New Roman" w:hAnsi="Times New Roman" w:cs="Times New Roman"/>
-      <w:sz w:val="24"/>
-      <w:szCs w:val="20"/>
-    </w:rPr>
-  </w:style>
-  <w:style w:type="paragraph" w:customStyle="1" w:styleId="276D18CAAD334447B0BAEFF35B086C6412">
-    <w:name w:val="276D18CAAD334447B0BAEFF35B086C6412"/>
-    <w:rsid w:val="00697F72"/>
-    <w:pPr>
-      <w:spacing w:before="40" w:after="40" w:line="240" w:lineRule="auto"/>
-    </w:pPr>
-    <w:rPr>
-      <w:rFonts w:ascii="Times New Roman" w:eastAsia="Times New Roman" w:hAnsi="Times New Roman" w:cs="Times New Roman"/>
-      <w:sz w:val="24"/>
-      <w:szCs w:val="20"/>
-    </w:rPr>
-  </w:style>
-  <w:style w:type="paragraph" w:customStyle="1" w:styleId="EF378C158C644386842577CA818626B012">
-    <w:name w:val="EF378C158C644386842577CA818626B012"/>
-    <w:rsid w:val="00697F72"/>
-    <w:pPr>
-      <w:spacing w:before="40" w:after="40" w:line="240" w:lineRule="auto"/>
-    </w:pPr>
-    <w:rPr>
-      <w:rFonts w:ascii="Times New Roman" w:eastAsia="Times New Roman" w:hAnsi="Times New Roman" w:cs="Times New Roman"/>
-      <w:sz w:val="24"/>
-      <w:szCs w:val="20"/>
-    </w:rPr>
-  </w:style>
-  <w:style w:type="paragraph" w:customStyle="1" w:styleId="700CEBAEB99A44A4B1C816229B56C11912">
-    <w:name w:val="700CEBAEB99A44A4B1C816229B56C11912"/>
-    <w:rsid w:val="00697F72"/>
-    <w:pPr>
-      <w:spacing w:before="40" w:after="40" w:line="240" w:lineRule="auto"/>
-    </w:pPr>
-    <w:rPr>
-      <w:rFonts w:ascii="Times New Roman" w:eastAsia="Times New Roman" w:hAnsi="Times New Roman" w:cs="Times New Roman"/>
-      <w:sz w:val="24"/>
-      <w:szCs w:val="20"/>
-    </w:rPr>
-  </w:style>
-  <w:style w:type="paragraph" w:customStyle="1" w:styleId="9D7C7ACFA710445494FBFAFEFBE093077">
-    <w:name w:val="9D7C7ACFA710445494FBFAFEFBE093077"/>
-    <w:rsid w:val="00697F72"/>
-    <w:pPr>
-      <w:spacing w:after="0" w:line="240" w:lineRule="auto"/>
-    </w:pPr>
-    <w:rPr>
-      <w:rFonts w:ascii="Times New Roman" w:eastAsia="Times New Roman" w:hAnsi="Times New Roman" w:cs="Times New Roman"/>
-      <w:sz w:val="24"/>
-      <w:szCs w:val="24"/>
-    </w:rPr>
-  </w:style>
-  <w:style w:type="paragraph" w:customStyle="1" w:styleId="2CAF8B661A444881A001971C462CC34326">
-    <w:name w:val="2CAF8B661A444881A001971C462CC34326"/>
-    <w:rsid w:val="00F06187"/>
-    <w:pPr>
-      <w:spacing w:after="120" w:line="240" w:lineRule="auto"/>
-    </w:pPr>
-    <w:rPr>
-      <w:rFonts w:ascii="Times New Roman" w:eastAsia="Times New Roman" w:hAnsi="Times New Roman" w:cs="Times New Roman"/>
-      <w:sz w:val="24"/>
-      <w:szCs w:val="24"/>
-    </w:rPr>
-  </w:style>
-  <w:style w:type="paragraph" w:customStyle="1" w:styleId="C696749CBD7D432B8F903C047E9641DA15">
-    <w:name w:val="C696749CBD7D432B8F903C047E9641DA15"/>
-    <w:rsid w:val="00F06187"/>
-    <w:pPr>
-      <w:spacing w:after="120" w:line="240" w:lineRule="auto"/>
-    </w:pPr>
-    <w:rPr>
-      <w:rFonts w:ascii="Times New Roman" w:eastAsia="Times New Roman" w:hAnsi="Times New Roman" w:cs="Times New Roman"/>
-      <w:sz w:val="24"/>
-      <w:szCs w:val="24"/>
-    </w:rPr>
-  </w:style>
-  <w:style w:type="paragraph" w:customStyle="1" w:styleId="E4BDF4B99CB34CF39D2473999FDED3B416">
-    <w:name w:val="E4BDF4B99CB34CF39D2473999FDED3B416"/>
-    <w:rsid w:val="00F06187"/>
-    <w:pPr>
-      <w:spacing w:before="40" w:after="40" w:line="240" w:lineRule="auto"/>
-    </w:pPr>
-    <w:rPr>
-      <w:rFonts w:ascii="Times New Roman" w:eastAsia="Times New Roman" w:hAnsi="Times New Roman" w:cs="Times New Roman"/>
-      <w:sz w:val="24"/>
-      <w:szCs w:val="20"/>
-    </w:rPr>
-  </w:style>
-  <w:style w:type="paragraph" w:customStyle="1" w:styleId="27DB7009EF744E1A9AEB227E77E6FDEF16">
-    <w:name w:val="27DB7009EF744E1A9AEB227E77E6FDEF16"/>
-    <w:rsid w:val="00F06187"/>
-    <w:pPr>
-      <w:spacing w:before="40" w:after="40" w:line="240" w:lineRule="auto"/>
-    </w:pPr>
-    <w:rPr>
-      <w:rFonts w:ascii="Times New Roman" w:eastAsia="Times New Roman" w:hAnsi="Times New Roman" w:cs="Times New Roman"/>
-      <w:sz w:val="24"/>
-      <w:szCs w:val="20"/>
-    </w:rPr>
-  </w:style>
-  <w:style w:type="paragraph" w:customStyle="1" w:styleId="FCB8CF91EE344237B868217E9125777916">
-    <w:name w:val="FCB8CF91EE344237B868217E9125777916"/>
-    <w:rsid w:val="00F06187"/>
-    <w:pPr>
-      <w:spacing w:before="40" w:after="40" w:line="240" w:lineRule="auto"/>
-    </w:pPr>
-    <w:rPr>
-      <w:rFonts w:ascii="Times New Roman" w:eastAsia="Times New Roman" w:hAnsi="Times New Roman" w:cs="Times New Roman"/>
-      <w:sz w:val="24"/>
-      <w:szCs w:val="20"/>
-    </w:rPr>
-  </w:style>
-  <w:style w:type="paragraph" w:customStyle="1" w:styleId="90C438FFB4F54C97BD2329EF84FB3D2A22">
-    <w:name w:val="90C438FFB4F54C97BD2329EF84FB3D2A22"/>
-    <w:rsid w:val="00F06187"/>
-    <w:pPr>
-      <w:spacing w:before="40" w:after="40" w:line="240" w:lineRule="auto"/>
-    </w:pPr>
-    <w:rPr>
-      <w:rFonts w:ascii="Times New Roman" w:eastAsia="Times New Roman" w:hAnsi="Times New Roman" w:cs="Times New Roman"/>
-      <w:sz w:val="24"/>
-      <w:szCs w:val="20"/>
-    </w:rPr>
-  </w:style>
-  <w:style w:type="paragraph" w:customStyle="1" w:styleId="8BBCDE6CCA374F74827854B8B72718EA5">
-    <w:name w:val="8BBCDE6CCA374F74827854B8B72718EA5"/>
-    <w:rsid w:val="00F06187"/>
-    <w:pPr>
-      <w:spacing w:before="40" w:after="40" w:line="240" w:lineRule="auto"/>
-    </w:pPr>
-    <w:rPr>
-      <w:rFonts w:ascii="Times New Roman" w:eastAsia="Times New Roman" w:hAnsi="Times New Roman" w:cs="Times New Roman"/>
-      <w:sz w:val="24"/>
-      <w:szCs w:val="20"/>
-    </w:rPr>
-  </w:style>
-  <w:style w:type="paragraph" w:customStyle="1" w:styleId="94CB07D23F304CA3A28C0B00738EE78A3">
-    <w:name w:val="94CB07D23F304CA3A28C0B00738EE78A3"/>
-    <w:rsid w:val="00F06187"/>
-    <w:pPr>
-      <w:spacing w:before="40" w:after="40" w:line="240" w:lineRule="auto"/>
-    </w:pPr>
-    <w:rPr>
-      <w:rFonts w:ascii="Times New Roman" w:eastAsia="Times New Roman" w:hAnsi="Times New Roman" w:cs="Times New Roman"/>
-      <w:sz w:val="24"/>
-      <w:szCs w:val="20"/>
-    </w:rPr>
-  </w:style>
-  <w:style w:type="paragraph" w:customStyle="1" w:styleId="0D0741B38C4C476890121A6F2901FAA13">
-    <w:name w:val="0D0741B38C4C476890121A6F2901FAA13"/>
-    <w:rsid w:val="00F06187"/>
-    <w:pPr>
-      <w:spacing w:before="40" w:after="40" w:line="240" w:lineRule="auto"/>
-    </w:pPr>
-    <w:rPr>
-      <w:rFonts w:ascii="Times New Roman" w:eastAsia="Times New Roman" w:hAnsi="Times New Roman" w:cs="Times New Roman"/>
-      <w:sz w:val="24"/>
-      <w:szCs w:val="20"/>
-    </w:rPr>
-  </w:style>
-  <w:style w:type="paragraph" w:customStyle="1" w:styleId="CBB32F7093A946C39681A39A721EB2DC3">
-    <w:name w:val="CBB32F7093A946C39681A39A721EB2DC3"/>
-    <w:rsid w:val="00F06187"/>
-    <w:pPr>
-      <w:spacing w:before="40" w:after="40" w:line="240" w:lineRule="auto"/>
-    </w:pPr>
-    <w:rPr>
-      <w:rFonts w:ascii="Times New Roman" w:eastAsia="Times New Roman" w:hAnsi="Times New Roman" w:cs="Times New Roman"/>
-      <w:sz w:val="24"/>
-      <w:szCs w:val="20"/>
-    </w:rPr>
-  </w:style>
-  <w:style w:type="paragraph" w:customStyle="1" w:styleId="1F71DE3E31AD4D4DB5356017327714A73">
-    <w:name w:val="1F71DE3E31AD4D4DB5356017327714A73"/>
-    <w:rsid w:val="00F06187"/>
-    <w:pPr>
-      <w:spacing w:before="40" w:after="40" w:line="240" w:lineRule="auto"/>
-    </w:pPr>
-    <w:rPr>
-      <w:rFonts w:ascii="Times New Roman" w:eastAsia="Times New Roman" w:hAnsi="Times New Roman" w:cs="Times New Roman"/>
-      <w:sz w:val="24"/>
-      <w:szCs w:val="20"/>
-    </w:rPr>
-  </w:style>
-  <w:style w:type="paragraph" w:customStyle="1" w:styleId="FDE20E34DCB54EF7BC714BF0647803BD4">
-    <w:name w:val="FDE20E34DCB54EF7BC714BF0647803BD4"/>
-    <w:rsid w:val="00F06187"/>
-    <w:pPr>
-      <w:spacing w:before="40" w:after="40" w:line="240" w:lineRule="auto"/>
-    </w:pPr>
-    <w:rPr>
-      <w:rFonts w:ascii="Times New Roman" w:eastAsia="Times New Roman" w:hAnsi="Times New Roman" w:cs="Times New Roman"/>
-      <w:sz w:val="24"/>
-      <w:szCs w:val="20"/>
-    </w:rPr>
-  </w:style>
-  <w:style w:type="paragraph" w:customStyle="1" w:styleId="770B919B1B5945799AAEADD1ECDBD6C64">
-    <w:name w:val="770B919B1B5945799AAEADD1ECDBD6C64"/>
-    <w:rsid w:val="00F06187"/>
-    <w:pPr>
-      <w:spacing w:before="40" w:after="40" w:line="240" w:lineRule="auto"/>
-    </w:pPr>
-    <w:rPr>
-      <w:rFonts w:ascii="Times New Roman" w:eastAsia="Times New Roman" w:hAnsi="Times New Roman" w:cs="Times New Roman"/>
-      <w:sz w:val="24"/>
-      <w:szCs w:val="20"/>
-    </w:rPr>
-  </w:style>
-  <w:style w:type="paragraph" w:customStyle="1" w:styleId="C95535B5B9AF404383AF0FB92A3ED63F4">
-    <w:name w:val="C95535B5B9AF404383AF0FB92A3ED63F4"/>
-    <w:rsid w:val="00F06187"/>
-    <w:pPr>
-      <w:spacing w:before="40" w:after="40" w:line="240" w:lineRule="auto"/>
-    </w:pPr>
-    <w:rPr>
-      <w:rFonts w:ascii="Times New Roman" w:eastAsia="Times New Roman" w:hAnsi="Times New Roman" w:cs="Times New Roman"/>
-      <w:sz w:val="24"/>
-      <w:szCs w:val="20"/>
-    </w:rPr>
-  </w:style>
-  <w:style w:type="paragraph" w:customStyle="1" w:styleId="C1AFDD95814C4D55B3D0B9B3F9816FDB4">
-    <w:name w:val="C1AFDD95814C4D55B3D0B9B3F9816FDB4"/>
-    <w:rsid w:val="00F06187"/>
-    <w:pPr>
-      <w:spacing w:before="40" w:after="40" w:line="240" w:lineRule="auto"/>
-    </w:pPr>
-    <w:rPr>
-      <w:rFonts w:ascii="Times New Roman" w:eastAsia="Times New Roman" w:hAnsi="Times New Roman" w:cs="Times New Roman"/>
-      <w:sz w:val="24"/>
-      <w:szCs w:val="20"/>
-    </w:rPr>
-  </w:style>
-  <w:style w:type="paragraph" w:customStyle="1" w:styleId="0659E56E73AA461496D6122DD480F6A97">
-    <w:name w:val="0659E56E73AA461496D6122DD480F6A97"/>
-    <w:rsid w:val="00F06187"/>
-    <w:pPr>
-      <w:spacing w:before="40" w:after="40" w:line="240" w:lineRule="auto"/>
-    </w:pPr>
-    <w:rPr>
-      <w:rFonts w:ascii="Times New Roman" w:eastAsia="Times New Roman" w:hAnsi="Times New Roman" w:cs="Times New Roman"/>
-      <w:sz w:val="24"/>
-      <w:szCs w:val="20"/>
-    </w:rPr>
-  </w:style>
-  <w:style w:type="paragraph" w:customStyle="1" w:styleId="F0658C2745424A1B8BE4612BD87143B17">
-    <w:name w:val="F0658C2745424A1B8BE4612BD87143B17"/>
-    <w:rsid w:val="00F06187"/>
-    <w:pPr>
-      <w:spacing w:before="40" w:after="40" w:line="240" w:lineRule="auto"/>
-    </w:pPr>
-    <w:rPr>
-      <w:rFonts w:ascii="Times New Roman" w:eastAsia="Times New Roman" w:hAnsi="Times New Roman" w:cs="Times New Roman"/>
-      <w:sz w:val="24"/>
-      <w:szCs w:val="20"/>
-    </w:rPr>
-  </w:style>
-  <w:style w:type="paragraph" w:customStyle="1" w:styleId="BD8D817EEA2348A8B40DAC08E62629B713">
-    <w:name w:val="BD8D817EEA2348A8B40DAC08E62629B713"/>
-    <w:rsid w:val="00F06187"/>
-    <w:pPr>
-      <w:spacing w:before="40" w:after="40" w:line="240" w:lineRule="auto"/>
-    </w:pPr>
-    <w:rPr>
-      <w:rFonts w:ascii="Times New Roman" w:eastAsia="Times New Roman" w:hAnsi="Times New Roman" w:cs="Times New Roman"/>
-      <w:sz w:val="24"/>
-      <w:szCs w:val="20"/>
-    </w:rPr>
-  </w:style>
-  <w:style w:type="paragraph" w:customStyle="1" w:styleId="276D18CAAD334447B0BAEFF35B086C6413">
-    <w:name w:val="276D18CAAD334447B0BAEFF35B086C6413"/>
-    <w:rsid w:val="00F06187"/>
-    <w:pPr>
-      <w:spacing w:before="40" w:after="40" w:line="240" w:lineRule="auto"/>
-    </w:pPr>
-    <w:rPr>
-      <w:rFonts w:ascii="Times New Roman" w:eastAsia="Times New Roman" w:hAnsi="Times New Roman" w:cs="Times New Roman"/>
-      <w:sz w:val="24"/>
-      <w:szCs w:val="20"/>
-    </w:rPr>
-  </w:style>
-  <w:style w:type="paragraph" w:customStyle="1" w:styleId="EF378C158C644386842577CA818626B013">
-    <w:name w:val="EF378C158C644386842577CA818626B013"/>
-    <w:rsid w:val="00F06187"/>
-    <w:pPr>
-      <w:spacing w:before="40" w:after="40" w:line="240" w:lineRule="auto"/>
-    </w:pPr>
-    <w:rPr>
-      <w:rFonts w:ascii="Times New Roman" w:eastAsia="Times New Roman" w:hAnsi="Times New Roman" w:cs="Times New Roman"/>
-      <w:sz w:val="24"/>
-      <w:szCs w:val="20"/>
-    </w:rPr>
-  </w:style>
-  <w:style w:type="paragraph" w:customStyle="1" w:styleId="700CEBAEB99A44A4B1C816229B56C11913">
-    <w:name w:val="700CEBAEB99A44A4B1C816229B56C11913"/>
-    <w:rsid w:val="00F06187"/>
-    <w:pPr>
-      <w:spacing w:before="40" w:after="40" w:line="240" w:lineRule="auto"/>
-    </w:pPr>
-    <w:rPr>
-      <w:rFonts w:ascii="Times New Roman" w:eastAsia="Times New Roman" w:hAnsi="Times New Roman" w:cs="Times New Roman"/>
-      <w:sz w:val="24"/>
-      <w:szCs w:val="20"/>
-    </w:rPr>
-  </w:style>
-  <w:style w:type="paragraph" w:customStyle="1" w:styleId="9D7C7ACFA710445494FBFAFEFBE093078">
-    <w:name w:val="9D7C7ACFA710445494FBFAFEFBE093078"/>
-    <w:rsid w:val="00F06187"/>
-    <w:pPr>
-      <w:spacing w:after="0" w:line="240" w:lineRule="auto"/>
-    </w:pPr>
-    <w:rPr>
-      <w:rFonts w:ascii="Times New Roman" w:eastAsia="Times New Roman" w:hAnsi="Times New Roman" w:cs="Times New Roman"/>
-      <w:sz w:val="24"/>
-      <w:szCs w:val="24"/>
-    </w:rPr>
-  </w:style>
-  <w:style w:type="paragraph" w:customStyle="1" w:styleId="2CAF8B661A444881A001971C462CC34327">
-    <w:name w:val="2CAF8B661A444881A001971C462CC34327"/>
-    <w:rsid w:val="00DF12CC"/>
-    <w:pPr>
-      <w:spacing w:after="120" w:line="240" w:lineRule="auto"/>
-    </w:pPr>
-    <w:rPr>
-      <w:rFonts w:ascii="Times New Roman" w:eastAsia="Times New Roman" w:hAnsi="Times New Roman" w:cs="Times New Roman"/>
-      <w:sz w:val="24"/>
-      <w:szCs w:val="24"/>
-    </w:rPr>
-  </w:style>
-  <w:style w:type="paragraph" w:customStyle="1" w:styleId="C696749CBD7D432B8F903C047E9641DA16">
-    <w:name w:val="C696749CBD7D432B8F903C047E9641DA16"/>
-    <w:rsid w:val="00DF12CC"/>
-    <w:pPr>
-      <w:spacing w:after="120" w:line="240" w:lineRule="auto"/>
-    </w:pPr>
-    <w:rPr>
-      <w:rFonts w:ascii="Times New Roman" w:eastAsia="Times New Roman" w:hAnsi="Times New Roman" w:cs="Times New Roman"/>
-      <w:sz w:val="24"/>
-      <w:szCs w:val="24"/>
-    </w:rPr>
-  </w:style>
-  <w:style w:type="paragraph" w:customStyle="1" w:styleId="E4BDF4B99CB34CF39D2473999FDED3B417">
-    <w:name w:val="E4BDF4B99CB34CF39D2473999FDED3B417"/>
-    <w:rsid w:val="00DF12CC"/>
-    <w:pPr>
-      <w:spacing w:before="40" w:after="40" w:line="240" w:lineRule="auto"/>
-    </w:pPr>
-    <w:rPr>
-      <w:rFonts w:ascii="Times New Roman" w:eastAsia="Times New Roman" w:hAnsi="Times New Roman" w:cs="Times New Roman"/>
-      <w:sz w:val="24"/>
-      <w:szCs w:val="20"/>
-    </w:rPr>
-  </w:style>
-  <w:style w:type="paragraph" w:customStyle="1" w:styleId="27DB7009EF744E1A9AEB227E77E6FDEF17">
-    <w:name w:val="27DB7009EF744E1A9AEB227E77E6FDEF17"/>
-    <w:rsid w:val="00DF12CC"/>
-    <w:pPr>
-      <w:spacing w:before="40" w:after="40" w:line="240" w:lineRule="auto"/>
-    </w:pPr>
-    <w:rPr>
-      <w:rFonts w:ascii="Times New Roman" w:eastAsia="Times New Roman" w:hAnsi="Times New Roman" w:cs="Times New Roman"/>
-      <w:sz w:val="24"/>
-      <w:szCs w:val="20"/>
-    </w:rPr>
-  </w:style>
-  <w:style w:type="paragraph" w:customStyle="1" w:styleId="FCB8CF91EE344237B868217E9125777917">
-    <w:name w:val="FCB8CF91EE344237B868217E9125777917"/>
-    <w:rsid w:val="00DF12CC"/>
-    <w:pPr>
-      <w:spacing w:before="40" w:after="40" w:line="240" w:lineRule="auto"/>
-    </w:pPr>
-    <w:rPr>
-      <w:rFonts w:ascii="Times New Roman" w:eastAsia="Times New Roman" w:hAnsi="Times New Roman" w:cs="Times New Roman"/>
-      <w:sz w:val="24"/>
-      <w:szCs w:val="20"/>
-    </w:rPr>
-  </w:style>
-  <w:style w:type="paragraph" w:customStyle="1" w:styleId="90C438FFB4F54C97BD2329EF84FB3D2A23">
-    <w:name w:val="90C438FFB4F54C97BD2329EF84FB3D2A23"/>
-    <w:rsid w:val="00DF12CC"/>
-    <w:pPr>
-      <w:spacing w:before="40" w:after="40" w:line="240" w:lineRule="auto"/>
-    </w:pPr>
-    <w:rPr>
-      <w:rFonts w:ascii="Times New Roman" w:eastAsia="Times New Roman" w:hAnsi="Times New Roman" w:cs="Times New Roman"/>
-      <w:sz w:val="24"/>
-      <w:szCs w:val="20"/>
-    </w:rPr>
-  </w:style>
-  <w:style w:type="paragraph" w:customStyle="1" w:styleId="8BBCDE6CCA374F74827854B8B72718EA6">
-    <w:name w:val="8BBCDE6CCA374F74827854B8B72718EA6"/>
-    <w:rsid w:val="00DF12CC"/>
-    <w:pPr>
-      <w:spacing w:before="40" w:after="40" w:line="240" w:lineRule="auto"/>
-    </w:pPr>
-    <w:rPr>
-      <w:rFonts w:ascii="Times New Roman" w:eastAsia="Times New Roman" w:hAnsi="Times New Roman" w:cs="Times New Roman"/>
-      <w:sz w:val="24"/>
-      <w:szCs w:val="20"/>
-    </w:rPr>
-  </w:style>
-  <w:style w:type="paragraph" w:customStyle="1" w:styleId="94CB07D23F304CA3A28C0B00738EE78A4">
-    <w:name w:val="94CB07D23F304CA3A28C0B00738EE78A4"/>
-    <w:rsid w:val="00DF12CC"/>
-    <w:pPr>
-      <w:spacing w:before="40" w:after="40" w:line="240" w:lineRule="auto"/>
-    </w:pPr>
-    <w:rPr>
-      <w:rFonts w:ascii="Times New Roman" w:eastAsia="Times New Roman" w:hAnsi="Times New Roman" w:cs="Times New Roman"/>
-      <w:sz w:val="24"/>
-      <w:szCs w:val="20"/>
-    </w:rPr>
-  </w:style>
-  <w:style w:type="paragraph" w:customStyle="1" w:styleId="0D0741B38C4C476890121A6F2901FAA14">
-    <w:name w:val="0D0741B38C4C476890121A6F2901FAA14"/>
-    <w:rsid w:val="00DF12CC"/>
-    <w:pPr>
-      <w:spacing w:before="40" w:after="40" w:line="240" w:lineRule="auto"/>
-    </w:pPr>
-    <w:rPr>
-      <w:rFonts w:ascii="Times New Roman" w:eastAsia="Times New Roman" w:hAnsi="Times New Roman" w:cs="Times New Roman"/>
-      <w:sz w:val="24"/>
-      <w:szCs w:val="20"/>
-    </w:rPr>
-  </w:style>
-  <w:style w:type="paragraph" w:customStyle="1" w:styleId="CBB32F7093A946C39681A39A721EB2DC4">
-    <w:name w:val="CBB32F7093A946C39681A39A721EB2DC4"/>
-    <w:rsid w:val="00DF12CC"/>
-    <w:pPr>
-      <w:spacing w:before="40" w:after="40" w:line="240" w:lineRule="auto"/>
-    </w:pPr>
-    <w:rPr>
-      <w:rFonts w:ascii="Times New Roman" w:eastAsia="Times New Roman" w:hAnsi="Times New Roman" w:cs="Times New Roman"/>
-      <w:sz w:val="24"/>
-      <w:szCs w:val="20"/>
-    </w:rPr>
-  </w:style>
-  <w:style w:type="paragraph" w:customStyle="1" w:styleId="1F71DE3E31AD4D4DB5356017327714A74">
-    <w:name w:val="1F71DE3E31AD4D4DB5356017327714A74"/>
-    <w:rsid w:val="00DF12CC"/>
-    <w:pPr>
-      <w:spacing w:before="40" w:after="40" w:line="240" w:lineRule="auto"/>
-    </w:pPr>
-    <w:rPr>
-      <w:rFonts w:ascii="Times New Roman" w:eastAsia="Times New Roman" w:hAnsi="Times New Roman" w:cs="Times New Roman"/>
-      <w:sz w:val="24"/>
-      <w:szCs w:val="20"/>
-    </w:rPr>
-  </w:style>
-  <w:style w:type="paragraph" w:customStyle="1" w:styleId="FDE20E34DCB54EF7BC714BF0647803BD5">
-    <w:name w:val="FDE20E34DCB54EF7BC714BF0647803BD5"/>
-    <w:rsid w:val="00DF12CC"/>
-    <w:pPr>
-      <w:spacing w:before="40" w:after="40" w:line="240" w:lineRule="auto"/>
-    </w:pPr>
-    <w:rPr>
-      <w:rFonts w:ascii="Times New Roman" w:eastAsia="Times New Roman" w:hAnsi="Times New Roman" w:cs="Times New Roman"/>
-      <w:sz w:val="24"/>
-      <w:szCs w:val="20"/>
-    </w:rPr>
-  </w:style>
-  <w:style w:type="paragraph" w:customStyle="1" w:styleId="770B919B1B5945799AAEADD1ECDBD6C65">
-    <w:name w:val="770B919B1B5945799AAEADD1ECDBD6C65"/>
-    <w:rsid w:val="00DF12CC"/>
-    <w:pPr>
-      <w:spacing w:before="40" w:after="40" w:line="240" w:lineRule="auto"/>
-    </w:pPr>
-    <w:rPr>
-      <w:rFonts w:ascii="Times New Roman" w:eastAsia="Times New Roman" w:hAnsi="Times New Roman" w:cs="Times New Roman"/>
-      <w:sz w:val="24"/>
-      <w:szCs w:val="20"/>
-    </w:rPr>
-  </w:style>
-  <w:style w:type="paragraph" w:customStyle="1" w:styleId="C95535B5B9AF404383AF0FB92A3ED63F5">
-    <w:name w:val="C95535B5B9AF404383AF0FB92A3ED63F5"/>
-    <w:rsid w:val="00DF12CC"/>
-    <w:pPr>
-      <w:spacing w:before="40" w:after="40" w:line="240" w:lineRule="auto"/>
-    </w:pPr>
-    <w:rPr>
-      <w:rFonts w:ascii="Times New Roman" w:eastAsia="Times New Roman" w:hAnsi="Times New Roman" w:cs="Times New Roman"/>
-      <w:sz w:val="24"/>
-      <w:szCs w:val="20"/>
-    </w:rPr>
-  </w:style>
-  <w:style w:type="paragraph" w:customStyle="1" w:styleId="C1AFDD95814C4D55B3D0B9B3F9816FDB5">
-    <w:name w:val="C1AFDD95814C4D55B3D0B9B3F9816FDB5"/>
-    <w:rsid w:val="00DF12CC"/>
-    <w:pPr>
-      <w:spacing w:before="40" w:after="40" w:line="240" w:lineRule="auto"/>
-    </w:pPr>
-    <w:rPr>
-      <w:rFonts w:ascii="Times New Roman" w:eastAsia="Times New Roman" w:hAnsi="Times New Roman" w:cs="Times New Roman"/>
-      <w:sz w:val="24"/>
-      <w:szCs w:val="20"/>
-    </w:rPr>
-  </w:style>
-  <w:style w:type="paragraph" w:customStyle="1" w:styleId="0659E56E73AA461496D6122DD480F6A98">
-    <w:name w:val="0659E56E73AA461496D6122DD480F6A98"/>
-    <w:rsid w:val="00DF12CC"/>
-    <w:pPr>
-      <w:spacing w:before="40" w:after="40" w:line="240" w:lineRule="auto"/>
-    </w:pPr>
-    <w:rPr>
-      <w:rFonts w:ascii="Times New Roman" w:eastAsia="Times New Roman" w:hAnsi="Times New Roman" w:cs="Times New Roman"/>
-      <w:sz w:val="24"/>
-      <w:szCs w:val="20"/>
-    </w:rPr>
-  </w:style>
-  <w:style w:type="paragraph" w:customStyle="1" w:styleId="F0658C2745424A1B8BE4612BD87143B18">
-    <w:name w:val="F0658C2745424A1B8BE4612BD87143B18"/>
-    <w:rsid w:val="00DF12CC"/>
-    <w:pPr>
-      <w:spacing w:before="40" w:after="40" w:line="240" w:lineRule="auto"/>
-    </w:pPr>
-    <w:rPr>
-      <w:rFonts w:ascii="Times New Roman" w:eastAsia="Times New Roman" w:hAnsi="Times New Roman" w:cs="Times New Roman"/>
-      <w:sz w:val="24"/>
-      <w:szCs w:val="20"/>
-    </w:rPr>
-  </w:style>
-  <w:style w:type="paragraph" w:customStyle="1" w:styleId="BD8D817EEA2348A8B40DAC08E62629B714">
-    <w:name w:val="BD8D817EEA2348A8B40DAC08E62629B714"/>
-    <w:rsid w:val="00DF12CC"/>
-    <w:pPr>
-      <w:spacing w:before="40" w:after="40" w:line="240" w:lineRule="auto"/>
-    </w:pPr>
-    <w:rPr>
-      <w:rFonts w:ascii="Times New Roman" w:eastAsia="Times New Roman" w:hAnsi="Times New Roman" w:cs="Times New Roman"/>
-      <w:sz w:val="24"/>
-      <w:szCs w:val="20"/>
-    </w:rPr>
-  </w:style>
-  <w:style w:type="paragraph" w:customStyle="1" w:styleId="276D18CAAD334447B0BAEFF35B086C6414">
-    <w:name w:val="276D18CAAD334447B0BAEFF35B086C6414"/>
-    <w:rsid w:val="00DF12CC"/>
-    <w:pPr>
-      <w:spacing w:before="40" w:after="40" w:line="240" w:lineRule="auto"/>
-    </w:pPr>
-    <w:rPr>
-      <w:rFonts w:ascii="Times New Roman" w:eastAsia="Times New Roman" w:hAnsi="Times New Roman" w:cs="Times New Roman"/>
-      <w:sz w:val="24"/>
-      <w:szCs w:val="20"/>
-    </w:rPr>
-  </w:style>
-  <w:style w:type="paragraph" w:customStyle="1" w:styleId="EF378C158C644386842577CA818626B014">
-    <w:name w:val="EF378C158C644386842577CA818626B014"/>
-    <w:rsid w:val="00DF12CC"/>
-    <w:pPr>
-      <w:spacing w:before="40" w:after="40" w:line="240" w:lineRule="auto"/>
-    </w:pPr>
-    <w:rPr>
-      <w:rFonts w:ascii="Times New Roman" w:eastAsia="Times New Roman" w:hAnsi="Times New Roman" w:cs="Times New Roman"/>
-      <w:sz w:val="24"/>
-      <w:szCs w:val="20"/>
-    </w:rPr>
-  </w:style>
-  <w:style w:type="paragraph" w:customStyle="1" w:styleId="700CEBAEB99A44A4B1C816229B56C11914">
-    <w:name w:val="700CEBAEB99A44A4B1C816229B56C11914"/>
-    <w:rsid w:val="00DF12CC"/>
-    <w:pPr>
-      <w:spacing w:before="40" w:after="40" w:line="240" w:lineRule="auto"/>
-    </w:pPr>
-    <w:rPr>
-      <w:rFonts w:ascii="Times New Roman" w:eastAsia="Times New Roman" w:hAnsi="Times New Roman" w:cs="Times New Roman"/>
-      <w:sz w:val="24"/>
-      <w:szCs w:val="20"/>
-    </w:rPr>
-  </w:style>
-  <w:style w:type="paragraph" w:customStyle="1" w:styleId="9D7C7ACFA710445494FBFAFEFBE093079">
-    <w:name w:val="9D7C7ACFA710445494FBFAFEFBE093079"/>
-    <w:rsid w:val="00DF12CC"/>
-    <w:pPr>
-      <w:spacing w:after="0" w:line="240" w:lineRule="auto"/>
-    </w:pPr>
-    <w:rPr>
-      <w:rFonts w:ascii="Times New Roman" w:eastAsia="Times New Roman" w:hAnsi="Times New Roman" w:cs="Times New Roman"/>
-      <w:sz w:val="24"/>
-      <w:szCs w:val="24"/>
-    </w:rPr>
-  </w:style>
   <w:style w:type="paragraph" w:customStyle="1" w:styleId="2CAF8B661A444881A001971C462CC34328">
     <w:name w:val="2CAF8B661A444881A001971C462CC34328"/>
     <w:rsid w:val="005607A9"/>
@@ -9373,7 +5629,7 @@
 </file>
 
 <file path=word/glossary/webSettings.xml><?xml version="1.0" encoding="utf-8"?>
-<w:webSettings xmlns:mc="http://schemas.openxmlformats.org/markup-compatibility/2006" xmlns:r="http://schemas.openxmlformats.org/officeDocument/2006/relationships" xmlns:w="http://schemas.openxmlformats.org/wordprocessingml/2006/main" xmlns:w14="http://schemas.microsoft.com/office/word/2010/wordml" xmlns:w15="http://schemas.microsoft.com/office/word/2012/wordml" xmlns:w16cid="http://schemas.microsoft.com/office/word/2016/wordml/cid" xmlns:w16se="http://schemas.microsoft.com/office/word/2015/wordml/symex" mc:Ignorable="w14 w15 w16se w16cid">
+<w:webSettings xmlns:mc="http://schemas.openxmlformats.org/markup-compatibility/2006" xmlns:r="http://schemas.openxmlformats.org/officeDocument/2006/relationships" xmlns:w="http://schemas.openxmlformats.org/wordprocessingml/2006/main" xmlns:w14="http://schemas.microsoft.com/office/word/2010/wordml" xmlns:w15="http://schemas.microsoft.com/office/word/2012/wordml" xmlns:w16cex="http://schemas.microsoft.com/office/word/2018/wordml/cex" xmlns:w16cid="http://schemas.microsoft.com/office/word/2016/wordml/cid" xmlns:w16="http://schemas.microsoft.com/office/word/2018/wordml" xmlns:w16sdtdh="http://schemas.microsoft.com/office/word/2020/wordml/sdtdatahash" xmlns:w16se="http://schemas.microsoft.com/office/word/2015/wordml/symex" mc:Ignorable="w14 w15 w16se w16cid w16 w16cex w16sdtdh">
   <w:optimizeForBrowser/>
 </w:webSettings>
 </file>
@@ -9640,18 +5896,22 @@
 </file>
 
 <file path=customXml/item1.xml><?xml version="1.0" encoding="utf-8"?>
-<p:properties xmlns:p="http://schemas.microsoft.com/office/2006/metadata/properties" xmlns:xsi="http://www.w3.org/2001/XMLSchema-instance" xmlns:pc="http://schemas.microsoft.com/office/infopath/2007/PartnerControls">
-  <documentManagement>
-    <TaxKeywordTaxHTField xmlns="016c310d-f661-49a6-97ee-540076082437">
-      <Terms xmlns="http://schemas.microsoft.com/office/infopath/2007/PartnerControls"/>
-    </TaxKeywordTaxHTField>
-    <TaxCatchAll xmlns="016c310d-f661-49a6-97ee-540076082437"/>
-    <SIP_Label_Document xmlns="016c310d-f661-49a6-97ee-540076082437">;#0;#Unrestricted;#True;#00000000-0000-0000-0000-000000000000;#Information that is not sensitive.;#0;#Lockheed Martin Proprietary Information (LMPI);#False;#00000000-0000-0000-0000-000000000000;#Proprietary information owned by Lockheed Martin, such as business, financial or technical information, that requires protection from unauthorized disclosure.  Access is restricted to employees, and authorized individuals who have executed nondisclosure agreements or who are otherwise legally bound by confidentiality obligations to Lockheed Martin.;#0;#Export Controlled Information (ECI);#False;#00000000-0000-0000-0000-000000000000;#Information, such as business, financial or technical information, subject to U.S. or foreign export control laws or regulations.;#0;#Attorney-Client Privileged Information and/or Attorney Work Product;#False;#00000000-0000-0000-0000-000000000000;#Information communicated to or from an attorney, including information communicated to or from anyone working at the direction of any attorney, to obtain or provide legal advice and/or information and materials prepared by or for an attorney, or communications made or materials prepared during, or in anticipation of, litigation. Reminder: These privileges belong to the Corporation and can only be applied or released at the specific direction of LM Legal.;#0;#Protected Information;#False;#00000000-0000-0000-0000-000000000000;#Information in the possession or custody of  Lockheed Martin not addressed or encompassed directly by other categories nevertheless requires or warrants protection from unauthorized or inappropriate disclosure, such as information subject to a protective order or other legal process issued by a court or administrative agency or competent jurisdiction.;#0;#Personal Information;#False;#00000000-0000-0000-0000-000000000000;#Personally Identifiable Information for persons in the U.S. (name plus one other personally identifiable data item such as Social Security Number), and Personal Data for persons in non-U.S. countries (any information relating to an identified data subject). Only includes information collected for conducting official company business. By uploading personal information on Sharepoint you understand and accept that personnel within Lockheed Martin Corporation may be able to view this personal information. See CRX-015 for more information.;#0;#Third Party Proprietary Information;#False;#00000000-0000-0000-0000-000000000000;#Information in which an individual or entity other than  Lockheed Martin has a proprietary right or interest, and that may be subject to restrictions on further disclosure even to other Lockheed Martin employees.;#1;#tbThird Party Proprietary Information;#;#00000000-0000-0000-0000-000000000000;#;#0;#Organizational Conflict of Interest (OCI);#False;#00000000-0000-0000-0000-000000000000;#Contents of this message are subject to contractual organization conflict of interest (OCI) limitations. Access is restricted to authorized employees who have executed non-disclosure agreements. The information is limited for use solely in the performance of the contract on which it was provided or created. If the receiver of this message is not so authorized, contact the sender immediately.;#1;#tbOrganizational Conflict of Interest (OCI);#;#00000000-0000-0000-0000-000000000000;#;#0;#Other SIP Labels;#False;#00000000-0000-0000-0000-000000000000;#Other SIP Label Values;#2;#Other;#;#00000000-0000-0000-0000-000000000000;#</SIP_Label_Document>
-  </documentManagement>
-</p:properties>
+<?mso-contentType ?>
+<FormTemplates xmlns="http://schemas.microsoft.com/sharepoint/v3/contenttype/forms">
+  <Display>DocumentLibraryForm</Display>
+  <Edit>DocumentLibraryForm</Edit>
+  <New>DocumentLibraryForm</New>
+</FormTemplates>
 </file>
 
 <file path=customXml/item2.xml><?xml version="1.0" encoding="utf-8"?>
+<LongProperties xmlns="http://schemas.microsoft.com/office/2006/metadata/longProperties">
+  <LongProp xmlns="" name="SIP_Label_Data"><![CDATA[;#0;#Unrestricted;#True;#00000000-0000-0000-0000-000000000000;#Information that is not sensitive.;#0;#Lockheed Martin Proprietary Information (LMPI);#False;#00000000-0000-0000-0000-000000000000;#Proprietary information owned by Lockheed Martin, such as business, financial or technical information, that requires protection from unauthorized disclosure.  Access is restricted to employees, and authorized individuals who have executed nondisclosure agreements or who are otherwise legally bound by confidentiality obligations to Lockheed Martin.;#0;#Export Controlled Information (ECI);#False;#00000000-0000-0000-0000-000000000000;#Information, such as business, financial or technical information, subject to U.S. or foreign export control laws or regulations.;#0;#Attorney-Client Privileged Information and/or Attorney Work Product;#False;#00000000-0000-0000-0000-000000000000;#Information communicated to or from an attorney, including information communicated to or from anyone working at the direction of any attorney, to obtain or provide legal advice and/or information and materials prepared by or for an attorney, or communications made or materials prepared during, or in anticipation of, litigation. Reminder: These privileges belong to the Corporation and can only be applied or released at the specific direction of LM Legal.;#0;#Protected Information;#False;#00000000-0000-0000-0000-000000000000;#Information in the possession or custody of  Lockheed Martin not addressed or encompassed directly by other categories nevertheless requires or warrants protection from unauthorized or inappropriate disclosure, such as information subject to a protective order or other legal process issued by a court or administrative agency or competent jurisdiction.;#0;#Personal Information;#False;#00000000-0000-0000-0000-000000000000;#Personally Identifiable Information for persons in the U.S. (name plus one other personally identifiable data item such as Social Security Number), and Personal Data for persons in non-U.S. countries (any information relating to an identified data subject). Only includes information collected for conducting official company business. By uploading personal information on Sharepoint you understand and accept that personnel within Lockheed Martin Corporation may be able to view this personal information. See CRX-015 for more information.;#0;#Third Party Proprietary Information;#False;#00000000-0000-0000-0000-000000000000;#Information in which an individual or entity other than  Lockheed Martin has a proprietary right or interest, and that may be subject to restrictions on further disclosure even to other Lockheed Martin employees.;#1;#tbThird Party Proprietary Information;#;#00000000-0000-0000-0000-000000000000;#;#0;#Organizational Conflict of Interest (OCI);#False;#00000000-0000-0000-0000-000000000000;#Contents of this message are subject to contractual organization conflict of interest (OCI) limitations. Access is restricted to authorized employees who have executed non-disclosure agreements. The information is limited for use solely in the performance of the contract on which it was provided or created. If the receiver of this message is not so authorized, contact the sender immediately.;#1;#tbOrganizational Conflict of Interest (OCI);#;#00000000-0000-0000-0000-000000000000;#;#0;#Other SIP Labels;#False;#00000000-0000-0000-0000-000000000000;#Other SIP Label Values;#2;#Other;#;#00000000-0000-0000-0000-000000000000;#]]></LongProp>
+  <LongProp xmlns="" name="Sensitive_x0020_Information_x0020_Protection_x0020__x0028_SIP_x0029__x0020_Label"><![CDATA[;#0;#Unrestricted;#True;#00000000-0000-0000-0000-000000000000;#Information that is not sensitive.;#0;#Lockheed Martin Proprietary Information (LMPI);#False;#00000000-0000-0000-0000-000000000000;#Proprietary information owned by Lockheed Martin, such as business, financial or technical information, that requires protection from unauthorized disclosure.  Access is restricted to employees, and authorized individuals who have executed nondisclosure agreements or who are otherwise legally bound by confidentiality obligations to Lockheed Martin.;#0;#Export Controlled Information (ECI);#False;#00000000-0000-0000-0000-000000000000;#Information, such as business, financial or technical information, subject to U.S. or foreign export control laws or regulations.;#0;#Attorney-Client Privileged Information and/or Attorney Work Product;#False;#00000000-0000-0000-0000-000000000000;#Information communicated to or from an attorney, including information communicated to or from anyone working at the direction of any attorney, to obtain or provide legal advice and/or information and materials prepared by or for an attorney, or communications made or materials prepared during, or in anticipation of, litigation. Reminder: These privileges belong to the Corporation and can only be applied or released at the specific direction of LM Legal.;#0;#Protected Information;#False;#00000000-0000-0000-0000-000000000000;#Information in the possession or custody of  Lockheed Martin not addressed or encompassed directly by other categories nevertheless requires or warrants protection from unauthorized or inappropriate disclosure, such as information subject to a protective order or other legal process issued by a court or administrative agency or competent jurisdiction.;#0;#Personal Information;#False;#00000000-0000-0000-0000-000000000000;#Personally Identifiable Information for persons in the U.S. (name plus one other personally identifiable data item such as Social Security Number), and Personal Data for persons in non-U.S. countries (any information relating to an identified data subject). Only includes information collected for conducting official company business. By uploading personal information on Sharepoint you understand and accept that personnel within Lockheed Martin Corporation may be able to view this personal information. See CRX-015 for more information.;#0;#Third Party Proprietary Information;#False;#00000000-0000-0000-0000-000000000000;#Information in which an individual or entity other than  Lockheed Martin has a proprietary right or interest, and that may be subject to restrictions on further disclosure even to other Lockheed Martin employees.;#1;#tbThird Party Proprietary Information;#;#00000000-0000-0000-0000-000000000000;#;#0;#Organizational Conflict of Interest (OCI);#False;#00000000-0000-0000-0000-000000000000;#Contents of this message are subject to contractual organization conflict of interest (OCI) limitations. Access is restricted to authorized employees who have executed non-disclosure agreements. The information is limited for use solely in the performance of the contract on which it was provided or created. If the receiver of this message is not so authorized, contact the sender immediately.;#1;#tbOrganizational Conflict of Interest (OCI);#;#00000000-0000-0000-0000-000000000000;#;#0;#Other SIP Labels;#False;#00000000-0000-0000-0000-000000000000;#Other SIP Label Values;#2;#Other;#;#00000000-0000-0000-0000-000000000000;#]]></LongProp>
+</LongProperties>
+</file>
+
+<file path=customXml/item3.xml><?xml version="1.0" encoding="utf-8"?>
 <ct:contentTypeSchema xmlns:ct="http://schemas.microsoft.com/office/2006/metadata/contentType" xmlns:ma="http://schemas.microsoft.com/office/2006/metadata/properties/metaAttributes" ct:_="" ma:_="" ma:contentTypeName="Document" ma:contentTypeID="0x010100833E2717D64DEA4FBFABAC416D347394" ma:contentTypeVersion="6" ma:contentTypeDescription="Create a new document." ma:contentTypeScope="" ma:versionID="98a74335b8287497f43df26a30ee6108">
   <xsd:schema xmlns:xsd="http://www.w3.org/2001/XMLSchema" xmlns:xs="http://www.w3.org/2001/XMLSchema" xmlns:p="http://schemas.microsoft.com/office/2006/metadata/properties" xmlns:ns1="http://schemas.microsoft.com/sharepoint/v3" xmlns:ns2="016c310d-f661-49a6-97ee-540076082437" targetNamespace="http://schemas.microsoft.com/office/2006/metadata/properties" ma:root="true" ma:fieldsID="d32ef67c478e261fbf17576a93df92a4" ns1:_="" ns2:_="">
     <xsd:import namespace="http://schemas.microsoft.com/sharepoint/v3"/>
@@ -9814,33 +6074,36 @@
 </ct:contentTypeSchema>
 </file>
 
-<file path=customXml/item3.xml><?xml version="1.0" encoding="utf-8"?>
-<LongProperties xmlns="http://schemas.microsoft.com/office/2006/metadata/longProperties">
-  <LongProp xmlns="" name="SIP_Label_Data"><![CDATA[;#0;#Unrestricted;#True;#00000000-0000-0000-0000-000000000000;#Information that is not sensitive.;#0;#Lockheed Martin Proprietary Information (LMPI);#False;#00000000-0000-0000-0000-000000000000;#Proprietary information owned by Lockheed Martin, such as business, financial or technical information, that requires protection from unauthorized disclosure.  Access is restricted to employees, and authorized individuals who have executed nondisclosure agreements or who are otherwise legally bound by confidentiality obligations to Lockheed Martin.;#0;#Export Controlled Information (ECI);#False;#00000000-0000-0000-0000-000000000000;#Information, such as business, financial or technical information, subject to U.S. or foreign export control laws or regulations.;#0;#Attorney-Client Privileged Information and/or Attorney Work Product;#False;#00000000-0000-0000-0000-000000000000;#Information communicated to or from an attorney, including information communicated to or from anyone working at the direction of any attorney, to obtain or provide legal advice and/or information and materials prepared by or for an attorney, or communications made or materials prepared during, or in anticipation of, litigation. Reminder: These privileges belong to the Corporation and can only be applied or released at the specific direction of LM Legal.;#0;#Protected Information;#False;#00000000-0000-0000-0000-000000000000;#Information in the possession or custody of  Lockheed Martin not addressed or encompassed directly by other categories nevertheless requires or warrants protection from unauthorized or inappropriate disclosure, such as information subject to a protective order or other legal process issued by a court or administrative agency or competent jurisdiction.;#0;#Personal Information;#False;#00000000-0000-0000-0000-000000000000;#Personally Identifiable Information for persons in the U.S. (name plus one other personally identifiable data item such as Social Security Number), and Personal Data for persons in non-U.S. countries (any information relating to an identified data subject). Only includes information collected for conducting official company business. By uploading personal information on Sharepoint you understand and accept that personnel within Lockheed Martin Corporation may be able to view this personal information. See CRX-015 for more information.;#0;#Third Party Proprietary Information;#False;#00000000-0000-0000-0000-000000000000;#Information in which an individual or entity other than  Lockheed Martin has a proprietary right or interest, and that may be subject to restrictions on further disclosure even to other Lockheed Martin employees.;#1;#tbThird Party Proprietary Information;#;#00000000-0000-0000-0000-000000000000;#;#0;#Organizational Conflict of Interest (OCI);#False;#00000000-0000-0000-0000-000000000000;#Contents of this message are subject to contractual organization conflict of interest (OCI) limitations. Access is restricted to authorized employees who have executed non-disclosure agreements. The information is limited for use solely in the performance of the contract on which it was provided or created. If the receiver of this message is not so authorized, contact the sender immediately.;#1;#tbOrganizational Conflict of Interest (OCI);#;#00000000-0000-0000-0000-000000000000;#;#0;#Other SIP Labels;#False;#00000000-0000-0000-0000-000000000000;#Other SIP Label Values;#2;#Other;#;#00000000-0000-0000-0000-000000000000;#]]></LongProp>
-  <LongProp xmlns="" name="Sensitive_x0020_Information_x0020_Protection_x0020__x0028_SIP_x0029__x0020_Label"><![CDATA[;#0;#Unrestricted;#True;#00000000-0000-0000-0000-000000000000;#Information that is not sensitive.;#0;#Lockheed Martin Proprietary Information (LMPI);#False;#00000000-0000-0000-0000-000000000000;#Proprietary information owned by Lockheed Martin, such as business, financial or technical information, that requires protection from unauthorized disclosure.  Access is restricted to employees, and authorized individuals who have executed nondisclosure agreements or who are otherwise legally bound by confidentiality obligations to Lockheed Martin.;#0;#Export Controlled Information (ECI);#False;#00000000-0000-0000-0000-000000000000;#Information, such as business, financial or technical information, subject to U.S. or foreign export control laws or regulations.;#0;#Attorney-Client Privileged Information and/or Attorney Work Product;#False;#00000000-0000-0000-0000-000000000000;#Information communicated to or from an attorney, including information communicated to or from anyone working at the direction of any attorney, to obtain or provide legal advice and/or information and materials prepared by or for an attorney, or communications made or materials prepared during, or in anticipation of, litigation. Reminder: These privileges belong to the Corporation and can only be applied or released at the specific direction of LM Legal.;#0;#Protected Information;#False;#00000000-0000-0000-0000-000000000000;#Information in the possession or custody of  Lockheed Martin not addressed or encompassed directly by other categories nevertheless requires or warrants protection from unauthorized or inappropriate disclosure, such as information subject to a protective order or other legal process issued by a court or administrative agency or competent jurisdiction.;#0;#Personal Information;#False;#00000000-0000-0000-0000-000000000000;#Personally Identifiable Information for persons in the U.S. (name plus one other personally identifiable data item such as Social Security Number), and Personal Data for persons in non-U.S. countries (any information relating to an identified data subject). Only includes information collected for conducting official company business. By uploading personal information on Sharepoint you understand and accept that personnel within Lockheed Martin Corporation may be able to view this personal information. See CRX-015 for more information.;#0;#Third Party Proprietary Information;#False;#00000000-0000-0000-0000-000000000000;#Information in which an individual or entity other than  Lockheed Martin has a proprietary right or interest, and that may be subject to restrictions on further disclosure even to other Lockheed Martin employees.;#1;#tbThird Party Proprietary Information;#;#00000000-0000-0000-0000-000000000000;#;#0;#Organizational Conflict of Interest (OCI);#False;#00000000-0000-0000-0000-000000000000;#Contents of this message are subject to contractual organization conflict of interest (OCI) limitations. Access is restricted to authorized employees who have executed non-disclosure agreements. The information is limited for use solely in the performance of the contract on which it was provided or created. If the receiver of this message is not so authorized, contact the sender immediately.;#1;#tbOrganizational Conflict of Interest (OCI);#;#00000000-0000-0000-0000-000000000000;#;#0;#Other SIP Labels;#False;#00000000-0000-0000-0000-000000000000;#Other SIP Label Values;#2;#Other;#;#00000000-0000-0000-0000-000000000000;#]]></LongProp>
-</LongProperties>
-</file>
-
 <file path=customXml/item4.xml><?xml version="1.0" encoding="utf-8"?>
-<?mso-contentType ?>
-<FormTemplates xmlns="http://schemas.microsoft.com/sharepoint/v3/contenttype/forms">
-  <Display>DocumentLibraryForm</Display>
-  <Edit>DocumentLibraryForm</Edit>
-  <New>DocumentLibraryForm</New>
-</FormTemplates>
+<p:properties xmlns:p="http://schemas.microsoft.com/office/2006/metadata/properties" xmlns:xsi="http://www.w3.org/2001/XMLSchema-instance" xmlns:pc="http://schemas.microsoft.com/office/infopath/2007/PartnerControls">
+  <documentManagement>
+    <TaxKeywordTaxHTField xmlns="016c310d-f661-49a6-97ee-540076082437">
+      <Terms xmlns="http://schemas.microsoft.com/office/infopath/2007/PartnerControls"/>
+    </TaxKeywordTaxHTField>
+    <TaxCatchAll xmlns="016c310d-f661-49a6-97ee-540076082437"/>
+    <SIP_Label_Document xmlns="016c310d-f661-49a6-97ee-540076082437">;#0;#Unrestricted;#True;#00000000-0000-0000-0000-000000000000;#Information that is not sensitive.;#0;#Lockheed Martin Proprietary Information (LMPI);#False;#00000000-0000-0000-0000-000000000000;#Proprietary information owned by Lockheed Martin, such as business, financial or technical information, that requires protection from unauthorized disclosure.  Access is restricted to employees, and authorized individuals who have executed nondisclosure agreements or who are otherwise legally bound by confidentiality obligations to Lockheed Martin.;#0;#Export Controlled Information (ECI);#False;#00000000-0000-0000-0000-000000000000;#Information, such as business, financial or technical information, subject to U.S. or foreign export control laws or regulations.;#0;#Attorney-Client Privileged Information and/or Attorney Work Product;#False;#00000000-0000-0000-0000-000000000000;#Information communicated to or from an attorney, including information communicated to or from anyone working at the direction of any attorney, to obtain or provide legal advice and/or information and materials prepared by or for an attorney, or communications made or materials prepared during, or in anticipation of, litigation. Reminder: These privileges belong to the Corporation and can only be applied or released at the specific direction of LM Legal.;#0;#Protected Information;#False;#00000000-0000-0000-0000-000000000000;#Information in the possession or custody of  Lockheed Martin not addressed or encompassed directly by other categories nevertheless requires or warrants protection from unauthorized or inappropriate disclosure, such as information subject to a protective order or other legal process issued by a court or administrative agency or competent jurisdiction.;#0;#Personal Information;#False;#00000000-0000-0000-0000-000000000000;#Personally Identifiable Information for persons in the U.S. (name plus one other personally identifiable data item such as Social Security Number), and Personal Data for persons in non-U.S. countries (any information relating to an identified data subject). Only includes information collected for conducting official company business. By uploading personal information on Sharepoint you understand and accept that personnel within Lockheed Martin Corporation may be able to view this personal information. See CRX-015 for more information.;#0;#Third Party Proprietary Information;#False;#00000000-0000-0000-0000-000000000000;#Information in which an individual or entity other than  Lockheed Martin has a proprietary right or interest, and that may be subject to restrictions on further disclosure even to other Lockheed Martin employees.;#1;#tbThird Party Proprietary Information;#;#00000000-0000-0000-0000-000000000000;#;#0;#Organizational Conflict of Interest (OCI);#False;#00000000-0000-0000-0000-000000000000;#Contents of this message are subject to contractual organization conflict of interest (OCI) limitations. Access is restricted to authorized employees who have executed non-disclosure agreements. The information is limited for use solely in the performance of the contract on which it was provided or created. If the receiver of this message is not so authorized, contact the sender immediately.;#1;#tbOrganizational Conflict of Interest (OCI);#;#00000000-0000-0000-0000-000000000000;#;#0;#Other SIP Labels;#False;#00000000-0000-0000-0000-000000000000;#Other SIP Label Values;#2;#Other;#;#00000000-0000-0000-0000-000000000000;#</SIP_Label_Document>
+  </documentManagement>
+</p:properties>
 </file>
 
 <file path=customXml/itemProps1.xml><?xml version="1.0" encoding="utf-8"?>
-<ds:datastoreItem xmlns:ds="http://schemas.openxmlformats.org/officeDocument/2006/customXml" ds:itemID="{70CE6EC4-9582-4458-8677-AEA1A5100272}">
+<ds:datastoreItem xmlns:ds="http://schemas.openxmlformats.org/officeDocument/2006/customXml" ds:itemID="{AB5091F3-F498-4BBE-9851-A52A9A0CF6A3}">
   <ds:schemaRefs>
-    <ds:schemaRef ds:uri="http://schemas.microsoft.com/office/2006/metadata/properties"/>
-    <ds:schemaRef ds:uri="http://schemas.microsoft.com/office/infopath/2007/PartnerControls"/>
-    <ds:schemaRef ds:uri="016c310d-f661-49a6-97ee-540076082437"/>
+    <ds:schemaRef ds:uri="http://schemas.microsoft.com/sharepoint/v3/contenttype/forms"/>
   </ds:schemaRefs>
 </ds:datastoreItem>
 </file>
 
 <file path=customXml/itemProps2.xml><?xml version="1.0" encoding="utf-8"?>
+<ds:datastoreItem xmlns:ds="http://schemas.openxmlformats.org/officeDocument/2006/customXml" ds:itemID="{5D1F1D3A-C682-4A2E-8A87-A5E6DA647AA7}">
+  <ds:schemaRefs>
+    <ds:schemaRef ds:uri="http://schemas.microsoft.com/office/2006/metadata/longProperties"/>
+    <ds:schemaRef ds:uri=""/>
+  </ds:schemaRefs>
+</ds:datastoreItem>
+</file>
+
+<file path=customXml/itemProps3.xml><?xml version="1.0" encoding="utf-8"?>
 <ds:datastoreItem xmlns:ds="http://schemas.openxmlformats.org/officeDocument/2006/customXml" ds:itemID="{CBB5900B-9682-4202-8DFC-2C41C6512689}">
   <ds:schemaRefs>
     <ds:schemaRef ds:uri="http://schemas.microsoft.com/office/2006/metadata/contentType"/>
@@ -9859,19 +6122,12 @@
 </ds:datastoreItem>
 </file>
 
-<file path=customXml/itemProps3.xml><?xml version="1.0" encoding="utf-8"?>
-<ds:datastoreItem xmlns:ds="http://schemas.openxmlformats.org/officeDocument/2006/customXml" ds:itemID="{5D1F1D3A-C682-4A2E-8A87-A5E6DA647AA7}">
+<file path=customXml/itemProps4.xml><?xml version="1.0" encoding="utf-8"?>
+<ds:datastoreItem xmlns:ds="http://schemas.openxmlformats.org/officeDocument/2006/customXml" ds:itemID="{70CE6EC4-9582-4458-8677-AEA1A5100272}">
   <ds:schemaRefs>
-    <ds:schemaRef ds:uri="http://schemas.microsoft.com/office/2006/metadata/longProperties"/>
-    <ds:schemaRef ds:uri=""/>
-  </ds:schemaRefs>
-</ds:datastoreItem>
-</file>
-
-<file path=customXml/itemProps4.xml><?xml version="1.0" encoding="utf-8"?>
-<ds:datastoreItem xmlns:ds="http://schemas.openxmlformats.org/officeDocument/2006/customXml" ds:itemID="{AB5091F3-F498-4BBE-9851-A52A9A0CF6A3}">
-  <ds:schemaRefs>
-    <ds:schemaRef ds:uri="http://schemas.microsoft.com/sharepoint/v3/contenttype/forms"/>
+    <ds:schemaRef ds:uri="http://schemas.microsoft.com/office/2006/metadata/properties"/>
+    <ds:schemaRef ds:uri="http://schemas.microsoft.com/office/infopath/2007/PartnerControls"/>
+    <ds:schemaRef ds:uri="016c310d-f661-49a6-97ee-540076082437"/>
   </ds:schemaRefs>
 </ds:datastoreItem>
 </file>
</xml_diff>